<commit_message>
Add course and group footer to site
</commit_message>
<xml_diff>
--- a/Relatorio_MVP_NutriWay.docx
+++ b/Relatorio_MVP_NutriWay.docx
@@ -36,6 +36,7 @@
           <w:rFonts w:ascii="Times New Roman" w:hAnsi="Times New Roman" w:cs="Times New Roman"/>
         </w:rPr>
       </w:pPr>
+      <w:proofErr w:type="spellStart"/>
       <w:r>
         <w:rPr>
           <w:rFonts w:ascii="Times New Roman" w:hAnsi="Times New Roman" w:cs="Times New Roman"/>
@@ -45,6 +46,7 @@
         </w:rPr>
         <w:t>Introdução</w:t>
       </w:r>
+      <w:proofErr w:type="spellEnd"/>
     </w:p>
     <w:p>
       <w:pPr>
@@ -92,7 +94,23 @@
           <w:rFonts w:ascii="Times New Roman" w:hAnsi="Times New Roman" w:cs="Times New Roman"/>
           <w:color w:val="1E1E1E"/>
         </w:rPr>
-        <w:t>Sob a perspectiva de gestão em saúde, o maior gargalo clínico não é a qualidade da prescrição dietética em si, mas sim a Taxa de Adesão do Paciente (Patient Adherence Rate). Estudos de mercado revelam que o fator financeiro é uma das principais barreiras relatadas pelos pacientes para abandonar planejamentos nutricionais.</w:t>
+        <w:t xml:space="preserve">Sob a </w:t>
+      </w:r>
+      <w:proofErr w:type="spellStart"/>
+      <w:r>
+        <w:rPr>
+          <w:rFonts w:ascii="Times New Roman" w:hAnsi="Times New Roman" w:cs="Times New Roman"/>
+          <w:color w:val="1E1E1E"/>
+        </w:rPr>
+        <w:t>perspectiva</w:t>
+      </w:r>
+      <w:proofErr w:type="spellEnd"/>
+      <w:r>
+        <w:rPr>
+          <w:rFonts w:ascii="Times New Roman" w:hAnsi="Times New Roman" w:cs="Times New Roman"/>
+          <w:color w:val="1E1E1E"/>
+        </w:rPr>
+        <w:t xml:space="preserve"> de gestão em saúde, o maior gargalo clínico não é a qualidade da prescrição dietética em si, mas sim a Taxa de Adesão do Paciente (Patient Adherence Rate). Estudos de mercado revelam que o fator financeiro é uma das principais barreiras relatadas pelos pacientes para abandonar planejamentos nutricionais.</w:t>
       </w:r>
     </w:p>
     <w:p>
@@ -200,7 +218,39 @@
           <w:rFonts w:ascii="Times New Roman" w:hAnsi="Times New Roman" w:cs="Times New Roman"/>
           <w:color w:val="1E1E1E"/>
         </w:rPr>
-        <w:t>Para garantir a precisão no desenvolvimento do MVP, a gestão definiu e segmentou o público-alvo em duas vertentes complementares de usuários (B2C e B2B2C):</w:t>
+        <w:t xml:space="preserve">Para </w:t>
+      </w:r>
+      <w:proofErr w:type="spellStart"/>
+      <w:r>
+        <w:rPr>
+          <w:rFonts w:ascii="Times New Roman" w:hAnsi="Times New Roman" w:cs="Times New Roman"/>
+          <w:color w:val="1E1E1E"/>
+        </w:rPr>
+        <w:t>garantir</w:t>
+      </w:r>
+      <w:proofErr w:type="spellEnd"/>
+      <w:r>
+        <w:rPr>
+          <w:rFonts w:ascii="Times New Roman" w:hAnsi="Times New Roman" w:cs="Times New Roman"/>
+          <w:color w:val="1E1E1E"/>
+        </w:rPr>
+        <w:t xml:space="preserve"> a </w:t>
+      </w:r>
+      <w:proofErr w:type="spellStart"/>
+      <w:r>
+        <w:rPr>
+          <w:rFonts w:ascii="Times New Roman" w:hAnsi="Times New Roman" w:cs="Times New Roman"/>
+          <w:color w:val="1E1E1E"/>
+        </w:rPr>
+        <w:t>precisão</w:t>
+      </w:r>
+      <w:proofErr w:type="spellEnd"/>
+      <w:r>
+        <w:rPr>
+          <w:rFonts w:ascii="Times New Roman" w:hAnsi="Times New Roman" w:cs="Times New Roman"/>
+          <w:color w:val="1E1E1E"/>
+        </w:rPr>
+        <w:t xml:space="preserve"> no desenvolvimento do MVP, a gestão definiu e segmentou o público-alvo em duas vertentes complementares de usuários (B2C e B2B2C):</w:t>
       </w:r>
     </w:p>
     <w:p>
@@ -293,7 +343,71 @@
           <w:rFonts w:ascii="Times New Roman" w:hAnsi="Times New Roman" w:cs="Times New Roman"/>
           <w:color w:val="1E1E1E"/>
         </w:rPr>
-        <w:t>A solução consiste em uma ferramenta digital de fácil acesso (Next.js/Tailwind) focada estritamente na resolução do orçamento do usuário. Em vez de exigir o preenchimento de dados complexos, a solução simplifica a jornada com poucas interações de alto impacto:</w:t>
+        <w:t xml:space="preserve">A </w:t>
+      </w:r>
+      <w:proofErr w:type="spellStart"/>
+      <w:r>
+        <w:rPr>
+          <w:rFonts w:ascii="Times New Roman" w:hAnsi="Times New Roman" w:cs="Times New Roman"/>
+          <w:color w:val="1E1E1E"/>
+        </w:rPr>
+        <w:t>solução</w:t>
+      </w:r>
+      <w:proofErr w:type="spellEnd"/>
+      <w:r>
+        <w:rPr>
+          <w:rFonts w:ascii="Times New Roman" w:hAnsi="Times New Roman" w:cs="Times New Roman"/>
+          <w:color w:val="1E1E1E"/>
+        </w:rPr>
+        <w:t xml:space="preserve"> </w:t>
+      </w:r>
+      <w:proofErr w:type="spellStart"/>
+      <w:r>
+        <w:rPr>
+          <w:rFonts w:ascii="Times New Roman" w:hAnsi="Times New Roman" w:cs="Times New Roman"/>
+          <w:color w:val="1E1E1E"/>
+        </w:rPr>
+        <w:t>consiste</w:t>
+      </w:r>
+      <w:proofErr w:type="spellEnd"/>
+      <w:r>
+        <w:rPr>
+          <w:rFonts w:ascii="Times New Roman" w:hAnsi="Times New Roman" w:cs="Times New Roman"/>
+          <w:color w:val="1E1E1E"/>
+        </w:rPr>
+        <w:t xml:space="preserve"> </w:t>
+      </w:r>
+      <w:proofErr w:type="spellStart"/>
+      <w:r>
+        <w:rPr>
+          <w:rFonts w:ascii="Times New Roman" w:hAnsi="Times New Roman" w:cs="Times New Roman"/>
+          <w:color w:val="1E1E1E"/>
+        </w:rPr>
+        <w:t>em</w:t>
+      </w:r>
+      <w:proofErr w:type="spellEnd"/>
+      <w:r>
+        <w:rPr>
+          <w:rFonts w:ascii="Times New Roman" w:hAnsi="Times New Roman" w:cs="Times New Roman"/>
+          <w:color w:val="1E1E1E"/>
+        </w:rPr>
+        <w:t xml:space="preserve"> </w:t>
+      </w:r>
+      <w:proofErr w:type="spellStart"/>
+      <w:r>
+        <w:rPr>
+          <w:rFonts w:ascii="Times New Roman" w:hAnsi="Times New Roman" w:cs="Times New Roman"/>
+          <w:color w:val="1E1E1E"/>
+        </w:rPr>
+        <w:t>uma</w:t>
+      </w:r>
+      <w:proofErr w:type="spellEnd"/>
+      <w:r>
+        <w:rPr>
+          <w:rFonts w:ascii="Times New Roman" w:hAnsi="Times New Roman" w:cs="Times New Roman"/>
+          <w:color w:val="1E1E1E"/>
+        </w:rPr>
+        <w:t xml:space="preserve"> ferramenta digital de fácil acesso (Next.js/Tailwind) focada estritamente na resolução do orçamento do usuário. Em vez de exigir o preenchimento de dados complexos, a solução simplifica a jornada com poucas interações de alto impacto:</w:t>
       </w:r>
     </w:p>
     <w:p>
@@ -403,21 +517,135 @@
           <w:rFonts w:ascii="Times New Roman" w:hAnsi="Times New Roman" w:cs="Times New Roman"/>
           <w:color w:val="1E1E1E"/>
         </w:rPr>
-        <w:t xml:space="preserve">A proposta de valor do NutriWay difere dos aplicativos de calorias tradicionais do mercado. A marca e o </w:t>
-      </w:r>
+        <w:t xml:space="preserve">A </w:t>
+      </w:r>
+      <w:proofErr w:type="spellStart"/>
       <w:r>
         <w:rPr>
           <w:rFonts w:ascii="Times New Roman" w:hAnsi="Times New Roman" w:cs="Times New Roman"/>
           <w:color w:val="1E1E1E"/>
         </w:rPr>
-        <w:t xml:space="preserve">produto </w:t>
-      </w:r>
+        <w:t>proposta</w:t>
+      </w:r>
+      <w:proofErr w:type="spellEnd"/>
       <w:r>
         <w:rPr>
           <w:rFonts w:ascii="Times New Roman" w:hAnsi="Times New Roman" w:cs="Times New Roman"/>
           <w:color w:val="1E1E1E"/>
         </w:rPr>
-        <w:t>baseiam-se em três pilares corporativos:</w:t>
+        <w:t xml:space="preserve"> de valor </w:t>
+      </w:r>
+      <w:proofErr w:type="gramStart"/>
+      <w:r>
+        <w:rPr>
+          <w:rFonts w:ascii="Times New Roman" w:hAnsi="Times New Roman" w:cs="Times New Roman"/>
+          <w:color w:val="1E1E1E"/>
+        </w:rPr>
+        <w:t>do</w:t>
+      </w:r>
+      <w:proofErr w:type="gramEnd"/>
+      <w:r>
+        <w:rPr>
+          <w:rFonts w:ascii="Times New Roman" w:hAnsi="Times New Roman" w:cs="Times New Roman"/>
+          <w:color w:val="1E1E1E"/>
+        </w:rPr>
+        <w:t xml:space="preserve"> NutriWay difere dos aplicativos de calorias tradicionais do mercado. A </w:t>
+      </w:r>
+      <w:proofErr w:type="spellStart"/>
+      <w:r>
+        <w:rPr>
+          <w:rFonts w:ascii="Times New Roman" w:hAnsi="Times New Roman" w:cs="Times New Roman"/>
+          <w:color w:val="1E1E1E"/>
+        </w:rPr>
+        <w:t>marca</w:t>
+      </w:r>
+      <w:proofErr w:type="spellEnd"/>
+      <w:r>
+        <w:rPr>
+          <w:rFonts w:ascii="Times New Roman" w:hAnsi="Times New Roman" w:cs="Times New Roman"/>
+          <w:color w:val="1E1E1E"/>
+        </w:rPr>
+        <w:t xml:space="preserve"> e o </w:t>
+      </w:r>
+      <w:proofErr w:type="spellStart"/>
+      <w:r>
+        <w:rPr>
+          <w:rFonts w:ascii="Times New Roman" w:hAnsi="Times New Roman" w:cs="Times New Roman"/>
+          <w:color w:val="1E1E1E"/>
+        </w:rPr>
+        <w:t>produto</w:t>
+      </w:r>
+      <w:proofErr w:type="spellEnd"/>
+      <w:r>
+        <w:rPr>
+          <w:rFonts w:ascii="Times New Roman" w:hAnsi="Times New Roman" w:cs="Times New Roman"/>
+          <w:color w:val="1E1E1E"/>
+        </w:rPr>
+        <w:t xml:space="preserve"> </w:t>
+      </w:r>
+      <w:proofErr w:type="spellStart"/>
+      <w:r>
+        <w:rPr>
+          <w:rFonts w:ascii="Times New Roman" w:hAnsi="Times New Roman" w:cs="Times New Roman"/>
+          <w:color w:val="1E1E1E"/>
+        </w:rPr>
+        <w:t>baseiam</w:t>
+      </w:r>
+      <w:proofErr w:type="spellEnd"/>
+      <w:r>
+        <w:rPr>
+          <w:rFonts w:ascii="Times New Roman" w:hAnsi="Times New Roman" w:cs="Times New Roman"/>
+          <w:color w:val="1E1E1E"/>
+        </w:rPr>
+        <w:t xml:space="preserve">-se </w:t>
+      </w:r>
+      <w:proofErr w:type="spellStart"/>
+      <w:r>
+        <w:rPr>
+          <w:rFonts w:ascii="Times New Roman" w:hAnsi="Times New Roman" w:cs="Times New Roman"/>
+          <w:color w:val="1E1E1E"/>
+        </w:rPr>
+        <w:t>em</w:t>
+      </w:r>
+      <w:proofErr w:type="spellEnd"/>
+      <w:r>
+        <w:rPr>
+          <w:rFonts w:ascii="Times New Roman" w:hAnsi="Times New Roman" w:cs="Times New Roman"/>
+          <w:color w:val="1E1E1E"/>
+        </w:rPr>
+        <w:t xml:space="preserve"> </w:t>
+      </w:r>
+      <w:proofErr w:type="spellStart"/>
+      <w:r>
+        <w:rPr>
+          <w:rFonts w:ascii="Times New Roman" w:hAnsi="Times New Roman" w:cs="Times New Roman"/>
+          <w:color w:val="1E1E1E"/>
+        </w:rPr>
+        <w:t>três</w:t>
+      </w:r>
+      <w:proofErr w:type="spellEnd"/>
+      <w:r>
+        <w:rPr>
+          <w:rFonts w:ascii="Times New Roman" w:hAnsi="Times New Roman" w:cs="Times New Roman"/>
+          <w:color w:val="1E1E1E"/>
+        </w:rPr>
+        <w:t xml:space="preserve"> </w:t>
+      </w:r>
+      <w:proofErr w:type="spellStart"/>
+      <w:r>
+        <w:rPr>
+          <w:rFonts w:ascii="Times New Roman" w:hAnsi="Times New Roman" w:cs="Times New Roman"/>
+          <w:color w:val="1E1E1E"/>
+        </w:rPr>
+        <w:t>pilares</w:t>
+      </w:r>
+      <w:proofErr w:type="spellEnd"/>
+      <w:r>
+        <w:rPr>
+          <w:rFonts w:ascii="Times New Roman" w:hAnsi="Times New Roman" w:cs="Times New Roman"/>
+          <w:color w:val="1E1E1E"/>
+        </w:rPr>
+        <w:t xml:space="preserve"> corporativos:</w:t>
       </w:r>
     </w:p>
     <w:p>
@@ -494,8 +722,9 @@
           <w:color w:val="228B22"/>
           <w:sz w:val="24"/>
         </w:rPr>
-        <w:t xml:space="preserve">Etapa 5: Critérios de Sucesso </w:t>
-      </w:r>
+        <w:t xml:space="preserve">Etapa 5: </w:t>
+      </w:r>
+      <w:proofErr w:type="spellStart"/>
       <w:r>
         <w:rPr>
           <w:rFonts w:ascii="Times New Roman" w:hAnsi="Times New Roman" w:cs="Times New Roman"/>
@@ -503,8 +732,9 @@
           <w:color w:val="228B22"/>
           <w:sz w:val="24"/>
         </w:rPr>
-        <w:t>–</w:t>
-      </w:r>
+        <w:t>Critérios</w:t>
+      </w:r>
+      <w:proofErr w:type="spellEnd"/>
       <w:r>
         <w:rPr>
           <w:rFonts w:ascii="Times New Roman" w:hAnsi="Times New Roman" w:cs="Times New Roman"/>
@@ -512,7 +742,7 @@
           <w:color w:val="228B22"/>
           <w:sz w:val="24"/>
         </w:rPr>
-        <w:t xml:space="preserve"> </w:t>
+        <w:t xml:space="preserve"> de Sucesso </w:t>
       </w:r>
       <w:r>
         <w:rPr>
@@ -521,8 +751,68 @@
           <w:color w:val="228B22"/>
           <w:sz w:val="24"/>
         </w:rPr>
-        <w:t>Métricas de Validação de Produto</w:t>
-      </w:r>
+        <w:t>–</w:t>
+      </w:r>
+      <w:r>
+        <w:rPr>
+          <w:rFonts w:ascii="Times New Roman" w:hAnsi="Times New Roman" w:cs="Times New Roman"/>
+          <w:b/>
+          <w:color w:val="228B22"/>
+          <w:sz w:val="24"/>
+        </w:rPr>
+        <w:t xml:space="preserve"> </w:t>
+      </w:r>
+      <w:proofErr w:type="spellStart"/>
+      <w:r>
+        <w:rPr>
+          <w:rFonts w:ascii="Times New Roman" w:hAnsi="Times New Roman" w:cs="Times New Roman"/>
+          <w:b/>
+          <w:color w:val="228B22"/>
+          <w:sz w:val="24"/>
+        </w:rPr>
+        <w:t>Métricas</w:t>
+      </w:r>
+      <w:proofErr w:type="spellEnd"/>
+      <w:r>
+        <w:rPr>
+          <w:rFonts w:ascii="Times New Roman" w:hAnsi="Times New Roman" w:cs="Times New Roman"/>
+          <w:b/>
+          <w:color w:val="228B22"/>
+          <w:sz w:val="24"/>
+        </w:rPr>
+        <w:t xml:space="preserve"> de </w:t>
+      </w:r>
+      <w:proofErr w:type="spellStart"/>
+      <w:r>
+        <w:rPr>
+          <w:rFonts w:ascii="Times New Roman" w:hAnsi="Times New Roman" w:cs="Times New Roman"/>
+          <w:b/>
+          <w:color w:val="228B22"/>
+          <w:sz w:val="24"/>
+        </w:rPr>
+        <w:t>Validação</w:t>
+      </w:r>
+      <w:proofErr w:type="spellEnd"/>
+      <w:r>
+        <w:rPr>
+          <w:rFonts w:ascii="Times New Roman" w:hAnsi="Times New Roman" w:cs="Times New Roman"/>
+          <w:b/>
+          <w:color w:val="228B22"/>
+          <w:sz w:val="24"/>
+        </w:rPr>
+        <w:t xml:space="preserve"> de </w:t>
+      </w:r>
+      <w:proofErr w:type="spellStart"/>
+      <w:r>
+        <w:rPr>
+          <w:rFonts w:ascii="Times New Roman" w:hAnsi="Times New Roman" w:cs="Times New Roman"/>
+          <w:b/>
+          <w:color w:val="228B22"/>
+          <w:sz w:val="24"/>
+        </w:rPr>
+        <w:t>Produto</w:t>
+      </w:r>
+      <w:proofErr w:type="spellEnd"/>
     </w:p>
     <w:p>
       <w:pPr>
@@ -537,7 +827,55 @@
           <w:rFonts w:ascii="Times New Roman" w:hAnsi="Times New Roman" w:cs="Times New Roman"/>
           <w:color w:val="1E1E1E"/>
         </w:rPr>
-        <w:t>Para avaliar a aceitação e o sucesso do MVP, a gestão determinou métricas específicas divididas em dois pilares:</w:t>
+        <w:t xml:space="preserve">Para </w:t>
+      </w:r>
+      <w:proofErr w:type="spellStart"/>
+      <w:r>
+        <w:rPr>
+          <w:rFonts w:ascii="Times New Roman" w:hAnsi="Times New Roman" w:cs="Times New Roman"/>
+          <w:color w:val="1E1E1E"/>
+        </w:rPr>
+        <w:t>avaliar</w:t>
+      </w:r>
+      <w:proofErr w:type="spellEnd"/>
+      <w:r>
+        <w:rPr>
+          <w:rFonts w:ascii="Times New Roman" w:hAnsi="Times New Roman" w:cs="Times New Roman"/>
+          <w:color w:val="1E1E1E"/>
+        </w:rPr>
+        <w:t xml:space="preserve"> </w:t>
+      </w:r>
+      <w:proofErr w:type="gramStart"/>
+      <w:r>
+        <w:rPr>
+          <w:rFonts w:ascii="Times New Roman" w:hAnsi="Times New Roman" w:cs="Times New Roman"/>
+          <w:color w:val="1E1E1E"/>
+        </w:rPr>
+        <w:t>a</w:t>
+      </w:r>
+      <w:proofErr w:type="gramEnd"/>
+      <w:r>
+        <w:rPr>
+          <w:rFonts w:ascii="Times New Roman" w:hAnsi="Times New Roman" w:cs="Times New Roman"/>
+          <w:color w:val="1E1E1E"/>
+        </w:rPr>
+        <w:t xml:space="preserve"> </w:t>
+      </w:r>
+      <w:proofErr w:type="spellStart"/>
+      <w:r>
+        <w:rPr>
+          <w:rFonts w:ascii="Times New Roman" w:hAnsi="Times New Roman" w:cs="Times New Roman"/>
+          <w:color w:val="1E1E1E"/>
+        </w:rPr>
+        <w:t>aceitação</w:t>
+      </w:r>
+      <w:proofErr w:type="spellEnd"/>
+      <w:r>
+        <w:rPr>
+          <w:rFonts w:ascii="Times New Roman" w:hAnsi="Times New Roman" w:cs="Times New Roman"/>
+          <w:color w:val="1E1E1E"/>
+        </w:rPr>
+        <w:t xml:space="preserve"> e o sucesso do MVP, a gestão determinou métricas específicas divididas em dois pilares:</w:t>
       </w:r>
     </w:p>
     <w:p>
@@ -687,7 +1025,23 @@
           <w:rFonts w:ascii="Times New Roman" w:hAnsi="Times New Roman" w:cs="Times New Roman"/>
           <w:color w:val="1E1E1E"/>
         </w:rPr>
-        <w:t xml:space="preserve"> MVP do NutriWay foi construído com escopo reduzido para eliminar desperdício de desenvolvimento de software. As funcionalidades de diário de exercícios, controle hídrico avançado e perfil complexo foram desativadas temporariamente.</w:t>
+        <w:t xml:space="preserve"> MVP do </w:t>
+      </w:r>
+      <w:proofErr w:type="spellStart"/>
+      <w:r>
+        <w:rPr>
+          <w:rFonts w:ascii="Times New Roman" w:hAnsi="Times New Roman" w:cs="Times New Roman"/>
+          <w:color w:val="1E1E1E"/>
+        </w:rPr>
+        <w:t>NutriWay</w:t>
+      </w:r>
+      <w:proofErr w:type="spellEnd"/>
+      <w:r>
+        <w:rPr>
+          <w:rFonts w:ascii="Times New Roman" w:hAnsi="Times New Roman" w:cs="Times New Roman"/>
+          <w:color w:val="1E1E1E"/>
+        </w:rPr>
+        <w:t xml:space="preserve"> foi construído com escopo reduzido para eliminar desperdício de desenvolvimento de software. As funcionalidades de diário de exercícios, controle hídrico avançado e perfil complexo foram desativadas temporariamente.</w:t>
       </w:r>
     </w:p>
     <w:p>
@@ -747,6 +1101,7 @@
         <w:jc w:val="both"/>
         <w:rPr>
           <w:rFonts w:ascii="Times New Roman" w:hAnsi="Times New Roman" w:cs="Times New Roman"/>
+          <w:color w:val="1E1E1E"/>
         </w:rPr>
       </w:pPr>
       <w:r>
@@ -754,12 +1109,4353 @@
           <w:rFonts w:ascii="Times New Roman" w:hAnsi="Times New Roman" w:cs="Times New Roman"/>
           <w:color w:val="1E1E1E"/>
         </w:rPr>
-        <w:t>3. Coletar feedbacks rápidos para planejar a escala futura da ferramenta de forma sustentável.</w:t>
+        <w:t xml:space="preserve">3. Coletar </w:t>
+      </w:r>
+      <w:proofErr w:type="gramStart"/>
+      <w:r>
+        <w:rPr>
+          <w:rFonts w:ascii="Times New Roman" w:hAnsi="Times New Roman" w:cs="Times New Roman"/>
+          <w:color w:val="1E1E1E"/>
+        </w:rPr>
+        <w:t>feedbacks</w:t>
+      </w:r>
+      <w:proofErr w:type="gramEnd"/>
+      <w:r>
+        <w:rPr>
+          <w:rFonts w:ascii="Times New Roman" w:hAnsi="Times New Roman" w:cs="Times New Roman"/>
+          <w:color w:val="1E1E1E"/>
+        </w:rPr>
+        <w:t xml:space="preserve"> rápidos para planejar </w:t>
+      </w:r>
+      <w:proofErr w:type="gramStart"/>
+      <w:r>
+        <w:rPr>
+          <w:rFonts w:ascii="Times New Roman" w:hAnsi="Times New Roman" w:cs="Times New Roman"/>
+          <w:color w:val="1E1E1E"/>
+        </w:rPr>
+        <w:t>a</w:t>
+      </w:r>
+      <w:proofErr w:type="gramEnd"/>
+      <w:r>
+        <w:rPr>
+          <w:rFonts w:ascii="Times New Roman" w:hAnsi="Times New Roman" w:cs="Times New Roman"/>
+          <w:color w:val="1E1E1E"/>
+        </w:rPr>
+        <w:t xml:space="preserve"> escala futura da ferramenta de forma </w:t>
+      </w:r>
+      <w:proofErr w:type="spellStart"/>
+      <w:r>
+        <w:rPr>
+          <w:rFonts w:ascii="Times New Roman" w:hAnsi="Times New Roman" w:cs="Times New Roman"/>
+          <w:color w:val="1E1E1E"/>
+        </w:rPr>
+        <w:t>sustentável</w:t>
+      </w:r>
+      <w:proofErr w:type="spellEnd"/>
+      <w:r>
+        <w:rPr>
+          <w:rFonts w:ascii="Times New Roman" w:hAnsi="Times New Roman" w:cs="Times New Roman"/>
+          <w:color w:val="1E1E1E"/>
+        </w:rPr>
+        <w:t>.</w:t>
       </w:r>
     </w:p>
     <w:p>
       <w:pPr>
-        <w:spacing w:after="240"/>
+        <w:spacing w:after="120"/>
+        <w:ind w:left="360"/>
+        <w:jc w:val="both"/>
+        <w:rPr>
+          <w:rFonts w:ascii="Times New Roman" w:hAnsi="Times New Roman" w:cs="Times New Roman"/>
+          <w:color w:val="1E1E1E"/>
+        </w:rPr>
+      </w:pPr>
+    </w:p>
+    <w:p>
+      <w:pPr>
+        <w:spacing w:after="120"/>
+        <w:ind w:left="360"/>
+        <w:jc w:val="both"/>
+        <w:rPr>
+          <w:rFonts w:ascii="Times New Roman" w:hAnsi="Times New Roman" w:cs="Times New Roman"/>
+        </w:rPr>
+      </w:pPr>
+      <w:r>
+        <w:rPr>
+          <w:rFonts w:ascii="Times New Roman" w:hAnsi="Times New Roman" w:cs="Times New Roman"/>
+        </w:rPr>
+        <w:t xml:space="preserve">O </w:t>
+      </w:r>
+      <w:proofErr w:type="spellStart"/>
+      <w:r>
+        <w:rPr>
+          <w:rFonts w:ascii="Times New Roman" w:hAnsi="Times New Roman" w:cs="Times New Roman"/>
+        </w:rPr>
+        <w:t>protótipo</w:t>
+      </w:r>
+      <w:proofErr w:type="spellEnd"/>
+      <w:r>
+        <w:rPr>
+          <w:rFonts w:ascii="Times New Roman" w:hAnsi="Times New Roman" w:cs="Times New Roman"/>
+        </w:rPr>
+        <w:t xml:space="preserve"> do </w:t>
+      </w:r>
+      <w:proofErr w:type="spellStart"/>
+      <w:r>
+        <w:rPr>
+          <w:rFonts w:ascii="Times New Roman" w:hAnsi="Times New Roman" w:cs="Times New Roman"/>
+        </w:rPr>
+        <w:t>aplicativo</w:t>
+      </w:r>
+      <w:proofErr w:type="spellEnd"/>
+      <w:r>
+        <w:rPr>
+          <w:rFonts w:ascii="Times New Roman" w:hAnsi="Times New Roman" w:cs="Times New Roman"/>
+        </w:rPr>
+        <w:t xml:space="preserve"> </w:t>
+      </w:r>
+      <w:proofErr w:type="spellStart"/>
+      <w:r>
+        <w:rPr>
+          <w:rFonts w:ascii="Times New Roman" w:hAnsi="Times New Roman" w:cs="Times New Roman"/>
+        </w:rPr>
+        <w:t>foi</w:t>
+      </w:r>
+      <w:proofErr w:type="spellEnd"/>
+      <w:r>
+        <w:rPr>
+          <w:rFonts w:ascii="Times New Roman" w:hAnsi="Times New Roman" w:cs="Times New Roman"/>
+        </w:rPr>
+        <w:t xml:space="preserve"> </w:t>
+      </w:r>
+      <w:proofErr w:type="spellStart"/>
+      <w:r>
+        <w:rPr>
+          <w:rFonts w:ascii="Times New Roman" w:hAnsi="Times New Roman" w:cs="Times New Roman"/>
+        </w:rPr>
+        <w:t>construído</w:t>
+      </w:r>
+      <w:proofErr w:type="spellEnd"/>
+      <w:r>
+        <w:rPr>
+          <w:rFonts w:ascii="Times New Roman" w:hAnsi="Times New Roman" w:cs="Times New Roman"/>
+        </w:rPr>
+        <w:t xml:space="preserve"> </w:t>
+      </w:r>
+      <w:proofErr w:type="spellStart"/>
+      <w:r>
+        <w:rPr>
+          <w:rFonts w:ascii="Times New Roman" w:hAnsi="Times New Roman" w:cs="Times New Roman"/>
+        </w:rPr>
+        <w:t>utilizando</w:t>
+      </w:r>
+      <w:proofErr w:type="spellEnd"/>
+      <w:r>
+        <w:rPr>
+          <w:rFonts w:ascii="Times New Roman" w:hAnsi="Times New Roman" w:cs="Times New Roman"/>
+        </w:rPr>
+        <w:t xml:space="preserve"> o Claude AI e</w:t>
+      </w:r>
+      <w:r>
+        <w:rPr>
+          <w:rFonts w:ascii="Times New Roman" w:hAnsi="Times New Roman" w:cs="Times New Roman"/>
+        </w:rPr>
+        <w:t xml:space="preserve"> </w:t>
+      </w:r>
+      <w:proofErr w:type="spellStart"/>
+      <w:r>
+        <w:rPr>
+          <w:rFonts w:ascii="Times New Roman" w:hAnsi="Times New Roman" w:cs="Times New Roman"/>
+        </w:rPr>
+        <w:t>pode</w:t>
+      </w:r>
+      <w:proofErr w:type="spellEnd"/>
+      <w:r>
+        <w:rPr>
+          <w:rFonts w:ascii="Times New Roman" w:hAnsi="Times New Roman" w:cs="Times New Roman"/>
+        </w:rPr>
+        <w:t xml:space="preserve"> ser </w:t>
+      </w:r>
+      <w:proofErr w:type="spellStart"/>
+      <w:r>
+        <w:rPr>
+          <w:rFonts w:ascii="Times New Roman" w:hAnsi="Times New Roman" w:cs="Times New Roman"/>
+        </w:rPr>
+        <w:t>acessado</w:t>
+      </w:r>
+      <w:proofErr w:type="spellEnd"/>
+      <w:r>
+        <w:rPr>
+          <w:rFonts w:ascii="Times New Roman" w:hAnsi="Times New Roman" w:cs="Times New Roman"/>
+        </w:rPr>
+        <w:t xml:space="preserve"> </w:t>
+      </w:r>
+      <w:proofErr w:type="spellStart"/>
+      <w:r>
+        <w:rPr>
+          <w:rFonts w:ascii="Times New Roman" w:hAnsi="Times New Roman" w:cs="Times New Roman"/>
+        </w:rPr>
+        <w:t>em</w:t>
+      </w:r>
+      <w:proofErr w:type="spellEnd"/>
+      <w:r>
+        <w:rPr>
+          <w:rFonts w:ascii="Times New Roman" w:hAnsi="Times New Roman" w:cs="Times New Roman"/>
+        </w:rPr>
+        <w:t>:</w:t>
+      </w:r>
+    </w:p>
+    <w:p>
+      <w:pPr>
+        <w:spacing w:after="120"/>
+        <w:ind w:left="360"/>
+        <w:jc w:val="both"/>
+        <w:rPr>
+          <w:rFonts w:ascii="Times New Roman" w:hAnsi="Times New Roman" w:cs="Times New Roman"/>
+        </w:rPr>
+      </w:pPr>
+    </w:p>
+    <w:p>
+      <w:pPr>
+        <w:spacing w:after="120"/>
+        <w:ind w:left="360"/>
+        <w:jc w:val="both"/>
+        <w:rPr>
+          <w:rFonts w:ascii="Times New Roman" w:hAnsi="Times New Roman" w:cs="Times New Roman"/>
+        </w:rPr>
+      </w:pPr>
+      <w:hyperlink r:id="rId6" w:history="1">
+        <w:r>
+          <w:rPr>
+            <w:rStyle w:val="Hyperlink"/>
+            <w:rFonts w:ascii="Times New Roman" w:hAnsi="Times New Roman" w:cs="Times New Roman"/>
+          </w:rPr>
+          <w:t>https://nutriway-oovn.vercel.app/</w:t>
+        </w:r>
+      </w:hyperlink>
+    </w:p>
+    <w:p>
+      <w:pPr>
+        <w:rPr>
+          <w:rFonts w:ascii="Times New Roman" w:hAnsi="Times New Roman" w:cs="Times New Roman"/>
+        </w:rPr>
+      </w:pPr>
+      <w:r>
+        <w:rPr>
+          <w:rFonts w:ascii="Times New Roman" w:hAnsi="Times New Roman" w:cs="Times New Roman"/>
+        </w:rPr>
+        <w:br w:type="page"/>
+      </w:r>
+    </w:p>
+    <w:p>
+      <w:pPr>
+        <w:spacing w:after="120"/>
+        <w:ind w:left="360"/>
+        <w:jc w:val="both"/>
+        <w:rPr>
+          <w:rFonts w:ascii="Times New Roman" w:hAnsi="Times New Roman" w:cs="Times New Roman"/>
+          <w:b/>
+          <w:bCs/>
+          <w:color w:val="228B22"/>
+        </w:rPr>
+      </w:pPr>
+      <w:r>
+        <w:rPr>
+          <w:rFonts w:ascii="Times New Roman" w:hAnsi="Times New Roman" w:cs="Times New Roman"/>
+          <w:b/>
+          <w:bCs/>
+          <w:color w:val="228B22"/>
+        </w:rPr>
+        <w:lastRenderedPageBreak/>
+        <w:t xml:space="preserve">Prompt para </w:t>
+      </w:r>
+      <w:proofErr w:type="spellStart"/>
+      <w:r>
+        <w:rPr>
+          <w:rFonts w:ascii="Times New Roman" w:hAnsi="Times New Roman" w:cs="Times New Roman"/>
+          <w:b/>
+          <w:bCs/>
+          <w:color w:val="228B22"/>
+        </w:rPr>
+        <w:t>construção</w:t>
+      </w:r>
+      <w:proofErr w:type="spellEnd"/>
+      <w:r>
+        <w:rPr>
+          <w:rFonts w:ascii="Times New Roman" w:hAnsi="Times New Roman" w:cs="Times New Roman"/>
+          <w:b/>
+          <w:bCs/>
+          <w:color w:val="228B22"/>
+        </w:rPr>
+        <w:t xml:space="preserve"> do </w:t>
+      </w:r>
+      <w:proofErr w:type="spellStart"/>
+      <w:r>
+        <w:rPr>
+          <w:rFonts w:ascii="Times New Roman" w:hAnsi="Times New Roman" w:cs="Times New Roman"/>
+          <w:b/>
+          <w:bCs/>
+          <w:color w:val="228B22"/>
+        </w:rPr>
+        <w:t>protótipo</w:t>
+      </w:r>
+      <w:proofErr w:type="spellEnd"/>
+    </w:p>
+    <w:p>
+      <w:pPr>
+        <w:spacing w:after="120"/>
+        <w:ind w:left="360"/>
+        <w:jc w:val="both"/>
+        <w:rPr>
+          <w:rFonts w:ascii="Times New Roman" w:hAnsi="Times New Roman" w:cs="Times New Roman"/>
+        </w:rPr>
+      </w:pPr>
+    </w:p>
+    <w:p>
+      <w:pPr>
+        <w:spacing w:after="120"/>
+        <w:ind w:left="360"/>
+        <w:jc w:val="both"/>
+        <w:rPr>
+          <w:rFonts w:ascii="Times New Roman" w:hAnsi="Times New Roman" w:cs="Times New Roman"/>
+        </w:rPr>
+      </w:pPr>
+      <w:proofErr w:type="spellStart"/>
+      <w:r>
+        <w:rPr>
+          <w:rFonts w:ascii="Times New Roman" w:hAnsi="Times New Roman" w:cs="Times New Roman"/>
+        </w:rPr>
+        <w:t>Crie</w:t>
+      </w:r>
+      <w:proofErr w:type="spellEnd"/>
+      <w:r>
+        <w:rPr>
+          <w:rFonts w:ascii="Times New Roman" w:hAnsi="Times New Roman" w:cs="Times New Roman"/>
+        </w:rPr>
+        <w:t xml:space="preserve"> </w:t>
+      </w:r>
+      <w:proofErr w:type="spellStart"/>
+      <w:r>
+        <w:rPr>
+          <w:rFonts w:ascii="Times New Roman" w:hAnsi="Times New Roman" w:cs="Times New Roman"/>
+        </w:rPr>
+        <w:t>uma</w:t>
+      </w:r>
+      <w:proofErr w:type="spellEnd"/>
+      <w:r>
+        <w:rPr>
+          <w:rFonts w:ascii="Times New Roman" w:hAnsi="Times New Roman" w:cs="Times New Roman"/>
+        </w:rPr>
+        <w:t xml:space="preserve"> </w:t>
+      </w:r>
+      <w:proofErr w:type="spellStart"/>
+      <w:r>
+        <w:rPr>
+          <w:rFonts w:ascii="Times New Roman" w:hAnsi="Times New Roman" w:cs="Times New Roman"/>
+        </w:rPr>
+        <w:t>página</w:t>
+      </w:r>
+      <w:proofErr w:type="spellEnd"/>
+      <w:r>
+        <w:rPr>
+          <w:rFonts w:ascii="Times New Roman" w:hAnsi="Times New Roman" w:cs="Times New Roman"/>
+        </w:rPr>
+        <w:t xml:space="preserve"> </w:t>
+      </w:r>
+      <w:proofErr w:type="spellStart"/>
+      <w:r>
+        <w:rPr>
+          <w:rFonts w:ascii="Times New Roman" w:hAnsi="Times New Roman" w:cs="Times New Roman"/>
+        </w:rPr>
+        <w:t>em</w:t>
+      </w:r>
+      <w:proofErr w:type="spellEnd"/>
+      <w:r>
+        <w:rPr>
+          <w:rFonts w:ascii="Times New Roman" w:hAnsi="Times New Roman" w:cs="Times New Roman"/>
+        </w:rPr>
+        <w:t xml:space="preserve"> React (Next.js 14 com Tailwind CSS e </w:t>
+      </w:r>
+      <w:proofErr w:type="spellStart"/>
+      <w:r>
+        <w:rPr>
+          <w:rFonts w:ascii="Times New Roman" w:hAnsi="Times New Roman" w:cs="Times New Roman"/>
+        </w:rPr>
+        <w:t>Lucide</w:t>
+      </w:r>
+      <w:proofErr w:type="spellEnd"/>
+      <w:r>
+        <w:rPr>
+          <w:rFonts w:ascii="Times New Roman" w:hAnsi="Times New Roman" w:cs="Times New Roman"/>
+        </w:rPr>
+        <w:t xml:space="preserve"> React para </w:t>
+      </w:r>
+      <w:proofErr w:type="spellStart"/>
+      <w:r>
+        <w:rPr>
+          <w:rFonts w:ascii="Times New Roman" w:hAnsi="Times New Roman" w:cs="Times New Roman"/>
+        </w:rPr>
+        <w:t>ícones</w:t>
+      </w:r>
+      <w:proofErr w:type="spellEnd"/>
+      <w:r>
+        <w:rPr>
+          <w:rFonts w:ascii="Times New Roman" w:hAnsi="Times New Roman" w:cs="Times New Roman"/>
+        </w:rPr>
+        <w:t xml:space="preserve">) </w:t>
+      </w:r>
+      <w:proofErr w:type="spellStart"/>
+      <w:r>
+        <w:rPr>
+          <w:rFonts w:ascii="Times New Roman" w:hAnsi="Times New Roman" w:cs="Times New Roman"/>
+        </w:rPr>
+        <w:t>que</w:t>
+      </w:r>
+      <w:proofErr w:type="spellEnd"/>
+      <w:r>
+        <w:rPr>
+          <w:rFonts w:ascii="Times New Roman" w:hAnsi="Times New Roman" w:cs="Times New Roman"/>
+        </w:rPr>
+        <w:t xml:space="preserve"> </w:t>
+      </w:r>
+      <w:proofErr w:type="spellStart"/>
+      <w:r>
+        <w:rPr>
+          <w:rFonts w:ascii="Times New Roman" w:hAnsi="Times New Roman" w:cs="Times New Roman"/>
+        </w:rPr>
+        <w:t>sirva</w:t>
+      </w:r>
+      <w:proofErr w:type="spellEnd"/>
+      <w:r>
+        <w:rPr>
+          <w:rFonts w:ascii="Times New Roman" w:hAnsi="Times New Roman" w:cs="Times New Roman"/>
+        </w:rPr>
+        <w:t xml:space="preserve"> </w:t>
+      </w:r>
+      <w:proofErr w:type="spellStart"/>
+      <w:r>
+        <w:rPr>
+          <w:rFonts w:ascii="Times New Roman" w:hAnsi="Times New Roman" w:cs="Times New Roman"/>
+        </w:rPr>
+        <w:t>como</w:t>
+      </w:r>
+      <w:proofErr w:type="spellEnd"/>
+      <w:r>
+        <w:rPr>
+          <w:rFonts w:ascii="Times New Roman" w:hAnsi="Times New Roman" w:cs="Times New Roman"/>
+        </w:rPr>
+        <w:t xml:space="preserve"> um "</w:t>
+      </w:r>
+      <w:proofErr w:type="spellStart"/>
+      <w:r>
+        <w:rPr>
+          <w:rFonts w:ascii="Times New Roman" w:hAnsi="Times New Roman" w:cs="Times New Roman"/>
+        </w:rPr>
+        <w:t>Gerador</w:t>
+      </w:r>
+      <w:proofErr w:type="spellEnd"/>
+      <w:r>
+        <w:rPr>
+          <w:rFonts w:ascii="Times New Roman" w:hAnsi="Times New Roman" w:cs="Times New Roman"/>
+        </w:rPr>
+        <w:t xml:space="preserve"> de </w:t>
+      </w:r>
+      <w:proofErr w:type="spellStart"/>
+      <w:r>
+        <w:rPr>
+          <w:rFonts w:ascii="Times New Roman" w:hAnsi="Times New Roman" w:cs="Times New Roman"/>
+        </w:rPr>
+        <w:t>Cardápio</w:t>
+      </w:r>
+      <w:proofErr w:type="spellEnd"/>
+      <w:r>
+        <w:rPr>
+          <w:rFonts w:ascii="Times New Roman" w:hAnsi="Times New Roman" w:cs="Times New Roman"/>
+        </w:rPr>
+        <w:t xml:space="preserve"> </w:t>
+      </w:r>
+      <w:proofErr w:type="spellStart"/>
+      <w:r>
+        <w:rPr>
+          <w:rFonts w:ascii="Times New Roman" w:hAnsi="Times New Roman" w:cs="Times New Roman"/>
+        </w:rPr>
+        <w:t>Econômico</w:t>
+      </w:r>
+      <w:proofErr w:type="spellEnd"/>
+      <w:r>
+        <w:rPr>
+          <w:rFonts w:ascii="Times New Roman" w:hAnsi="Times New Roman" w:cs="Times New Roman"/>
+        </w:rPr>
+        <w:t xml:space="preserve"> de </w:t>
+      </w:r>
+      <w:proofErr w:type="spellStart"/>
+      <w:r>
+        <w:rPr>
+          <w:rFonts w:ascii="Times New Roman" w:hAnsi="Times New Roman" w:cs="Times New Roman"/>
+        </w:rPr>
+        <w:t>Baixo</w:t>
+      </w:r>
+      <w:proofErr w:type="spellEnd"/>
+      <w:r>
+        <w:rPr>
+          <w:rFonts w:ascii="Times New Roman" w:hAnsi="Times New Roman" w:cs="Times New Roman"/>
+        </w:rPr>
+        <w:t xml:space="preserve"> </w:t>
+      </w:r>
+      <w:proofErr w:type="spellStart"/>
+      <w:r>
+        <w:rPr>
+          <w:rFonts w:ascii="Times New Roman" w:hAnsi="Times New Roman" w:cs="Times New Roman"/>
+        </w:rPr>
+        <w:t>Custo</w:t>
+      </w:r>
+      <w:proofErr w:type="spellEnd"/>
+      <w:r>
+        <w:rPr>
+          <w:rFonts w:ascii="Times New Roman" w:hAnsi="Times New Roman" w:cs="Times New Roman"/>
+        </w:rPr>
+        <w:t xml:space="preserve">" </w:t>
+      </w:r>
+      <w:proofErr w:type="spellStart"/>
+      <w:r>
+        <w:rPr>
+          <w:rFonts w:ascii="Times New Roman" w:hAnsi="Times New Roman" w:cs="Times New Roman"/>
+        </w:rPr>
+        <w:t>focado</w:t>
+      </w:r>
+      <w:proofErr w:type="spellEnd"/>
+      <w:r>
+        <w:rPr>
+          <w:rFonts w:ascii="Times New Roman" w:hAnsi="Times New Roman" w:cs="Times New Roman"/>
+        </w:rPr>
+        <w:t xml:space="preserve"> </w:t>
+      </w:r>
+      <w:proofErr w:type="spellStart"/>
+      <w:r>
+        <w:rPr>
+          <w:rFonts w:ascii="Times New Roman" w:hAnsi="Times New Roman" w:cs="Times New Roman"/>
+        </w:rPr>
+        <w:t>em</w:t>
+      </w:r>
+      <w:proofErr w:type="spellEnd"/>
+      <w:r>
+        <w:rPr>
+          <w:rFonts w:ascii="Times New Roman" w:hAnsi="Times New Roman" w:cs="Times New Roman"/>
+        </w:rPr>
+        <w:t xml:space="preserve"> </w:t>
+      </w:r>
+      <w:proofErr w:type="spellStart"/>
+      <w:r>
+        <w:rPr>
+          <w:rFonts w:ascii="Times New Roman" w:hAnsi="Times New Roman" w:cs="Times New Roman"/>
+        </w:rPr>
+        <w:t>nutrição</w:t>
+      </w:r>
+      <w:proofErr w:type="spellEnd"/>
+      <w:r>
+        <w:rPr>
+          <w:rFonts w:ascii="Times New Roman" w:hAnsi="Times New Roman" w:cs="Times New Roman"/>
+        </w:rPr>
+        <w:t xml:space="preserve"> e </w:t>
+      </w:r>
+      <w:proofErr w:type="spellStart"/>
+      <w:r>
+        <w:rPr>
+          <w:rFonts w:ascii="Times New Roman" w:hAnsi="Times New Roman" w:cs="Times New Roman"/>
+        </w:rPr>
+        <w:t>orçamento</w:t>
+      </w:r>
+      <w:proofErr w:type="spellEnd"/>
+      <w:r>
+        <w:rPr>
+          <w:rFonts w:ascii="Times New Roman" w:hAnsi="Times New Roman" w:cs="Times New Roman"/>
+        </w:rPr>
+        <w:t xml:space="preserve">. A </w:t>
+      </w:r>
+      <w:proofErr w:type="spellStart"/>
+      <w:r>
+        <w:rPr>
+          <w:rFonts w:ascii="Times New Roman" w:hAnsi="Times New Roman" w:cs="Times New Roman"/>
+        </w:rPr>
+        <w:t>página</w:t>
+      </w:r>
+      <w:proofErr w:type="spellEnd"/>
+      <w:r>
+        <w:rPr>
+          <w:rFonts w:ascii="Times New Roman" w:hAnsi="Times New Roman" w:cs="Times New Roman"/>
+        </w:rPr>
+        <w:t xml:space="preserve"> </w:t>
+      </w:r>
+      <w:proofErr w:type="spellStart"/>
+      <w:r>
+        <w:rPr>
+          <w:rFonts w:ascii="Times New Roman" w:hAnsi="Times New Roman" w:cs="Times New Roman"/>
+        </w:rPr>
+        <w:t>deve</w:t>
+      </w:r>
+      <w:proofErr w:type="spellEnd"/>
+      <w:r>
+        <w:rPr>
+          <w:rFonts w:ascii="Times New Roman" w:hAnsi="Times New Roman" w:cs="Times New Roman"/>
+        </w:rPr>
+        <w:t xml:space="preserve"> ser limpa, </w:t>
+      </w:r>
+      <w:proofErr w:type="spellStart"/>
+      <w:r>
+        <w:rPr>
+          <w:rFonts w:ascii="Times New Roman" w:hAnsi="Times New Roman" w:cs="Times New Roman"/>
+        </w:rPr>
+        <w:t>sem</w:t>
+      </w:r>
+      <w:proofErr w:type="spellEnd"/>
+      <w:r>
+        <w:rPr>
+          <w:rFonts w:ascii="Times New Roman" w:hAnsi="Times New Roman" w:cs="Times New Roman"/>
+        </w:rPr>
+        <w:t xml:space="preserve"> barras </w:t>
+      </w:r>
+      <w:proofErr w:type="spellStart"/>
+      <w:r>
+        <w:rPr>
+          <w:rFonts w:ascii="Times New Roman" w:hAnsi="Times New Roman" w:cs="Times New Roman"/>
+        </w:rPr>
+        <w:t>laterais</w:t>
+      </w:r>
+      <w:proofErr w:type="spellEnd"/>
+      <w:r>
+        <w:rPr>
+          <w:rFonts w:ascii="Times New Roman" w:hAnsi="Times New Roman" w:cs="Times New Roman"/>
+        </w:rPr>
+        <w:t xml:space="preserve"> de </w:t>
+      </w:r>
+      <w:proofErr w:type="spellStart"/>
+      <w:r>
+        <w:rPr>
+          <w:rFonts w:ascii="Times New Roman" w:hAnsi="Times New Roman" w:cs="Times New Roman"/>
+        </w:rPr>
+        <w:t>navegação</w:t>
+      </w:r>
+      <w:proofErr w:type="spellEnd"/>
+      <w:r>
+        <w:rPr>
+          <w:rFonts w:ascii="Times New Roman" w:hAnsi="Times New Roman" w:cs="Times New Roman"/>
+        </w:rPr>
+        <w:t xml:space="preserve">, </w:t>
+      </w:r>
+      <w:proofErr w:type="spellStart"/>
+      <w:r>
+        <w:rPr>
+          <w:rFonts w:ascii="Times New Roman" w:hAnsi="Times New Roman" w:cs="Times New Roman"/>
+        </w:rPr>
+        <w:t>centralizada</w:t>
+      </w:r>
+      <w:proofErr w:type="spellEnd"/>
+      <w:r>
+        <w:rPr>
+          <w:rFonts w:ascii="Times New Roman" w:hAnsi="Times New Roman" w:cs="Times New Roman"/>
+        </w:rPr>
+        <w:t xml:space="preserve"> e </w:t>
+      </w:r>
+      <w:proofErr w:type="spellStart"/>
+      <w:r>
+        <w:rPr>
+          <w:rFonts w:ascii="Times New Roman" w:hAnsi="Times New Roman" w:cs="Times New Roman"/>
+        </w:rPr>
+        <w:t>responsiva</w:t>
+      </w:r>
+      <w:proofErr w:type="spellEnd"/>
+      <w:r>
+        <w:rPr>
+          <w:rFonts w:ascii="Times New Roman" w:hAnsi="Times New Roman" w:cs="Times New Roman"/>
+        </w:rPr>
+        <w:t xml:space="preserve"> (com </w:t>
+      </w:r>
+      <w:proofErr w:type="spellStart"/>
+      <w:r>
+        <w:rPr>
+          <w:rFonts w:ascii="Times New Roman" w:hAnsi="Times New Roman" w:cs="Times New Roman"/>
+        </w:rPr>
+        <w:t>largura</w:t>
+      </w:r>
+      <w:proofErr w:type="spellEnd"/>
+      <w:r>
+        <w:rPr>
+          <w:rFonts w:ascii="Times New Roman" w:hAnsi="Times New Roman" w:cs="Times New Roman"/>
+        </w:rPr>
+        <w:t xml:space="preserve"> </w:t>
+      </w:r>
+      <w:proofErr w:type="spellStart"/>
+      <w:r>
+        <w:rPr>
+          <w:rFonts w:ascii="Times New Roman" w:hAnsi="Times New Roman" w:cs="Times New Roman"/>
+        </w:rPr>
+        <w:t>máxima</w:t>
+      </w:r>
+      <w:proofErr w:type="spellEnd"/>
+      <w:r>
+        <w:rPr>
+          <w:rFonts w:ascii="Times New Roman" w:hAnsi="Times New Roman" w:cs="Times New Roman"/>
+        </w:rPr>
+        <w:t xml:space="preserve"> de 5xl).</w:t>
+      </w:r>
+    </w:p>
+    <w:p>
+      <w:pPr>
+        <w:spacing w:after="120"/>
+        <w:ind w:left="360"/>
+        <w:jc w:val="both"/>
+        <w:rPr>
+          <w:rFonts w:ascii="Times New Roman" w:hAnsi="Times New Roman" w:cs="Times New Roman"/>
+        </w:rPr>
+      </w:pPr>
+    </w:p>
+    <w:p>
+      <w:pPr>
+        <w:spacing w:after="120"/>
+        <w:ind w:left="360"/>
+        <w:jc w:val="both"/>
+        <w:rPr>
+          <w:rFonts w:ascii="Times New Roman" w:hAnsi="Times New Roman" w:cs="Times New Roman"/>
+        </w:rPr>
+      </w:pPr>
+      <w:r>
+        <w:rPr>
+          <w:rFonts w:ascii="Times New Roman" w:hAnsi="Times New Roman" w:cs="Times New Roman"/>
+        </w:rPr>
+        <w:t xml:space="preserve">A </w:t>
+      </w:r>
+      <w:proofErr w:type="spellStart"/>
+      <w:r>
+        <w:rPr>
+          <w:rFonts w:ascii="Times New Roman" w:hAnsi="Times New Roman" w:cs="Times New Roman"/>
+        </w:rPr>
+        <w:t>página</w:t>
+      </w:r>
+      <w:proofErr w:type="spellEnd"/>
+      <w:r>
+        <w:rPr>
+          <w:rFonts w:ascii="Times New Roman" w:hAnsi="Times New Roman" w:cs="Times New Roman"/>
+        </w:rPr>
+        <w:t xml:space="preserve"> </w:t>
+      </w:r>
+      <w:proofErr w:type="spellStart"/>
+      <w:r>
+        <w:rPr>
+          <w:rFonts w:ascii="Times New Roman" w:hAnsi="Times New Roman" w:cs="Times New Roman"/>
+        </w:rPr>
+        <w:t>deve</w:t>
+      </w:r>
+      <w:proofErr w:type="spellEnd"/>
+      <w:r>
+        <w:rPr>
+          <w:rFonts w:ascii="Times New Roman" w:hAnsi="Times New Roman" w:cs="Times New Roman"/>
+        </w:rPr>
+        <w:t xml:space="preserve"> </w:t>
+      </w:r>
+      <w:proofErr w:type="spellStart"/>
+      <w:r>
+        <w:rPr>
+          <w:rFonts w:ascii="Times New Roman" w:hAnsi="Times New Roman" w:cs="Times New Roman"/>
+        </w:rPr>
+        <w:t>possuir</w:t>
+      </w:r>
+      <w:proofErr w:type="spellEnd"/>
+      <w:r>
+        <w:rPr>
+          <w:rFonts w:ascii="Times New Roman" w:hAnsi="Times New Roman" w:cs="Times New Roman"/>
+        </w:rPr>
+        <w:t xml:space="preserve"> as </w:t>
+      </w:r>
+      <w:proofErr w:type="spellStart"/>
+      <w:r>
+        <w:rPr>
+          <w:rFonts w:ascii="Times New Roman" w:hAnsi="Times New Roman" w:cs="Times New Roman"/>
+        </w:rPr>
+        <w:t>seguintes</w:t>
+      </w:r>
+      <w:proofErr w:type="spellEnd"/>
+      <w:r>
+        <w:rPr>
+          <w:rFonts w:ascii="Times New Roman" w:hAnsi="Times New Roman" w:cs="Times New Roman"/>
+        </w:rPr>
+        <w:t xml:space="preserve"> </w:t>
+      </w:r>
+      <w:proofErr w:type="spellStart"/>
+      <w:r>
+        <w:rPr>
+          <w:rFonts w:ascii="Times New Roman" w:hAnsi="Times New Roman" w:cs="Times New Roman"/>
+        </w:rPr>
+        <w:t>especificidades</w:t>
+      </w:r>
+      <w:proofErr w:type="spellEnd"/>
+      <w:r>
+        <w:rPr>
+          <w:rFonts w:ascii="Times New Roman" w:hAnsi="Times New Roman" w:cs="Times New Roman"/>
+        </w:rPr>
+        <w:t xml:space="preserve"> de </w:t>
+      </w:r>
+      <w:proofErr w:type="spellStart"/>
+      <w:r>
+        <w:rPr>
+          <w:rFonts w:ascii="Times New Roman" w:hAnsi="Times New Roman" w:cs="Times New Roman"/>
+        </w:rPr>
+        <w:t>lógica</w:t>
+      </w:r>
+      <w:proofErr w:type="spellEnd"/>
+      <w:r>
+        <w:rPr>
+          <w:rFonts w:ascii="Times New Roman" w:hAnsi="Times New Roman" w:cs="Times New Roman"/>
+        </w:rPr>
+        <w:t xml:space="preserve"> e design:</w:t>
+      </w:r>
+    </w:p>
+    <w:p>
+      <w:pPr>
+        <w:spacing w:after="120"/>
+        <w:ind w:left="360"/>
+        <w:jc w:val="both"/>
+        <w:rPr>
+          <w:rFonts w:ascii="Times New Roman" w:hAnsi="Times New Roman" w:cs="Times New Roman"/>
+        </w:rPr>
+      </w:pPr>
+    </w:p>
+    <w:p>
+      <w:pPr>
+        <w:spacing w:after="120"/>
+        <w:ind w:left="360"/>
+        <w:jc w:val="both"/>
+        <w:rPr>
+          <w:rFonts w:ascii="Times New Roman" w:hAnsi="Times New Roman" w:cs="Times New Roman"/>
+          <w:b/>
+          <w:bCs/>
+        </w:rPr>
+      </w:pPr>
+      <w:r>
+        <w:rPr>
+          <w:rFonts w:ascii="Times New Roman" w:hAnsi="Times New Roman" w:cs="Times New Roman"/>
+          <w:b/>
+          <w:bCs/>
+        </w:rPr>
+        <w:t>1. BANCO DE DADOS E CARDÁPIOS (TEMPLATES E CUSTOS):</w:t>
+      </w:r>
+    </w:p>
+    <w:p>
+      <w:pPr>
+        <w:spacing w:after="120"/>
+        <w:ind w:left="360"/>
+        <w:jc w:val="both"/>
+        <w:rPr>
+          <w:rFonts w:ascii="Times New Roman" w:hAnsi="Times New Roman" w:cs="Times New Roman"/>
+        </w:rPr>
+      </w:pPr>
+      <w:r>
+        <w:rPr>
+          <w:rFonts w:ascii="Times New Roman" w:hAnsi="Times New Roman" w:cs="Times New Roman"/>
+        </w:rPr>
+        <w:t xml:space="preserve">Defina 4 templates de </w:t>
+      </w:r>
+      <w:proofErr w:type="spellStart"/>
+      <w:r>
+        <w:rPr>
+          <w:rFonts w:ascii="Times New Roman" w:hAnsi="Times New Roman" w:cs="Times New Roman"/>
+        </w:rPr>
+        <w:t>cardápios</w:t>
+      </w:r>
+      <w:proofErr w:type="spellEnd"/>
+      <w:r>
+        <w:rPr>
+          <w:rFonts w:ascii="Times New Roman" w:hAnsi="Times New Roman" w:cs="Times New Roman"/>
+        </w:rPr>
+        <w:t xml:space="preserve"> </w:t>
+      </w:r>
+      <w:proofErr w:type="spellStart"/>
+      <w:r>
+        <w:rPr>
+          <w:rFonts w:ascii="Times New Roman" w:hAnsi="Times New Roman" w:cs="Times New Roman"/>
+        </w:rPr>
+        <w:t>baseados</w:t>
+      </w:r>
+      <w:proofErr w:type="spellEnd"/>
+      <w:r>
+        <w:rPr>
+          <w:rFonts w:ascii="Times New Roman" w:hAnsi="Times New Roman" w:cs="Times New Roman"/>
+        </w:rPr>
+        <w:t xml:space="preserve"> </w:t>
+      </w:r>
+      <w:proofErr w:type="spellStart"/>
+      <w:r>
+        <w:rPr>
+          <w:rFonts w:ascii="Times New Roman" w:hAnsi="Times New Roman" w:cs="Times New Roman"/>
+        </w:rPr>
+        <w:t>na</w:t>
+      </w:r>
+      <w:proofErr w:type="spellEnd"/>
+      <w:r>
+        <w:rPr>
+          <w:rFonts w:ascii="Times New Roman" w:hAnsi="Times New Roman" w:cs="Times New Roman"/>
+        </w:rPr>
+        <w:t xml:space="preserve"> </w:t>
+      </w:r>
+      <w:proofErr w:type="spellStart"/>
+      <w:r>
+        <w:rPr>
+          <w:rFonts w:ascii="Times New Roman" w:hAnsi="Times New Roman" w:cs="Times New Roman"/>
+        </w:rPr>
+        <w:t>Tabela</w:t>
+      </w:r>
+      <w:proofErr w:type="spellEnd"/>
+      <w:r>
+        <w:rPr>
+          <w:rFonts w:ascii="Times New Roman" w:hAnsi="Times New Roman" w:cs="Times New Roman"/>
+        </w:rPr>
+        <w:t xml:space="preserve"> TACO (</w:t>
+      </w:r>
+      <w:proofErr w:type="spellStart"/>
+      <w:r>
+        <w:rPr>
+          <w:rFonts w:ascii="Times New Roman" w:hAnsi="Times New Roman" w:cs="Times New Roman"/>
+        </w:rPr>
+        <w:t>alimentos</w:t>
+      </w:r>
+      <w:proofErr w:type="spellEnd"/>
+      <w:r>
+        <w:rPr>
+          <w:rFonts w:ascii="Times New Roman" w:hAnsi="Times New Roman" w:cs="Times New Roman"/>
+        </w:rPr>
+        <w:t xml:space="preserve"> </w:t>
+      </w:r>
+      <w:proofErr w:type="spellStart"/>
+      <w:r>
+        <w:rPr>
+          <w:rFonts w:ascii="Times New Roman" w:hAnsi="Times New Roman" w:cs="Times New Roman"/>
+        </w:rPr>
+        <w:t>brasileiros</w:t>
+      </w:r>
+      <w:proofErr w:type="spellEnd"/>
+      <w:r>
+        <w:rPr>
+          <w:rFonts w:ascii="Times New Roman" w:hAnsi="Times New Roman" w:cs="Times New Roman"/>
+        </w:rPr>
+        <w:t xml:space="preserve"> </w:t>
+      </w:r>
+      <w:proofErr w:type="spellStart"/>
+      <w:r>
+        <w:rPr>
+          <w:rFonts w:ascii="Times New Roman" w:hAnsi="Times New Roman" w:cs="Times New Roman"/>
+        </w:rPr>
+        <w:t>comuns</w:t>
+      </w:r>
+      <w:proofErr w:type="spellEnd"/>
+      <w:r>
+        <w:rPr>
+          <w:rFonts w:ascii="Times New Roman" w:hAnsi="Times New Roman" w:cs="Times New Roman"/>
+        </w:rPr>
+        <w:t xml:space="preserve"> e </w:t>
+      </w:r>
+      <w:proofErr w:type="spellStart"/>
+      <w:r>
+        <w:rPr>
+          <w:rFonts w:ascii="Times New Roman" w:hAnsi="Times New Roman" w:cs="Times New Roman"/>
+        </w:rPr>
+        <w:t>acessíveis</w:t>
+      </w:r>
+      <w:proofErr w:type="spellEnd"/>
+      <w:r>
+        <w:rPr>
+          <w:rFonts w:ascii="Times New Roman" w:hAnsi="Times New Roman" w:cs="Times New Roman"/>
+        </w:rPr>
+        <w:t>):</w:t>
+      </w:r>
+    </w:p>
+    <w:p>
+      <w:pPr>
+        <w:spacing w:after="120"/>
+        <w:ind w:left="360"/>
+        <w:jc w:val="both"/>
+        <w:rPr>
+          <w:rFonts w:ascii="Times New Roman" w:hAnsi="Times New Roman" w:cs="Times New Roman"/>
+        </w:rPr>
+      </w:pPr>
+      <w:r>
+        <w:rPr>
+          <w:rFonts w:ascii="Times New Roman" w:hAnsi="Times New Roman" w:cs="Times New Roman"/>
+        </w:rPr>
+        <w:t>- "low" (</w:t>
+      </w:r>
+      <w:proofErr w:type="spellStart"/>
+      <w:r>
+        <w:rPr>
+          <w:rFonts w:ascii="Times New Roman" w:hAnsi="Times New Roman" w:cs="Times New Roman"/>
+        </w:rPr>
+        <w:t>Custo</w:t>
+      </w:r>
+      <w:proofErr w:type="spellEnd"/>
+      <w:r>
+        <w:rPr>
+          <w:rFonts w:ascii="Times New Roman" w:hAnsi="Times New Roman" w:cs="Times New Roman"/>
+        </w:rPr>
+        <w:t xml:space="preserve"> </w:t>
+      </w:r>
+      <w:proofErr w:type="spellStart"/>
+      <w:r>
+        <w:rPr>
+          <w:rFonts w:ascii="Times New Roman" w:hAnsi="Times New Roman" w:cs="Times New Roman"/>
+        </w:rPr>
+        <w:t>fixo</w:t>
+      </w:r>
+      <w:proofErr w:type="spellEnd"/>
+      <w:r>
+        <w:rPr>
+          <w:rFonts w:ascii="Times New Roman" w:hAnsi="Times New Roman" w:cs="Times New Roman"/>
+        </w:rPr>
+        <w:t xml:space="preserve"> </w:t>
+      </w:r>
+      <w:proofErr w:type="spellStart"/>
+      <w:r>
+        <w:rPr>
+          <w:rFonts w:ascii="Times New Roman" w:hAnsi="Times New Roman" w:cs="Times New Roman"/>
+        </w:rPr>
+        <w:t>estimado</w:t>
+      </w:r>
+      <w:proofErr w:type="spellEnd"/>
+      <w:r>
+        <w:rPr>
+          <w:rFonts w:ascii="Times New Roman" w:hAnsi="Times New Roman" w:cs="Times New Roman"/>
+        </w:rPr>
+        <w:t xml:space="preserve"> de R$ 15,00)</w:t>
+      </w:r>
+    </w:p>
+    <w:p>
+      <w:pPr>
+        <w:spacing w:after="120"/>
+        <w:ind w:left="360"/>
+        <w:jc w:val="both"/>
+        <w:rPr>
+          <w:rFonts w:ascii="Times New Roman" w:hAnsi="Times New Roman" w:cs="Times New Roman"/>
+        </w:rPr>
+      </w:pPr>
+      <w:r>
+        <w:rPr>
+          <w:rFonts w:ascii="Times New Roman" w:hAnsi="Times New Roman" w:cs="Times New Roman"/>
+        </w:rPr>
+        <w:t>- "</w:t>
+      </w:r>
+      <w:proofErr w:type="spellStart"/>
+      <w:r>
+        <w:rPr>
+          <w:rFonts w:ascii="Times New Roman" w:hAnsi="Times New Roman" w:cs="Times New Roman"/>
+        </w:rPr>
+        <w:t>low_alt</w:t>
+      </w:r>
+      <w:proofErr w:type="spellEnd"/>
+      <w:r>
+        <w:rPr>
+          <w:rFonts w:ascii="Times New Roman" w:hAnsi="Times New Roman" w:cs="Times New Roman"/>
+        </w:rPr>
+        <w:t>" (</w:t>
+      </w:r>
+      <w:proofErr w:type="spellStart"/>
+      <w:r>
+        <w:rPr>
+          <w:rFonts w:ascii="Times New Roman" w:hAnsi="Times New Roman" w:cs="Times New Roman"/>
+        </w:rPr>
+        <w:t>Custo</w:t>
+      </w:r>
+      <w:proofErr w:type="spellEnd"/>
+      <w:r>
+        <w:rPr>
+          <w:rFonts w:ascii="Times New Roman" w:hAnsi="Times New Roman" w:cs="Times New Roman"/>
+        </w:rPr>
+        <w:t xml:space="preserve"> </w:t>
+      </w:r>
+      <w:proofErr w:type="spellStart"/>
+      <w:r>
+        <w:rPr>
+          <w:rFonts w:ascii="Times New Roman" w:hAnsi="Times New Roman" w:cs="Times New Roman"/>
+        </w:rPr>
+        <w:t>fixo</w:t>
+      </w:r>
+      <w:proofErr w:type="spellEnd"/>
+      <w:r>
+        <w:rPr>
+          <w:rFonts w:ascii="Times New Roman" w:hAnsi="Times New Roman" w:cs="Times New Roman"/>
+        </w:rPr>
+        <w:t xml:space="preserve"> </w:t>
+      </w:r>
+      <w:proofErr w:type="spellStart"/>
+      <w:r>
+        <w:rPr>
+          <w:rFonts w:ascii="Times New Roman" w:hAnsi="Times New Roman" w:cs="Times New Roman"/>
+        </w:rPr>
+        <w:t>estimado</w:t>
+      </w:r>
+      <w:proofErr w:type="spellEnd"/>
+      <w:r>
+        <w:rPr>
+          <w:rFonts w:ascii="Times New Roman" w:hAnsi="Times New Roman" w:cs="Times New Roman"/>
+        </w:rPr>
+        <w:t xml:space="preserve"> de R$ 13,55)</w:t>
+      </w:r>
+    </w:p>
+    <w:p>
+      <w:pPr>
+        <w:spacing w:after="120"/>
+        <w:ind w:left="360"/>
+        <w:jc w:val="both"/>
+        <w:rPr>
+          <w:rFonts w:ascii="Times New Roman" w:hAnsi="Times New Roman" w:cs="Times New Roman"/>
+        </w:rPr>
+      </w:pPr>
+      <w:r>
+        <w:rPr>
+          <w:rFonts w:ascii="Times New Roman" w:hAnsi="Times New Roman" w:cs="Times New Roman"/>
+        </w:rPr>
+        <w:t>- "medium" (</w:t>
+      </w:r>
+      <w:proofErr w:type="spellStart"/>
+      <w:r>
+        <w:rPr>
+          <w:rFonts w:ascii="Times New Roman" w:hAnsi="Times New Roman" w:cs="Times New Roman"/>
+        </w:rPr>
+        <w:t>Custo</w:t>
+      </w:r>
+      <w:proofErr w:type="spellEnd"/>
+      <w:r>
+        <w:rPr>
+          <w:rFonts w:ascii="Times New Roman" w:hAnsi="Times New Roman" w:cs="Times New Roman"/>
+        </w:rPr>
+        <w:t xml:space="preserve"> </w:t>
+      </w:r>
+      <w:proofErr w:type="spellStart"/>
+      <w:r>
+        <w:rPr>
+          <w:rFonts w:ascii="Times New Roman" w:hAnsi="Times New Roman" w:cs="Times New Roman"/>
+        </w:rPr>
+        <w:t>fixo</w:t>
+      </w:r>
+      <w:proofErr w:type="spellEnd"/>
+      <w:r>
+        <w:rPr>
+          <w:rFonts w:ascii="Times New Roman" w:hAnsi="Times New Roman" w:cs="Times New Roman"/>
+        </w:rPr>
+        <w:t xml:space="preserve"> </w:t>
+      </w:r>
+      <w:proofErr w:type="spellStart"/>
+      <w:r>
+        <w:rPr>
+          <w:rFonts w:ascii="Times New Roman" w:hAnsi="Times New Roman" w:cs="Times New Roman"/>
+        </w:rPr>
+        <w:t>estimado</w:t>
+      </w:r>
+      <w:proofErr w:type="spellEnd"/>
+      <w:r>
+        <w:rPr>
+          <w:rFonts w:ascii="Times New Roman" w:hAnsi="Times New Roman" w:cs="Times New Roman"/>
+        </w:rPr>
+        <w:t xml:space="preserve"> de R$ 25,90)</w:t>
+      </w:r>
+    </w:p>
+    <w:p>
+      <w:pPr>
+        <w:spacing w:after="120"/>
+        <w:ind w:left="360"/>
+        <w:jc w:val="both"/>
+        <w:rPr>
+          <w:rFonts w:ascii="Times New Roman" w:hAnsi="Times New Roman" w:cs="Times New Roman"/>
+        </w:rPr>
+      </w:pPr>
+      <w:r>
+        <w:rPr>
+          <w:rFonts w:ascii="Times New Roman" w:hAnsi="Times New Roman" w:cs="Times New Roman"/>
+        </w:rPr>
+        <w:t>- "</w:t>
+      </w:r>
+      <w:proofErr w:type="spellStart"/>
+      <w:r>
+        <w:rPr>
+          <w:rFonts w:ascii="Times New Roman" w:hAnsi="Times New Roman" w:cs="Times New Roman"/>
+        </w:rPr>
+        <w:t>medium_alt</w:t>
+      </w:r>
+      <w:proofErr w:type="spellEnd"/>
+      <w:r>
+        <w:rPr>
+          <w:rFonts w:ascii="Times New Roman" w:hAnsi="Times New Roman" w:cs="Times New Roman"/>
+        </w:rPr>
+        <w:t>" (</w:t>
+      </w:r>
+      <w:proofErr w:type="spellStart"/>
+      <w:r>
+        <w:rPr>
+          <w:rFonts w:ascii="Times New Roman" w:hAnsi="Times New Roman" w:cs="Times New Roman"/>
+        </w:rPr>
+        <w:t>Custo</w:t>
+      </w:r>
+      <w:proofErr w:type="spellEnd"/>
+      <w:r>
+        <w:rPr>
+          <w:rFonts w:ascii="Times New Roman" w:hAnsi="Times New Roman" w:cs="Times New Roman"/>
+        </w:rPr>
+        <w:t xml:space="preserve"> </w:t>
+      </w:r>
+      <w:proofErr w:type="spellStart"/>
+      <w:r>
+        <w:rPr>
+          <w:rFonts w:ascii="Times New Roman" w:hAnsi="Times New Roman" w:cs="Times New Roman"/>
+        </w:rPr>
+        <w:t>fixo</w:t>
+      </w:r>
+      <w:proofErr w:type="spellEnd"/>
+      <w:r>
+        <w:rPr>
+          <w:rFonts w:ascii="Times New Roman" w:hAnsi="Times New Roman" w:cs="Times New Roman"/>
+        </w:rPr>
+        <w:t xml:space="preserve"> </w:t>
+      </w:r>
+      <w:proofErr w:type="spellStart"/>
+      <w:r>
+        <w:rPr>
+          <w:rFonts w:ascii="Times New Roman" w:hAnsi="Times New Roman" w:cs="Times New Roman"/>
+        </w:rPr>
+        <w:t>estimado</w:t>
+      </w:r>
+      <w:proofErr w:type="spellEnd"/>
+      <w:r>
+        <w:rPr>
+          <w:rFonts w:ascii="Times New Roman" w:hAnsi="Times New Roman" w:cs="Times New Roman"/>
+        </w:rPr>
+        <w:t xml:space="preserve"> de R$ 23,00)</w:t>
+      </w:r>
+    </w:p>
+    <w:p>
+      <w:pPr>
+        <w:spacing w:after="120"/>
+        <w:ind w:left="360"/>
+        <w:jc w:val="both"/>
+        <w:rPr>
+          <w:rFonts w:ascii="Times New Roman" w:hAnsi="Times New Roman" w:cs="Times New Roman"/>
+        </w:rPr>
+      </w:pPr>
+      <w:r>
+        <w:rPr>
+          <w:rFonts w:ascii="Times New Roman" w:hAnsi="Times New Roman" w:cs="Times New Roman"/>
+        </w:rPr>
+        <w:t xml:space="preserve">Cada template </w:t>
+      </w:r>
+      <w:proofErr w:type="spellStart"/>
+      <w:r>
+        <w:rPr>
+          <w:rFonts w:ascii="Times New Roman" w:hAnsi="Times New Roman" w:cs="Times New Roman"/>
+        </w:rPr>
+        <w:t>deve</w:t>
+      </w:r>
+      <w:proofErr w:type="spellEnd"/>
+      <w:r>
+        <w:rPr>
+          <w:rFonts w:ascii="Times New Roman" w:hAnsi="Times New Roman" w:cs="Times New Roman"/>
+        </w:rPr>
+        <w:t xml:space="preserve"> </w:t>
+      </w:r>
+      <w:proofErr w:type="spellStart"/>
+      <w:r>
+        <w:rPr>
+          <w:rFonts w:ascii="Times New Roman" w:hAnsi="Times New Roman" w:cs="Times New Roman"/>
+        </w:rPr>
+        <w:t>conter</w:t>
+      </w:r>
+      <w:proofErr w:type="spellEnd"/>
+      <w:r>
+        <w:rPr>
+          <w:rFonts w:ascii="Times New Roman" w:hAnsi="Times New Roman" w:cs="Times New Roman"/>
+        </w:rPr>
+        <w:t xml:space="preserve"> 4 </w:t>
+      </w:r>
+      <w:proofErr w:type="spellStart"/>
+      <w:r>
+        <w:rPr>
+          <w:rFonts w:ascii="Times New Roman" w:hAnsi="Times New Roman" w:cs="Times New Roman"/>
+        </w:rPr>
+        <w:t>refeições</w:t>
+      </w:r>
+      <w:proofErr w:type="spellEnd"/>
+      <w:r>
+        <w:rPr>
+          <w:rFonts w:ascii="Times New Roman" w:hAnsi="Times New Roman" w:cs="Times New Roman"/>
+        </w:rPr>
+        <w:t xml:space="preserve"> (breakfast, lunch, snack, dinner) com </w:t>
+      </w:r>
+      <w:proofErr w:type="spellStart"/>
+      <w:r>
+        <w:rPr>
+          <w:rFonts w:ascii="Times New Roman" w:hAnsi="Times New Roman" w:cs="Times New Roman"/>
+        </w:rPr>
+        <w:t>itens</w:t>
+      </w:r>
+      <w:proofErr w:type="spellEnd"/>
+      <w:r>
+        <w:rPr>
+          <w:rFonts w:ascii="Times New Roman" w:hAnsi="Times New Roman" w:cs="Times New Roman"/>
+        </w:rPr>
+        <w:t xml:space="preserve"> </w:t>
+      </w:r>
+      <w:proofErr w:type="spellStart"/>
+      <w:r>
+        <w:rPr>
+          <w:rFonts w:ascii="Times New Roman" w:hAnsi="Times New Roman" w:cs="Times New Roman"/>
+        </w:rPr>
+        <w:t>contendo</w:t>
+      </w:r>
+      <w:proofErr w:type="spellEnd"/>
+      <w:r>
+        <w:rPr>
+          <w:rFonts w:ascii="Times New Roman" w:hAnsi="Times New Roman" w:cs="Times New Roman"/>
+        </w:rPr>
+        <w:t xml:space="preserve"> </w:t>
+      </w:r>
+      <w:proofErr w:type="spellStart"/>
+      <w:r>
+        <w:rPr>
+          <w:rFonts w:ascii="Times New Roman" w:hAnsi="Times New Roman" w:cs="Times New Roman"/>
+        </w:rPr>
+        <w:t>nome</w:t>
+      </w:r>
+      <w:proofErr w:type="spellEnd"/>
+      <w:r>
+        <w:rPr>
+          <w:rFonts w:ascii="Times New Roman" w:hAnsi="Times New Roman" w:cs="Times New Roman"/>
+        </w:rPr>
+        <w:t xml:space="preserve">, </w:t>
+      </w:r>
+      <w:proofErr w:type="spellStart"/>
+      <w:r>
+        <w:rPr>
+          <w:rFonts w:ascii="Times New Roman" w:hAnsi="Times New Roman" w:cs="Times New Roman"/>
+        </w:rPr>
+        <w:t>porção</w:t>
+      </w:r>
+      <w:proofErr w:type="spellEnd"/>
+      <w:r>
+        <w:rPr>
+          <w:rFonts w:ascii="Times New Roman" w:hAnsi="Times New Roman" w:cs="Times New Roman"/>
+        </w:rPr>
+        <w:t xml:space="preserve">, </w:t>
+      </w:r>
+      <w:proofErr w:type="spellStart"/>
+      <w:r>
+        <w:rPr>
+          <w:rFonts w:ascii="Times New Roman" w:hAnsi="Times New Roman" w:cs="Times New Roman"/>
+        </w:rPr>
+        <w:t>custo</w:t>
+      </w:r>
+      <w:proofErr w:type="spellEnd"/>
+      <w:r>
+        <w:rPr>
+          <w:rFonts w:ascii="Times New Roman" w:hAnsi="Times New Roman" w:cs="Times New Roman"/>
+        </w:rPr>
+        <w:t xml:space="preserve"> </w:t>
+      </w:r>
+      <w:proofErr w:type="spellStart"/>
+      <w:r>
+        <w:rPr>
+          <w:rFonts w:ascii="Times New Roman" w:hAnsi="Times New Roman" w:cs="Times New Roman"/>
+        </w:rPr>
+        <w:t>em</w:t>
+      </w:r>
+      <w:proofErr w:type="spellEnd"/>
+      <w:r>
+        <w:rPr>
+          <w:rFonts w:ascii="Times New Roman" w:hAnsi="Times New Roman" w:cs="Times New Roman"/>
+        </w:rPr>
+        <w:t xml:space="preserve"> R$, </w:t>
+      </w:r>
+      <w:proofErr w:type="spellStart"/>
+      <w:r>
+        <w:rPr>
+          <w:rFonts w:ascii="Times New Roman" w:hAnsi="Times New Roman" w:cs="Times New Roman"/>
+        </w:rPr>
+        <w:t>carboidratos</w:t>
+      </w:r>
+      <w:proofErr w:type="spellEnd"/>
+      <w:r>
+        <w:rPr>
+          <w:rFonts w:ascii="Times New Roman" w:hAnsi="Times New Roman" w:cs="Times New Roman"/>
+        </w:rPr>
+        <w:t xml:space="preserve"> (g) e </w:t>
+      </w:r>
+      <w:proofErr w:type="spellStart"/>
+      <w:r>
+        <w:rPr>
+          <w:rFonts w:ascii="Times New Roman" w:hAnsi="Times New Roman" w:cs="Times New Roman"/>
+        </w:rPr>
+        <w:t>calorias</w:t>
+      </w:r>
+      <w:proofErr w:type="spellEnd"/>
+      <w:r>
+        <w:rPr>
+          <w:rFonts w:ascii="Times New Roman" w:hAnsi="Times New Roman" w:cs="Times New Roman"/>
+        </w:rPr>
+        <w:t xml:space="preserve"> (kcal).</w:t>
+      </w:r>
+    </w:p>
+    <w:p>
+      <w:pPr>
+        <w:spacing w:after="120"/>
+        <w:ind w:left="360"/>
+        <w:jc w:val="both"/>
+        <w:rPr>
+          <w:rFonts w:ascii="Times New Roman" w:hAnsi="Times New Roman" w:cs="Times New Roman"/>
+        </w:rPr>
+      </w:pPr>
+    </w:p>
+    <w:p>
+      <w:pPr>
+        <w:spacing w:after="120"/>
+        <w:ind w:left="360"/>
+        <w:jc w:val="both"/>
+        <w:rPr>
+          <w:rFonts w:ascii="Times New Roman" w:hAnsi="Times New Roman" w:cs="Times New Roman"/>
+          <w:b/>
+          <w:bCs/>
+        </w:rPr>
+      </w:pPr>
+      <w:r>
+        <w:rPr>
+          <w:rFonts w:ascii="Times New Roman" w:hAnsi="Times New Roman" w:cs="Times New Roman"/>
+          <w:b/>
+          <w:bCs/>
+        </w:rPr>
+        <w:t>2. LÓGICA DE CONTROLE RIGOROSO DE ORÇAMENTO E PERÍODO (ATÉ 7 DIAS):</w:t>
+      </w:r>
+    </w:p>
+    <w:p>
+      <w:pPr>
+        <w:spacing w:after="120"/>
+        <w:ind w:left="360"/>
+        <w:jc w:val="both"/>
+        <w:rPr>
+          <w:rFonts w:ascii="Times New Roman" w:hAnsi="Times New Roman" w:cs="Times New Roman"/>
+        </w:rPr>
+      </w:pPr>
+      <w:r>
+        <w:rPr>
+          <w:rFonts w:ascii="Times New Roman" w:hAnsi="Times New Roman" w:cs="Times New Roman"/>
+        </w:rPr>
+        <w:t xml:space="preserve">- </w:t>
+      </w:r>
+      <w:proofErr w:type="spellStart"/>
+      <w:r>
+        <w:rPr>
+          <w:rFonts w:ascii="Times New Roman" w:hAnsi="Times New Roman" w:cs="Times New Roman"/>
+        </w:rPr>
+        <w:t>Permita</w:t>
+      </w:r>
+      <w:proofErr w:type="spellEnd"/>
+      <w:r>
+        <w:rPr>
+          <w:rFonts w:ascii="Times New Roman" w:hAnsi="Times New Roman" w:cs="Times New Roman"/>
+        </w:rPr>
+        <w:t xml:space="preserve"> </w:t>
+      </w:r>
+      <w:proofErr w:type="spellStart"/>
+      <w:r>
+        <w:rPr>
+          <w:rFonts w:ascii="Times New Roman" w:hAnsi="Times New Roman" w:cs="Times New Roman"/>
+        </w:rPr>
+        <w:t>ao</w:t>
+      </w:r>
+      <w:proofErr w:type="spellEnd"/>
+      <w:r>
+        <w:rPr>
+          <w:rFonts w:ascii="Times New Roman" w:hAnsi="Times New Roman" w:cs="Times New Roman"/>
+        </w:rPr>
+        <w:t xml:space="preserve"> </w:t>
+      </w:r>
+      <w:proofErr w:type="spellStart"/>
+      <w:r>
+        <w:rPr>
+          <w:rFonts w:ascii="Times New Roman" w:hAnsi="Times New Roman" w:cs="Times New Roman"/>
+        </w:rPr>
+        <w:t>usuário</w:t>
+      </w:r>
+      <w:proofErr w:type="spellEnd"/>
+      <w:r>
+        <w:rPr>
+          <w:rFonts w:ascii="Times New Roman" w:hAnsi="Times New Roman" w:cs="Times New Roman"/>
+        </w:rPr>
+        <w:t xml:space="preserve"> </w:t>
+      </w:r>
+      <w:proofErr w:type="spellStart"/>
+      <w:r>
+        <w:rPr>
+          <w:rFonts w:ascii="Times New Roman" w:hAnsi="Times New Roman" w:cs="Times New Roman"/>
+        </w:rPr>
+        <w:t>inserir</w:t>
+      </w:r>
+      <w:proofErr w:type="spellEnd"/>
+      <w:r>
+        <w:rPr>
+          <w:rFonts w:ascii="Times New Roman" w:hAnsi="Times New Roman" w:cs="Times New Roman"/>
+        </w:rPr>
+        <w:t xml:space="preserve"> um "</w:t>
+      </w:r>
+      <w:proofErr w:type="spellStart"/>
+      <w:r>
+        <w:rPr>
+          <w:rFonts w:ascii="Times New Roman" w:hAnsi="Times New Roman" w:cs="Times New Roman"/>
+        </w:rPr>
+        <w:t>Orçamento</w:t>
+      </w:r>
+      <w:proofErr w:type="spellEnd"/>
+      <w:r>
+        <w:rPr>
+          <w:rFonts w:ascii="Times New Roman" w:hAnsi="Times New Roman" w:cs="Times New Roman"/>
+        </w:rPr>
+        <w:t xml:space="preserve"> </w:t>
+      </w:r>
+      <w:proofErr w:type="spellStart"/>
+      <w:r>
+        <w:rPr>
+          <w:rFonts w:ascii="Times New Roman" w:hAnsi="Times New Roman" w:cs="Times New Roman"/>
+        </w:rPr>
+        <w:t>diário</w:t>
+      </w:r>
+      <w:proofErr w:type="spellEnd"/>
+      <w:r>
+        <w:rPr>
+          <w:rFonts w:ascii="Times New Roman" w:hAnsi="Times New Roman" w:cs="Times New Roman"/>
+        </w:rPr>
+        <w:t xml:space="preserve"> </w:t>
+      </w:r>
+      <w:proofErr w:type="spellStart"/>
+      <w:r>
+        <w:rPr>
+          <w:rFonts w:ascii="Times New Roman" w:hAnsi="Times New Roman" w:cs="Times New Roman"/>
+        </w:rPr>
+        <w:t>disponível</w:t>
+      </w:r>
+      <w:proofErr w:type="spellEnd"/>
+      <w:r>
+        <w:rPr>
+          <w:rFonts w:ascii="Times New Roman" w:hAnsi="Times New Roman" w:cs="Times New Roman"/>
+        </w:rPr>
+        <w:t xml:space="preserve"> (R$)" (</w:t>
+      </w:r>
+      <w:proofErr w:type="spellStart"/>
+      <w:r>
+        <w:rPr>
+          <w:rFonts w:ascii="Times New Roman" w:hAnsi="Times New Roman" w:cs="Times New Roman"/>
+        </w:rPr>
+        <w:t>puxando</w:t>
+      </w:r>
+      <w:proofErr w:type="spellEnd"/>
+      <w:r>
+        <w:rPr>
+          <w:rFonts w:ascii="Times New Roman" w:hAnsi="Times New Roman" w:cs="Times New Roman"/>
+        </w:rPr>
+        <w:t xml:space="preserve"> o valor </w:t>
+      </w:r>
+      <w:proofErr w:type="spellStart"/>
+      <w:r>
+        <w:rPr>
+          <w:rFonts w:ascii="Times New Roman" w:hAnsi="Times New Roman" w:cs="Times New Roman"/>
+        </w:rPr>
+        <w:t>padrão</w:t>
+      </w:r>
+      <w:proofErr w:type="spellEnd"/>
+      <w:r>
+        <w:rPr>
+          <w:rFonts w:ascii="Times New Roman" w:hAnsi="Times New Roman" w:cs="Times New Roman"/>
+        </w:rPr>
+        <w:t xml:space="preserve"> de um </w:t>
+      </w:r>
+      <w:proofErr w:type="spellStart"/>
+      <w:r>
+        <w:rPr>
+          <w:rFonts w:ascii="Times New Roman" w:hAnsi="Times New Roman" w:cs="Times New Roman"/>
+        </w:rPr>
+        <w:t>perfil</w:t>
+      </w:r>
+      <w:proofErr w:type="spellEnd"/>
+      <w:r>
+        <w:rPr>
+          <w:rFonts w:ascii="Times New Roman" w:hAnsi="Times New Roman" w:cs="Times New Roman"/>
+        </w:rPr>
+        <w:t xml:space="preserve"> de </w:t>
+      </w:r>
+      <w:proofErr w:type="spellStart"/>
+      <w:r>
+        <w:rPr>
+          <w:rFonts w:ascii="Times New Roman" w:hAnsi="Times New Roman" w:cs="Times New Roman"/>
+        </w:rPr>
+        <w:t>usuário</w:t>
+      </w:r>
+      <w:proofErr w:type="spellEnd"/>
+      <w:r>
+        <w:rPr>
+          <w:rFonts w:ascii="Times New Roman" w:hAnsi="Times New Roman" w:cs="Times New Roman"/>
+        </w:rPr>
+        <w:t xml:space="preserve"> se </w:t>
+      </w:r>
+      <w:proofErr w:type="spellStart"/>
+      <w:r>
+        <w:rPr>
+          <w:rFonts w:ascii="Times New Roman" w:hAnsi="Times New Roman" w:cs="Times New Roman"/>
+        </w:rPr>
+        <w:t>houver</w:t>
+      </w:r>
+      <w:proofErr w:type="spellEnd"/>
+      <w:r>
+        <w:rPr>
+          <w:rFonts w:ascii="Times New Roman" w:hAnsi="Times New Roman" w:cs="Times New Roman"/>
+        </w:rPr>
+        <w:t xml:space="preserve">) e </w:t>
+      </w:r>
+      <w:proofErr w:type="spellStart"/>
+      <w:r>
+        <w:rPr>
+          <w:rFonts w:ascii="Times New Roman" w:hAnsi="Times New Roman" w:cs="Times New Roman"/>
+        </w:rPr>
+        <w:t>selecionar</w:t>
+      </w:r>
+      <w:proofErr w:type="spellEnd"/>
+      <w:r>
+        <w:rPr>
+          <w:rFonts w:ascii="Times New Roman" w:hAnsi="Times New Roman" w:cs="Times New Roman"/>
+        </w:rPr>
+        <w:t xml:space="preserve"> um </w:t>
+      </w:r>
+      <w:proofErr w:type="spellStart"/>
+      <w:r>
+        <w:rPr>
+          <w:rFonts w:ascii="Times New Roman" w:hAnsi="Times New Roman" w:cs="Times New Roman"/>
+        </w:rPr>
+        <w:t>período</w:t>
+      </w:r>
+      <w:proofErr w:type="spellEnd"/>
+      <w:r>
+        <w:rPr>
+          <w:rFonts w:ascii="Times New Roman" w:hAnsi="Times New Roman" w:cs="Times New Roman"/>
+        </w:rPr>
+        <w:t xml:space="preserve"> de </w:t>
+      </w:r>
+      <w:proofErr w:type="spellStart"/>
+      <w:r>
+        <w:rPr>
+          <w:rFonts w:ascii="Times New Roman" w:hAnsi="Times New Roman" w:cs="Times New Roman"/>
+        </w:rPr>
+        <w:t>planejamento</w:t>
+      </w:r>
+      <w:proofErr w:type="spellEnd"/>
+      <w:r>
+        <w:rPr>
+          <w:rFonts w:ascii="Times New Roman" w:hAnsi="Times New Roman" w:cs="Times New Roman"/>
+        </w:rPr>
+        <w:t xml:space="preserve"> de 1 a 7 </w:t>
+      </w:r>
+      <w:proofErr w:type="spellStart"/>
+      <w:r>
+        <w:rPr>
+          <w:rFonts w:ascii="Times New Roman" w:hAnsi="Times New Roman" w:cs="Times New Roman"/>
+        </w:rPr>
+        <w:t>dias</w:t>
+      </w:r>
+      <w:proofErr w:type="spellEnd"/>
+      <w:r>
+        <w:rPr>
+          <w:rFonts w:ascii="Times New Roman" w:hAnsi="Times New Roman" w:cs="Times New Roman"/>
+        </w:rPr>
+        <w:t xml:space="preserve"> </w:t>
+      </w:r>
+      <w:proofErr w:type="spellStart"/>
+      <w:r>
+        <w:rPr>
+          <w:rFonts w:ascii="Times New Roman" w:hAnsi="Times New Roman" w:cs="Times New Roman"/>
+        </w:rPr>
+        <w:t>em</w:t>
+      </w:r>
+      <w:proofErr w:type="spellEnd"/>
+      <w:r>
+        <w:rPr>
+          <w:rFonts w:ascii="Times New Roman" w:hAnsi="Times New Roman" w:cs="Times New Roman"/>
+        </w:rPr>
+        <w:t xml:space="preserve"> um </w:t>
+      </w:r>
+      <w:proofErr w:type="spellStart"/>
+      <w:r>
+        <w:rPr>
+          <w:rFonts w:ascii="Times New Roman" w:hAnsi="Times New Roman" w:cs="Times New Roman"/>
+        </w:rPr>
+        <w:t>formulário</w:t>
+      </w:r>
+      <w:proofErr w:type="spellEnd"/>
+      <w:r>
+        <w:rPr>
+          <w:rFonts w:ascii="Times New Roman" w:hAnsi="Times New Roman" w:cs="Times New Roman"/>
+        </w:rPr>
+        <w:t xml:space="preserve"> </w:t>
+      </w:r>
+      <w:proofErr w:type="spellStart"/>
+      <w:r>
+        <w:rPr>
+          <w:rFonts w:ascii="Times New Roman" w:hAnsi="Times New Roman" w:cs="Times New Roman"/>
+        </w:rPr>
+        <w:t>inicial</w:t>
+      </w:r>
+      <w:proofErr w:type="spellEnd"/>
+      <w:r>
+        <w:rPr>
+          <w:rFonts w:ascii="Times New Roman" w:hAnsi="Times New Roman" w:cs="Times New Roman"/>
+        </w:rPr>
+        <w:t>.</w:t>
+      </w:r>
+    </w:p>
+    <w:p>
+      <w:pPr>
+        <w:spacing w:after="120"/>
+        <w:ind w:left="360"/>
+        <w:jc w:val="both"/>
+        <w:rPr>
+          <w:rFonts w:ascii="Times New Roman" w:hAnsi="Times New Roman" w:cs="Times New Roman"/>
+        </w:rPr>
+      </w:pPr>
+      <w:r>
+        <w:rPr>
+          <w:rFonts w:ascii="Times New Roman" w:hAnsi="Times New Roman" w:cs="Times New Roman"/>
+        </w:rPr>
+        <w:t xml:space="preserve">- Ao </w:t>
+      </w:r>
+      <w:proofErr w:type="spellStart"/>
+      <w:r>
+        <w:rPr>
+          <w:rFonts w:ascii="Times New Roman" w:hAnsi="Times New Roman" w:cs="Times New Roman"/>
+        </w:rPr>
+        <w:t>clicar</w:t>
+      </w:r>
+      <w:proofErr w:type="spellEnd"/>
+      <w:r>
+        <w:rPr>
+          <w:rFonts w:ascii="Times New Roman" w:hAnsi="Times New Roman" w:cs="Times New Roman"/>
+        </w:rPr>
+        <w:t xml:space="preserve"> </w:t>
+      </w:r>
+      <w:proofErr w:type="spellStart"/>
+      <w:r>
+        <w:rPr>
+          <w:rFonts w:ascii="Times New Roman" w:hAnsi="Times New Roman" w:cs="Times New Roman"/>
+        </w:rPr>
+        <w:t>em</w:t>
+      </w:r>
+      <w:proofErr w:type="spellEnd"/>
+      <w:r>
+        <w:rPr>
+          <w:rFonts w:ascii="Times New Roman" w:hAnsi="Times New Roman" w:cs="Times New Roman"/>
+        </w:rPr>
+        <w:t xml:space="preserve"> "Gerar </w:t>
+      </w:r>
+      <w:proofErr w:type="spellStart"/>
+      <w:r>
+        <w:rPr>
+          <w:rFonts w:ascii="Times New Roman" w:hAnsi="Times New Roman" w:cs="Times New Roman"/>
+        </w:rPr>
+        <w:t>cardápio</w:t>
+      </w:r>
+      <w:proofErr w:type="spellEnd"/>
+      <w:r>
+        <w:rPr>
+          <w:rFonts w:ascii="Times New Roman" w:hAnsi="Times New Roman" w:cs="Times New Roman"/>
+        </w:rPr>
+        <w:t xml:space="preserve">", execute um </w:t>
+      </w:r>
+      <w:proofErr w:type="spellStart"/>
+      <w:r>
+        <w:rPr>
+          <w:rFonts w:ascii="Times New Roman" w:hAnsi="Times New Roman" w:cs="Times New Roman"/>
+        </w:rPr>
+        <w:t>algoritmo</w:t>
+      </w:r>
+      <w:proofErr w:type="spellEnd"/>
+      <w:r>
+        <w:rPr>
+          <w:rFonts w:ascii="Times New Roman" w:hAnsi="Times New Roman" w:cs="Times New Roman"/>
+        </w:rPr>
+        <w:t xml:space="preserve"> de </w:t>
+      </w:r>
+      <w:proofErr w:type="spellStart"/>
+      <w:r>
+        <w:rPr>
+          <w:rFonts w:ascii="Times New Roman" w:hAnsi="Times New Roman" w:cs="Times New Roman"/>
+        </w:rPr>
+        <w:t>decisão</w:t>
+      </w:r>
+      <w:proofErr w:type="spellEnd"/>
+      <w:r>
+        <w:rPr>
+          <w:rFonts w:ascii="Times New Roman" w:hAnsi="Times New Roman" w:cs="Times New Roman"/>
+        </w:rPr>
+        <w:t>:</w:t>
+      </w:r>
+    </w:p>
+    <w:p>
+      <w:pPr>
+        <w:spacing w:after="120"/>
+        <w:ind w:left="360"/>
+        <w:jc w:val="both"/>
+        <w:rPr>
+          <w:rFonts w:ascii="Times New Roman" w:hAnsi="Times New Roman" w:cs="Times New Roman"/>
+        </w:rPr>
+      </w:pPr>
+      <w:r>
+        <w:rPr>
+          <w:rFonts w:ascii="Times New Roman" w:hAnsi="Times New Roman" w:cs="Times New Roman"/>
+        </w:rPr>
+        <w:t xml:space="preserve">  * </w:t>
+      </w:r>
+      <w:proofErr w:type="spellStart"/>
+      <w:r>
+        <w:rPr>
+          <w:rFonts w:ascii="Times New Roman" w:hAnsi="Times New Roman" w:cs="Times New Roman"/>
+        </w:rPr>
+        <w:t>Liste</w:t>
+      </w:r>
+      <w:proofErr w:type="spellEnd"/>
+      <w:r>
+        <w:rPr>
+          <w:rFonts w:ascii="Times New Roman" w:hAnsi="Times New Roman" w:cs="Times New Roman"/>
+        </w:rPr>
+        <w:t xml:space="preserve"> </w:t>
+      </w:r>
+      <w:proofErr w:type="spellStart"/>
+      <w:r>
+        <w:rPr>
+          <w:rFonts w:ascii="Times New Roman" w:hAnsi="Times New Roman" w:cs="Times New Roman"/>
+        </w:rPr>
+        <w:t>todas</w:t>
+      </w:r>
+      <w:proofErr w:type="spellEnd"/>
+      <w:r>
+        <w:rPr>
+          <w:rFonts w:ascii="Times New Roman" w:hAnsi="Times New Roman" w:cs="Times New Roman"/>
+        </w:rPr>
+        <w:t xml:space="preserve"> as </w:t>
+      </w:r>
+      <w:proofErr w:type="spellStart"/>
+      <w:r>
+        <w:rPr>
+          <w:rFonts w:ascii="Times New Roman" w:hAnsi="Times New Roman" w:cs="Times New Roman"/>
+        </w:rPr>
+        <w:t>opções</w:t>
+      </w:r>
+      <w:proofErr w:type="spellEnd"/>
+      <w:r>
+        <w:rPr>
+          <w:rFonts w:ascii="Times New Roman" w:hAnsi="Times New Roman" w:cs="Times New Roman"/>
+        </w:rPr>
+        <w:t xml:space="preserve"> de templates </w:t>
+      </w:r>
+      <w:proofErr w:type="spellStart"/>
+      <w:r>
+        <w:rPr>
+          <w:rFonts w:ascii="Times New Roman" w:hAnsi="Times New Roman" w:cs="Times New Roman"/>
+        </w:rPr>
+        <w:t>cujo</w:t>
+      </w:r>
+      <w:proofErr w:type="spellEnd"/>
+      <w:r>
+        <w:rPr>
+          <w:rFonts w:ascii="Times New Roman" w:hAnsi="Times New Roman" w:cs="Times New Roman"/>
+        </w:rPr>
+        <w:t xml:space="preserve"> </w:t>
+      </w:r>
+      <w:proofErr w:type="spellStart"/>
+      <w:r>
+        <w:rPr>
+          <w:rFonts w:ascii="Times New Roman" w:hAnsi="Times New Roman" w:cs="Times New Roman"/>
+        </w:rPr>
+        <w:t>custo</w:t>
+      </w:r>
+      <w:proofErr w:type="spellEnd"/>
+      <w:r>
+        <w:rPr>
+          <w:rFonts w:ascii="Times New Roman" w:hAnsi="Times New Roman" w:cs="Times New Roman"/>
+        </w:rPr>
+        <w:t xml:space="preserve"> total </w:t>
+      </w:r>
+      <w:proofErr w:type="spellStart"/>
+      <w:r>
+        <w:rPr>
+          <w:rFonts w:ascii="Times New Roman" w:hAnsi="Times New Roman" w:cs="Times New Roman"/>
+        </w:rPr>
+        <w:t>seja</w:t>
+      </w:r>
+      <w:proofErr w:type="spellEnd"/>
+      <w:r>
+        <w:rPr>
+          <w:rFonts w:ascii="Times New Roman" w:hAnsi="Times New Roman" w:cs="Times New Roman"/>
+        </w:rPr>
+        <w:t xml:space="preserve"> MENOR </w:t>
+      </w:r>
+      <w:proofErr w:type="spellStart"/>
+      <w:r>
+        <w:rPr>
+          <w:rFonts w:ascii="Times New Roman" w:hAnsi="Times New Roman" w:cs="Times New Roman"/>
+        </w:rPr>
+        <w:t>ou</w:t>
+      </w:r>
+      <w:proofErr w:type="spellEnd"/>
+      <w:r>
+        <w:rPr>
+          <w:rFonts w:ascii="Times New Roman" w:hAnsi="Times New Roman" w:cs="Times New Roman"/>
+        </w:rPr>
+        <w:t xml:space="preserve"> IGUAL (&lt;=) </w:t>
+      </w:r>
+      <w:proofErr w:type="spellStart"/>
+      <w:r>
+        <w:rPr>
+          <w:rFonts w:ascii="Times New Roman" w:hAnsi="Times New Roman" w:cs="Times New Roman"/>
+        </w:rPr>
+        <w:t>ao</w:t>
+      </w:r>
+      <w:proofErr w:type="spellEnd"/>
+      <w:r>
+        <w:rPr>
+          <w:rFonts w:ascii="Times New Roman" w:hAnsi="Times New Roman" w:cs="Times New Roman"/>
+        </w:rPr>
+        <w:t xml:space="preserve"> </w:t>
+      </w:r>
+      <w:proofErr w:type="spellStart"/>
+      <w:r>
+        <w:rPr>
+          <w:rFonts w:ascii="Times New Roman" w:hAnsi="Times New Roman" w:cs="Times New Roman"/>
+        </w:rPr>
+        <w:t>orçamento</w:t>
+      </w:r>
+      <w:proofErr w:type="spellEnd"/>
+      <w:r>
+        <w:rPr>
+          <w:rFonts w:ascii="Times New Roman" w:hAnsi="Times New Roman" w:cs="Times New Roman"/>
+        </w:rPr>
+        <w:t xml:space="preserve"> </w:t>
+      </w:r>
+      <w:proofErr w:type="spellStart"/>
+      <w:r>
+        <w:rPr>
+          <w:rFonts w:ascii="Times New Roman" w:hAnsi="Times New Roman" w:cs="Times New Roman"/>
+        </w:rPr>
+        <w:t>diário</w:t>
+      </w:r>
+      <w:proofErr w:type="spellEnd"/>
+      <w:r>
+        <w:rPr>
+          <w:rFonts w:ascii="Times New Roman" w:hAnsi="Times New Roman" w:cs="Times New Roman"/>
+        </w:rPr>
+        <w:t xml:space="preserve"> do </w:t>
+      </w:r>
+      <w:proofErr w:type="spellStart"/>
+      <w:r>
+        <w:rPr>
+          <w:rFonts w:ascii="Times New Roman" w:hAnsi="Times New Roman" w:cs="Times New Roman"/>
+        </w:rPr>
+        <w:t>usuário</w:t>
+      </w:r>
+      <w:proofErr w:type="spellEnd"/>
+      <w:r>
+        <w:rPr>
+          <w:rFonts w:ascii="Times New Roman" w:hAnsi="Times New Roman" w:cs="Times New Roman"/>
+        </w:rPr>
+        <w:t>.</w:t>
+      </w:r>
+    </w:p>
+    <w:p>
+      <w:pPr>
+        <w:spacing w:after="120"/>
+        <w:ind w:left="360"/>
+        <w:jc w:val="both"/>
+        <w:rPr>
+          <w:rFonts w:ascii="Times New Roman" w:hAnsi="Times New Roman" w:cs="Times New Roman"/>
+        </w:rPr>
+      </w:pPr>
+      <w:r>
+        <w:rPr>
+          <w:rFonts w:ascii="Times New Roman" w:hAnsi="Times New Roman" w:cs="Times New Roman"/>
+        </w:rPr>
+        <w:t xml:space="preserve">  * Se o </w:t>
+      </w:r>
+      <w:proofErr w:type="spellStart"/>
+      <w:r>
+        <w:rPr>
+          <w:rFonts w:ascii="Times New Roman" w:hAnsi="Times New Roman" w:cs="Times New Roman"/>
+        </w:rPr>
+        <w:t>orçamento</w:t>
+      </w:r>
+      <w:proofErr w:type="spellEnd"/>
+      <w:r>
+        <w:rPr>
+          <w:rFonts w:ascii="Times New Roman" w:hAnsi="Times New Roman" w:cs="Times New Roman"/>
+        </w:rPr>
+        <w:t xml:space="preserve"> for </w:t>
+      </w:r>
+      <w:proofErr w:type="spellStart"/>
+      <w:r>
+        <w:rPr>
+          <w:rFonts w:ascii="Times New Roman" w:hAnsi="Times New Roman" w:cs="Times New Roman"/>
+        </w:rPr>
+        <w:t>muito</w:t>
+      </w:r>
+      <w:proofErr w:type="spellEnd"/>
+      <w:r>
+        <w:rPr>
+          <w:rFonts w:ascii="Times New Roman" w:hAnsi="Times New Roman" w:cs="Times New Roman"/>
+        </w:rPr>
+        <w:t xml:space="preserve"> </w:t>
+      </w:r>
+      <w:proofErr w:type="spellStart"/>
+      <w:r>
+        <w:rPr>
+          <w:rFonts w:ascii="Times New Roman" w:hAnsi="Times New Roman" w:cs="Times New Roman"/>
+        </w:rPr>
+        <w:t>baixo</w:t>
+      </w:r>
+      <w:proofErr w:type="spellEnd"/>
+      <w:r>
+        <w:rPr>
+          <w:rFonts w:ascii="Times New Roman" w:hAnsi="Times New Roman" w:cs="Times New Roman"/>
+        </w:rPr>
+        <w:t xml:space="preserve"> (ex: &lt; R$ 13,55), </w:t>
+      </w:r>
+      <w:proofErr w:type="spellStart"/>
+      <w:r>
+        <w:rPr>
+          <w:rFonts w:ascii="Times New Roman" w:hAnsi="Times New Roman" w:cs="Times New Roman"/>
+        </w:rPr>
+        <w:t>exiba</w:t>
+      </w:r>
+      <w:proofErr w:type="spellEnd"/>
+      <w:r>
+        <w:rPr>
+          <w:rFonts w:ascii="Times New Roman" w:hAnsi="Times New Roman" w:cs="Times New Roman"/>
+        </w:rPr>
+        <w:t xml:space="preserve"> um aviso elegante (Alert do Tailwind) </w:t>
+      </w:r>
+      <w:proofErr w:type="spellStart"/>
+      <w:r>
+        <w:rPr>
+          <w:rFonts w:ascii="Times New Roman" w:hAnsi="Times New Roman" w:cs="Times New Roman"/>
+        </w:rPr>
+        <w:t>informando</w:t>
+      </w:r>
+      <w:proofErr w:type="spellEnd"/>
+      <w:r>
+        <w:rPr>
+          <w:rFonts w:ascii="Times New Roman" w:hAnsi="Times New Roman" w:cs="Times New Roman"/>
+        </w:rPr>
+        <w:t xml:space="preserve"> </w:t>
+      </w:r>
+      <w:proofErr w:type="spellStart"/>
+      <w:r>
+        <w:rPr>
+          <w:rFonts w:ascii="Times New Roman" w:hAnsi="Times New Roman" w:cs="Times New Roman"/>
+        </w:rPr>
+        <w:t>que</w:t>
+      </w:r>
+      <w:proofErr w:type="spellEnd"/>
+      <w:r>
+        <w:rPr>
+          <w:rFonts w:ascii="Times New Roman" w:hAnsi="Times New Roman" w:cs="Times New Roman"/>
+        </w:rPr>
+        <w:t xml:space="preserve"> </w:t>
+      </w:r>
+      <w:proofErr w:type="spellStart"/>
+      <w:r>
+        <w:rPr>
+          <w:rFonts w:ascii="Times New Roman" w:hAnsi="Times New Roman" w:cs="Times New Roman"/>
+        </w:rPr>
+        <w:t>o</w:t>
+      </w:r>
+      <w:proofErr w:type="spellEnd"/>
+      <w:r>
+        <w:rPr>
+          <w:rFonts w:ascii="Times New Roman" w:hAnsi="Times New Roman" w:cs="Times New Roman"/>
+        </w:rPr>
+        <w:t xml:space="preserve"> </w:t>
+      </w:r>
+      <w:proofErr w:type="spellStart"/>
+      <w:r>
+        <w:rPr>
+          <w:rFonts w:ascii="Times New Roman" w:hAnsi="Times New Roman" w:cs="Times New Roman"/>
+        </w:rPr>
+        <w:t>orçamento</w:t>
+      </w:r>
+      <w:proofErr w:type="spellEnd"/>
+      <w:r>
+        <w:rPr>
+          <w:rFonts w:ascii="Times New Roman" w:hAnsi="Times New Roman" w:cs="Times New Roman"/>
+        </w:rPr>
+        <w:t xml:space="preserve"> é </w:t>
+      </w:r>
+      <w:proofErr w:type="spellStart"/>
+      <w:r>
+        <w:rPr>
+          <w:rFonts w:ascii="Times New Roman" w:hAnsi="Times New Roman" w:cs="Times New Roman"/>
+        </w:rPr>
+        <w:t>menor</w:t>
+      </w:r>
+      <w:proofErr w:type="spellEnd"/>
+      <w:r>
+        <w:rPr>
+          <w:rFonts w:ascii="Times New Roman" w:hAnsi="Times New Roman" w:cs="Times New Roman"/>
+        </w:rPr>
+        <w:t xml:space="preserve"> </w:t>
+      </w:r>
+      <w:proofErr w:type="spellStart"/>
+      <w:r>
+        <w:rPr>
+          <w:rFonts w:ascii="Times New Roman" w:hAnsi="Times New Roman" w:cs="Times New Roman"/>
+        </w:rPr>
+        <w:t>que</w:t>
+      </w:r>
+      <w:proofErr w:type="spellEnd"/>
+      <w:r>
+        <w:rPr>
+          <w:rFonts w:ascii="Times New Roman" w:hAnsi="Times New Roman" w:cs="Times New Roman"/>
+        </w:rPr>
+        <w:t xml:space="preserve"> </w:t>
+      </w:r>
+      <w:proofErr w:type="spellStart"/>
+      <w:r>
+        <w:rPr>
+          <w:rFonts w:ascii="Times New Roman" w:hAnsi="Times New Roman" w:cs="Times New Roman"/>
+        </w:rPr>
+        <w:t>o</w:t>
+      </w:r>
+      <w:proofErr w:type="spellEnd"/>
+      <w:r>
+        <w:rPr>
+          <w:rFonts w:ascii="Times New Roman" w:hAnsi="Times New Roman" w:cs="Times New Roman"/>
+        </w:rPr>
+        <w:t xml:space="preserve"> </w:t>
+      </w:r>
+      <w:proofErr w:type="spellStart"/>
+      <w:r>
+        <w:rPr>
+          <w:rFonts w:ascii="Times New Roman" w:hAnsi="Times New Roman" w:cs="Times New Roman"/>
+        </w:rPr>
+        <w:t>custo</w:t>
+      </w:r>
+      <w:proofErr w:type="spellEnd"/>
+      <w:r>
+        <w:rPr>
+          <w:rFonts w:ascii="Times New Roman" w:hAnsi="Times New Roman" w:cs="Times New Roman"/>
+        </w:rPr>
+        <w:t xml:space="preserve"> </w:t>
+      </w:r>
+      <w:proofErr w:type="spellStart"/>
+      <w:r>
+        <w:rPr>
+          <w:rFonts w:ascii="Times New Roman" w:hAnsi="Times New Roman" w:cs="Times New Roman"/>
+        </w:rPr>
+        <w:t>mínimo</w:t>
+      </w:r>
+      <w:proofErr w:type="spellEnd"/>
+      <w:r>
+        <w:rPr>
+          <w:rFonts w:ascii="Times New Roman" w:hAnsi="Times New Roman" w:cs="Times New Roman"/>
+        </w:rPr>
+        <w:t xml:space="preserve"> </w:t>
+      </w:r>
+      <w:proofErr w:type="spellStart"/>
+      <w:r>
+        <w:rPr>
+          <w:rFonts w:ascii="Times New Roman" w:hAnsi="Times New Roman" w:cs="Times New Roman"/>
+        </w:rPr>
+        <w:t>disponível</w:t>
+      </w:r>
+      <w:proofErr w:type="spellEnd"/>
+      <w:r>
+        <w:rPr>
+          <w:rFonts w:ascii="Times New Roman" w:hAnsi="Times New Roman" w:cs="Times New Roman"/>
+        </w:rPr>
+        <w:t xml:space="preserve"> e </w:t>
+      </w:r>
+      <w:proofErr w:type="spellStart"/>
+      <w:r>
+        <w:rPr>
+          <w:rFonts w:ascii="Times New Roman" w:hAnsi="Times New Roman" w:cs="Times New Roman"/>
+        </w:rPr>
+        <w:t>aplique</w:t>
+      </w:r>
+      <w:proofErr w:type="spellEnd"/>
+      <w:r>
+        <w:rPr>
+          <w:rFonts w:ascii="Times New Roman" w:hAnsi="Times New Roman" w:cs="Times New Roman"/>
+        </w:rPr>
+        <w:t xml:space="preserve"> o </w:t>
+      </w:r>
+      <w:proofErr w:type="spellStart"/>
+      <w:r>
+        <w:rPr>
+          <w:rFonts w:ascii="Times New Roman" w:hAnsi="Times New Roman" w:cs="Times New Roman"/>
+        </w:rPr>
+        <w:t>cardápio</w:t>
+      </w:r>
+      <w:proofErr w:type="spellEnd"/>
+      <w:r>
+        <w:rPr>
+          <w:rFonts w:ascii="Times New Roman" w:hAnsi="Times New Roman" w:cs="Times New Roman"/>
+        </w:rPr>
+        <w:t xml:space="preserve"> de R$ 13,55 </w:t>
+      </w:r>
+      <w:proofErr w:type="spellStart"/>
+      <w:r>
+        <w:rPr>
+          <w:rFonts w:ascii="Times New Roman" w:hAnsi="Times New Roman" w:cs="Times New Roman"/>
+        </w:rPr>
+        <w:t>como</w:t>
+      </w:r>
+      <w:proofErr w:type="spellEnd"/>
+      <w:r>
+        <w:rPr>
+          <w:rFonts w:ascii="Times New Roman" w:hAnsi="Times New Roman" w:cs="Times New Roman"/>
+        </w:rPr>
+        <w:t xml:space="preserve"> fallback de </w:t>
+      </w:r>
+      <w:proofErr w:type="spellStart"/>
+      <w:r>
+        <w:rPr>
+          <w:rFonts w:ascii="Times New Roman" w:hAnsi="Times New Roman" w:cs="Times New Roman"/>
+        </w:rPr>
+        <w:t>segurança</w:t>
+      </w:r>
+      <w:proofErr w:type="spellEnd"/>
+      <w:r>
+        <w:rPr>
+          <w:rFonts w:ascii="Times New Roman" w:hAnsi="Times New Roman" w:cs="Times New Roman"/>
+        </w:rPr>
+        <w:t>.</w:t>
+      </w:r>
+    </w:p>
+    <w:p>
+      <w:pPr>
+        <w:spacing w:after="120"/>
+        <w:ind w:left="360"/>
+        <w:jc w:val="both"/>
+        <w:rPr>
+          <w:rFonts w:ascii="Times New Roman" w:hAnsi="Times New Roman" w:cs="Times New Roman"/>
+        </w:rPr>
+      </w:pPr>
+      <w:r>
+        <w:rPr>
+          <w:rFonts w:ascii="Times New Roman" w:hAnsi="Times New Roman" w:cs="Times New Roman"/>
+        </w:rPr>
+        <w:t xml:space="preserve">  * Se </w:t>
+      </w:r>
+      <w:proofErr w:type="spellStart"/>
+      <w:r>
+        <w:rPr>
+          <w:rFonts w:ascii="Times New Roman" w:hAnsi="Times New Roman" w:cs="Times New Roman"/>
+        </w:rPr>
+        <w:t>houver</w:t>
+      </w:r>
+      <w:proofErr w:type="spellEnd"/>
+      <w:r>
+        <w:rPr>
+          <w:rFonts w:ascii="Times New Roman" w:hAnsi="Times New Roman" w:cs="Times New Roman"/>
+        </w:rPr>
+        <w:t xml:space="preserve"> </w:t>
+      </w:r>
+      <w:proofErr w:type="spellStart"/>
+      <w:r>
+        <w:rPr>
+          <w:rFonts w:ascii="Times New Roman" w:hAnsi="Times New Roman" w:cs="Times New Roman"/>
+        </w:rPr>
+        <w:t>cardápios</w:t>
+      </w:r>
+      <w:proofErr w:type="spellEnd"/>
+      <w:r>
+        <w:rPr>
+          <w:rFonts w:ascii="Times New Roman" w:hAnsi="Times New Roman" w:cs="Times New Roman"/>
+        </w:rPr>
+        <w:t xml:space="preserve"> </w:t>
+      </w:r>
+      <w:proofErr w:type="spellStart"/>
+      <w:r>
+        <w:rPr>
+          <w:rFonts w:ascii="Times New Roman" w:hAnsi="Times New Roman" w:cs="Times New Roman"/>
+        </w:rPr>
+        <w:t>elegíveis</w:t>
+      </w:r>
+      <w:proofErr w:type="spellEnd"/>
+      <w:r>
+        <w:rPr>
+          <w:rFonts w:ascii="Times New Roman" w:hAnsi="Times New Roman" w:cs="Times New Roman"/>
+        </w:rPr>
+        <w:t xml:space="preserve">, </w:t>
+      </w:r>
+      <w:proofErr w:type="spellStart"/>
+      <w:r>
+        <w:rPr>
+          <w:rFonts w:ascii="Times New Roman" w:hAnsi="Times New Roman" w:cs="Times New Roman"/>
+        </w:rPr>
+        <w:t>gere</w:t>
+      </w:r>
+      <w:proofErr w:type="spellEnd"/>
+      <w:r>
+        <w:rPr>
+          <w:rFonts w:ascii="Times New Roman" w:hAnsi="Times New Roman" w:cs="Times New Roman"/>
+        </w:rPr>
+        <w:t xml:space="preserve"> o plano para </w:t>
+      </w:r>
+      <w:proofErr w:type="spellStart"/>
+      <w:r>
+        <w:rPr>
+          <w:rFonts w:ascii="Times New Roman" w:hAnsi="Times New Roman" w:cs="Times New Roman"/>
+        </w:rPr>
+        <w:t>os</w:t>
+      </w:r>
+      <w:proofErr w:type="spellEnd"/>
+      <w:r>
+        <w:rPr>
+          <w:rFonts w:ascii="Times New Roman" w:hAnsi="Times New Roman" w:cs="Times New Roman"/>
+        </w:rPr>
+        <w:t xml:space="preserve"> N </w:t>
+      </w:r>
+      <w:proofErr w:type="spellStart"/>
+      <w:r>
+        <w:rPr>
+          <w:rFonts w:ascii="Times New Roman" w:hAnsi="Times New Roman" w:cs="Times New Roman"/>
+        </w:rPr>
+        <w:t>dias</w:t>
+      </w:r>
+      <w:proofErr w:type="spellEnd"/>
+      <w:r>
+        <w:rPr>
+          <w:rFonts w:ascii="Times New Roman" w:hAnsi="Times New Roman" w:cs="Times New Roman"/>
+        </w:rPr>
+        <w:t xml:space="preserve"> </w:t>
+      </w:r>
+      <w:proofErr w:type="spellStart"/>
+      <w:r>
+        <w:rPr>
+          <w:rFonts w:ascii="Times New Roman" w:hAnsi="Times New Roman" w:cs="Times New Roman"/>
+        </w:rPr>
+        <w:t>selecionados</w:t>
+      </w:r>
+      <w:proofErr w:type="spellEnd"/>
+      <w:r>
+        <w:rPr>
+          <w:rFonts w:ascii="Times New Roman" w:hAnsi="Times New Roman" w:cs="Times New Roman"/>
+        </w:rPr>
+        <w:t xml:space="preserve">. Para </w:t>
+      </w:r>
+      <w:proofErr w:type="spellStart"/>
+      <w:r>
+        <w:rPr>
+          <w:rFonts w:ascii="Times New Roman" w:hAnsi="Times New Roman" w:cs="Times New Roman"/>
+        </w:rPr>
+        <w:t>criar</w:t>
+      </w:r>
+      <w:proofErr w:type="spellEnd"/>
+      <w:r>
+        <w:rPr>
+          <w:rFonts w:ascii="Times New Roman" w:hAnsi="Times New Roman" w:cs="Times New Roman"/>
+        </w:rPr>
+        <w:t xml:space="preserve"> </w:t>
+      </w:r>
+      <w:proofErr w:type="spellStart"/>
+      <w:r>
+        <w:rPr>
+          <w:rFonts w:ascii="Times New Roman" w:hAnsi="Times New Roman" w:cs="Times New Roman"/>
+        </w:rPr>
+        <w:t>variação</w:t>
+      </w:r>
+      <w:proofErr w:type="spellEnd"/>
+      <w:r>
+        <w:rPr>
+          <w:rFonts w:ascii="Times New Roman" w:hAnsi="Times New Roman" w:cs="Times New Roman"/>
+        </w:rPr>
+        <w:t xml:space="preserve"> </w:t>
+      </w:r>
+      <w:proofErr w:type="spellStart"/>
+      <w:r>
+        <w:rPr>
+          <w:rFonts w:ascii="Times New Roman" w:hAnsi="Times New Roman" w:cs="Times New Roman"/>
+        </w:rPr>
+        <w:t>saudável</w:t>
+      </w:r>
+      <w:proofErr w:type="spellEnd"/>
+      <w:r>
+        <w:rPr>
+          <w:rFonts w:ascii="Times New Roman" w:hAnsi="Times New Roman" w:cs="Times New Roman"/>
+        </w:rPr>
+        <w:t xml:space="preserve"> de um </w:t>
+      </w:r>
+      <w:proofErr w:type="spellStart"/>
+      <w:r>
+        <w:rPr>
+          <w:rFonts w:ascii="Times New Roman" w:hAnsi="Times New Roman" w:cs="Times New Roman"/>
+        </w:rPr>
+        <w:t>dia</w:t>
+      </w:r>
+      <w:proofErr w:type="spellEnd"/>
+      <w:r>
+        <w:rPr>
+          <w:rFonts w:ascii="Times New Roman" w:hAnsi="Times New Roman" w:cs="Times New Roman"/>
+        </w:rPr>
+        <w:t xml:space="preserve"> para outro, o </w:t>
+      </w:r>
+      <w:proofErr w:type="spellStart"/>
+      <w:r>
+        <w:rPr>
+          <w:rFonts w:ascii="Times New Roman" w:hAnsi="Times New Roman" w:cs="Times New Roman"/>
+        </w:rPr>
+        <w:t>algoritmo</w:t>
+      </w:r>
+      <w:proofErr w:type="spellEnd"/>
+      <w:r>
+        <w:rPr>
+          <w:rFonts w:ascii="Times New Roman" w:hAnsi="Times New Roman" w:cs="Times New Roman"/>
+        </w:rPr>
+        <w:t xml:space="preserve"> </w:t>
+      </w:r>
+      <w:proofErr w:type="spellStart"/>
+      <w:r>
+        <w:rPr>
+          <w:rFonts w:ascii="Times New Roman" w:hAnsi="Times New Roman" w:cs="Times New Roman"/>
+        </w:rPr>
+        <w:t>deve</w:t>
+      </w:r>
+      <w:proofErr w:type="spellEnd"/>
+      <w:r>
+        <w:rPr>
+          <w:rFonts w:ascii="Times New Roman" w:hAnsi="Times New Roman" w:cs="Times New Roman"/>
+        </w:rPr>
+        <w:t xml:space="preserve"> </w:t>
+      </w:r>
+      <w:proofErr w:type="spellStart"/>
+      <w:r>
+        <w:rPr>
+          <w:rFonts w:ascii="Times New Roman" w:hAnsi="Times New Roman" w:cs="Times New Roman"/>
+        </w:rPr>
+        <w:t>rotacionar</w:t>
+      </w:r>
+      <w:proofErr w:type="spellEnd"/>
+      <w:r>
+        <w:rPr>
+          <w:rFonts w:ascii="Times New Roman" w:hAnsi="Times New Roman" w:cs="Times New Roman"/>
+        </w:rPr>
+        <w:t xml:space="preserve"> </w:t>
+      </w:r>
+      <w:proofErr w:type="spellStart"/>
+      <w:r>
+        <w:rPr>
+          <w:rFonts w:ascii="Times New Roman" w:hAnsi="Times New Roman" w:cs="Times New Roman"/>
+        </w:rPr>
+        <w:t>ciclicamente</w:t>
+      </w:r>
+      <w:proofErr w:type="spellEnd"/>
+      <w:r>
+        <w:rPr>
+          <w:rFonts w:ascii="Times New Roman" w:hAnsi="Times New Roman" w:cs="Times New Roman"/>
+        </w:rPr>
+        <w:t xml:space="preserve"> entre as </w:t>
+      </w:r>
+      <w:proofErr w:type="spellStart"/>
+      <w:r>
+        <w:rPr>
+          <w:rFonts w:ascii="Times New Roman" w:hAnsi="Times New Roman" w:cs="Times New Roman"/>
+        </w:rPr>
+        <w:t>opções</w:t>
+      </w:r>
+      <w:proofErr w:type="spellEnd"/>
+      <w:r>
+        <w:rPr>
+          <w:rFonts w:ascii="Times New Roman" w:hAnsi="Times New Roman" w:cs="Times New Roman"/>
+        </w:rPr>
+        <w:t xml:space="preserve"> </w:t>
+      </w:r>
+      <w:proofErr w:type="spellStart"/>
+      <w:r>
+        <w:rPr>
+          <w:rFonts w:ascii="Times New Roman" w:hAnsi="Times New Roman" w:cs="Times New Roman"/>
+        </w:rPr>
+        <w:t>qualificadas</w:t>
+      </w:r>
+      <w:proofErr w:type="spellEnd"/>
+      <w:r>
+        <w:rPr>
+          <w:rFonts w:ascii="Times New Roman" w:hAnsi="Times New Roman" w:cs="Times New Roman"/>
+        </w:rPr>
+        <w:t xml:space="preserve"> para </w:t>
+      </w:r>
+      <w:proofErr w:type="spellStart"/>
+      <w:r>
+        <w:rPr>
+          <w:rFonts w:ascii="Times New Roman" w:hAnsi="Times New Roman" w:cs="Times New Roman"/>
+        </w:rPr>
+        <w:t>cada</w:t>
+      </w:r>
+      <w:proofErr w:type="spellEnd"/>
+      <w:r>
+        <w:rPr>
+          <w:rFonts w:ascii="Times New Roman" w:hAnsi="Times New Roman" w:cs="Times New Roman"/>
+        </w:rPr>
+        <w:t xml:space="preserve"> </w:t>
+      </w:r>
+      <w:proofErr w:type="spellStart"/>
+      <w:r>
+        <w:rPr>
+          <w:rFonts w:ascii="Times New Roman" w:hAnsi="Times New Roman" w:cs="Times New Roman"/>
+        </w:rPr>
+        <w:t>dia</w:t>
+      </w:r>
+      <w:proofErr w:type="spellEnd"/>
+      <w:r>
+        <w:rPr>
+          <w:rFonts w:ascii="Times New Roman" w:hAnsi="Times New Roman" w:cs="Times New Roman"/>
+        </w:rPr>
+        <w:t xml:space="preserve"> do plano (ex: Dia 1 </w:t>
+      </w:r>
+      <w:proofErr w:type="spellStart"/>
+      <w:r>
+        <w:rPr>
+          <w:rFonts w:ascii="Times New Roman" w:hAnsi="Times New Roman" w:cs="Times New Roman"/>
+        </w:rPr>
+        <w:t>usa</w:t>
+      </w:r>
+      <w:proofErr w:type="spellEnd"/>
+      <w:r>
+        <w:rPr>
+          <w:rFonts w:ascii="Times New Roman" w:hAnsi="Times New Roman" w:cs="Times New Roman"/>
+        </w:rPr>
+        <w:t xml:space="preserve"> </w:t>
+      </w:r>
+      <w:proofErr w:type="gramStart"/>
+      <w:r>
+        <w:rPr>
+          <w:rFonts w:ascii="Times New Roman" w:hAnsi="Times New Roman" w:cs="Times New Roman"/>
+        </w:rPr>
+        <w:t>a</w:t>
+      </w:r>
+      <w:proofErr w:type="gramEnd"/>
+      <w:r>
+        <w:rPr>
+          <w:rFonts w:ascii="Times New Roman" w:hAnsi="Times New Roman" w:cs="Times New Roman"/>
+        </w:rPr>
+        <w:t xml:space="preserve"> </w:t>
+      </w:r>
+      <w:proofErr w:type="spellStart"/>
+      <w:r>
+        <w:rPr>
+          <w:rFonts w:ascii="Times New Roman" w:hAnsi="Times New Roman" w:cs="Times New Roman"/>
+        </w:rPr>
+        <w:t>opção</w:t>
+      </w:r>
+      <w:proofErr w:type="spellEnd"/>
+      <w:r>
+        <w:rPr>
+          <w:rFonts w:ascii="Times New Roman" w:hAnsi="Times New Roman" w:cs="Times New Roman"/>
+        </w:rPr>
+        <w:t xml:space="preserve"> A, Dia 2 </w:t>
+      </w:r>
+      <w:proofErr w:type="spellStart"/>
+      <w:r>
+        <w:rPr>
+          <w:rFonts w:ascii="Times New Roman" w:hAnsi="Times New Roman" w:cs="Times New Roman"/>
+        </w:rPr>
+        <w:t>usa</w:t>
+      </w:r>
+      <w:proofErr w:type="spellEnd"/>
+      <w:r>
+        <w:rPr>
+          <w:rFonts w:ascii="Times New Roman" w:hAnsi="Times New Roman" w:cs="Times New Roman"/>
+        </w:rPr>
+        <w:t xml:space="preserve"> </w:t>
+      </w:r>
+      <w:proofErr w:type="gramStart"/>
+      <w:r>
+        <w:rPr>
+          <w:rFonts w:ascii="Times New Roman" w:hAnsi="Times New Roman" w:cs="Times New Roman"/>
+        </w:rPr>
+        <w:t>a</w:t>
+      </w:r>
+      <w:proofErr w:type="gramEnd"/>
+      <w:r>
+        <w:rPr>
+          <w:rFonts w:ascii="Times New Roman" w:hAnsi="Times New Roman" w:cs="Times New Roman"/>
+        </w:rPr>
+        <w:t xml:space="preserve"> </w:t>
+      </w:r>
+      <w:proofErr w:type="spellStart"/>
+      <w:r>
+        <w:rPr>
+          <w:rFonts w:ascii="Times New Roman" w:hAnsi="Times New Roman" w:cs="Times New Roman"/>
+        </w:rPr>
+        <w:t>opção</w:t>
+      </w:r>
+      <w:proofErr w:type="spellEnd"/>
+      <w:r>
+        <w:rPr>
+          <w:rFonts w:ascii="Times New Roman" w:hAnsi="Times New Roman" w:cs="Times New Roman"/>
+        </w:rPr>
+        <w:t xml:space="preserve"> B, Dia 3 </w:t>
+      </w:r>
+      <w:proofErr w:type="spellStart"/>
+      <w:r>
+        <w:rPr>
+          <w:rFonts w:ascii="Times New Roman" w:hAnsi="Times New Roman" w:cs="Times New Roman"/>
+        </w:rPr>
+        <w:t>usa</w:t>
+      </w:r>
+      <w:proofErr w:type="spellEnd"/>
+      <w:r>
+        <w:rPr>
+          <w:rFonts w:ascii="Times New Roman" w:hAnsi="Times New Roman" w:cs="Times New Roman"/>
+        </w:rPr>
+        <w:t xml:space="preserve"> </w:t>
+      </w:r>
+      <w:proofErr w:type="gramStart"/>
+      <w:r>
+        <w:rPr>
+          <w:rFonts w:ascii="Times New Roman" w:hAnsi="Times New Roman" w:cs="Times New Roman"/>
+        </w:rPr>
+        <w:t>a</w:t>
+      </w:r>
+      <w:proofErr w:type="gramEnd"/>
+      <w:r>
+        <w:rPr>
+          <w:rFonts w:ascii="Times New Roman" w:hAnsi="Times New Roman" w:cs="Times New Roman"/>
+        </w:rPr>
+        <w:t xml:space="preserve"> </w:t>
+      </w:r>
+      <w:proofErr w:type="spellStart"/>
+      <w:r>
+        <w:rPr>
+          <w:rFonts w:ascii="Times New Roman" w:hAnsi="Times New Roman" w:cs="Times New Roman"/>
+        </w:rPr>
+        <w:t>opção</w:t>
+      </w:r>
+      <w:proofErr w:type="spellEnd"/>
+      <w:r>
+        <w:rPr>
+          <w:rFonts w:ascii="Times New Roman" w:hAnsi="Times New Roman" w:cs="Times New Roman"/>
+        </w:rPr>
+        <w:t xml:space="preserve"> C, etc.).</w:t>
+      </w:r>
+    </w:p>
+    <w:p>
+      <w:pPr>
+        <w:spacing w:after="120"/>
+        <w:ind w:left="360"/>
+        <w:jc w:val="both"/>
+        <w:rPr>
+          <w:rFonts w:ascii="Times New Roman" w:hAnsi="Times New Roman" w:cs="Times New Roman"/>
+        </w:rPr>
+      </w:pPr>
+    </w:p>
+    <w:p>
+      <w:pPr>
+        <w:rPr>
+          <w:rFonts w:ascii="Times New Roman" w:hAnsi="Times New Roman" w:cs="Times New Roman"/>
+          <w:b/>
+          <w:bCs/>
+        </w:rPr>
+      </w:pPr>
+      <w:r>
+        <w:rPr>
+          <w:rFonts w:ascii="Times New Roman" w:hAnsi="Times New Roman" w:cs="Times New Roman"/>
+          <w:b/>
+          <w:bCs/>
+        </w:rPr>
+        <w:br w:type="page"/>
+      </w:r>
+    </w:p>
+    <w:p>
+      <w:pPr>
+        <w:spacing w:after="120"/>
+        <w:ind w:left="360"/>
+        <w:jc w:val="both"/>
+        <w:rPr>
+          <w:rFonts w:ascii="Times New Roman" w:hAnsi="Times New Roman" w:cs="Times New Roman"/>
+          <w:b/>
+          <w:bCs/>
+        </w:rPr>
+      </w:pPr>
+      <w:r>
+        <w:rPr>
+          <w:rFonts w:ascii="Times New Roman" w:hAnsi="Times New Roman" w:cs="Times New Roman"/>
+          <w:b/>
+          <w:bCs/>
+        </w:rPr>
+        <w:lastRenderedPageBreak/>
+        <w:t>3. INTERFACE DE ABAS E EXIBIÇÃO DE CARDÁPIO:</w:t>
+      </w:r>
+    </w:p>
+    <w:p>
+      <w:pPr>
+        <w:spacing w:after="120"/>
+        <w:ind w:left="360"/>
+        <w:jc w:val="both"/>
+        <w:rPr>
+          <w:rFonts w:ascii="Times New Roman" w:hAnsi="Times New Roman" w:cs="Times New Roman"/>
+        </w:rPr>
+      </w:pPr>
+      <w:r>
+        <w:rPr>
+          <w:rFonts w:ascii="Times New Roman" w:hAnsi="Times New Roman" w:cs="Times New Roman"/>
+        </w:rPr>
+        <w:t xml:space="preserve">- Caso o plano </w:t>
+      </w:r>
+      <w:proofErr w:type="spellStart"/>
+      <w:r>
+        <w:rPr>
+          <w:rFonts w:ascii="Times New Roman" w:hAnsi="Times New Roman" w:cs="Times New Roman"/>
+        </w:rPr>
+        <w:t>gerado</w:t>
+      </w:r>
+      <w:proofErr w:type="spellEnd"/>
+      <w:r>
+        <w:rPr>
+          <w:rFonts w:ascii="Times New Roman" w:hAnsi="Times New Roman" w:cs="Times New Roman"/>
+        </w:rPr>
+        <w:t xml:space="preserve"> </w:t>
+      </w:r>
+      <w:proofErr w:type="spellStart"/>
+      <w:r>
+        <w:rPr>
+          <w:rFonts w:ascii="Times New Roman" w:hAnsi="Times New Roman" w:cs="Times New Roman"/>
+        </w:rPr>
+        <w:t>tenha</w:t>
+      </w:r>
+      <w:proofErr w:type="spellEnd"/>
+      <w:r>
+        <w:rPr>
+          <w:rFonts w:ascii="Times New Roman" w:hAnsi="Times New Roman" w:cs="Times New Roman"/>
+        </w:rPr>
+        <w:t xml:space="preserve"> </w:t>
+      </w:r>
+      <w:proofErr w:type="spellStart"/>
+      <w:r>
+        <w:rPr>
+          <w:rFonts w:ascii="Times New Roman" w:hAnsi="Times New Roman" w:cs="Times New Roman"/>
+        </w:rPr>
+        <w:t>mais</w:t>
+      </w:r>
+      <w:proofErr w:type="spellEnd"/>
+      <w:r>
+        <w:rPr>
+          <w:rFonts w:ascii="Times New Roman" w:hAnsi="Times New Roman" w:cs="Times New Roman"/>
+        </w:rPr>
+        <w:t xml:space="preserve"> de 1 </w:t>
+      </w:r>
+      <w:proofErr w:type="spellStart"/>
+      <w:r>
+        <w:rPr>
+          <w:rFonts w:ascii="Times New Roman" w:hAnsi="Times New Roman" w:cs="Times New Roman"/>
+        </w:rPr>
+        <w:t>dia</w:t>
+      </w:r>
+      <w:proofErr w:type="spellEnd"/>
+      <w:r>
+        <w:rPr>
+          <w:rFonts w:ascii="Times New Roman" w:hAnsi="Times New Roman" w:cs="Times New Roman"/>
+        </w:rPr>
+        <w:t xml:space="preserve">, </w:t>
+      </w:r>
+      <w:proofErr w:type="spellStart"/>
+      <w:r>
+        <w:rPr>
+          <w:rFonts w:ascii="Times New Roman" w:hAnsi="Times New Roman" w:cs="Times New Roman"/>
+        </w:rPr>
+        <w:t>exiba</w:t>
+      </w:r>
+      <w:proofErr w:type="spellEnd"/>
+      <w:r>
+        <w:rPr>
+          <w:rFonts w:ascii="Times New Roman" w:hAnsi="Times New Roman" w:cs="Times New Roman"/>
+        </w:rPr>
+        <w:t xml:space="preserve"> </w:t>
+      </w:r>
+      <w:proofErr w:type="spellStart"/>
+      <w:r>
+        <w:rPr>
+          <w:rFonts w:ascii="Times New Roman" w:hAnsi="Times New Roman" w:cs="Times New Roman"/>
+        </w:rPr>
+        <w:t>uma</w:t>
+      </w:r>
+      <w:proofErr w:type="spellEnd"/>
+      <w:r>
+        <w:rPr>
+          <w:rFonts w:ascii="Times New Roman" w:hAnsi="Times New Roman" w:cs="Times New Roman"/>
+        </w:rPr>
+        <w:t xml:space="preserve"> barra de abas premium (</w:t>
+      </w:r>
+      <w:proofErr w:type="spellStart"/>
+      <w:r>
+        <w:rPr>
+          <w:rFonts w:ascii="Times New Roman" w:hAnsi="Times New Roman" w:cs="Times New Roman"/>
+        </w:rPr>
+        <w:t>estilo</w:t>
+      </w:r>
+      <w:proofErr w:type="spellEnd"/>
+      <w:r>
+        <w:rPr>
+          <w:rFonts w:ascii="Times New Roman" w:hAnsi="Times New Roman" w:cs="Times New Roman"/>
+        </w:rPr>
+        <w:t xml:space="preserve"> </w:t>
+      </w:r>
+      <w:proofErr w:type="spellStart"/>
+      <w:r>
+        <w:rPr>
+          <w:rFonts w:ascii="Times New Roman" w:hAnsi="Times New Roman" w:cs="Times New Roman"/>
+        </w:rPr>
+        <w:t>pílulas</w:t>
+      </w:r>
+      <w:proofErr w:type="spellEnd"/>
+      <w:r>
+        <w:rPr>
+          <w:rFonts w:ascii="Times New Roman" w:hAnsi="Times New Roman" w:cs="Times New Roman"/>
+        </w:rPr>
+        <w:t xml:space="preserve">) no topo para </w:t>
+      </w:r>
+      <w:proofErr w:type="spellStart"/>
+      <w:r>
+        <w:rPr>
+          <w:rFonts w:ascii="Times New Roman" w:hAnsi="Times New Roman" w:cs="Times New Roman"/>
+        </w:rPr>
+        <w:t>alternar</w:t>
+      </w:r>
+      <w:proofErr w:type="spellEnd"/>
+      <w:r>
+        <w:rPr>
+          <w:rFonts w:ascii="Times New Roman" w:hAnsi="Times New Roman" w:cs="Times New Roman"/>
+        </w:rPr>
+        <w:t xml:space="preserve"> entre "Dia 1", "Dia 2", etc., </w:t>
+      </w:r>
+      <w:proofErr w:type="spellStart"/>
+      <w:r>
+        <w:rPr>
+          <w:rFonts w:ascii="Times New Roman" w:hAnsi="Times New Roman" w:cs="Times New Roman"/>
+        </w:rPr>
+        <w:t>exibindo</w:t>
+      </w:r>
+      <w:proofErr w:type="spellEnd"/>
+      <w:r>
+        <w:rPr>
+          <w:rFonts w:ascii="Times New Roman" w:hAnsi="Times New Roman" w:cs="Times New Roman"/>
+        </w:rPr>
+        <w:t xml:space="preserve"> a data de forma </w:t>
+      </w:r>
+      <w:proofErr w:type="spellStart"/>
+      <w:r>
+        <w:rPr>
+          <w:rFonts w:ascii="Times New Roman" w:hAnsi="Times New Roman" w:cs="Times New Roman"/>
+        </w:rPr>
+        <w:t>amigável</w:t>
+      </w:r>
+      <w:proofErr w:type="spellEnd"/>
+      <w:r>
+        <w:rPr>
+          <w:rFonts w:ascii="Times New Roman" w:hAnsi="Times New Roman" w:cs="Times New Roman"/>
+        </w:rPr>
+        <w:t xml:space="preserve"> (dd/MM).</w:t>
+      </w:r>
+    </w:p>
+    <w:p>
+      <w:pPr>
+        <w:spacing w:after="120"/>
+        <w:ind w:left="360"/>
+        <w:jc w:val="both"/>
+        <w:rPr>
+          <w:rFonts w:ascii="Times New Roman" w:hAnsi="Times New Roman" w:cs="Times New Roman"/>
+        </w:rPr>
+      </w:pPr>
+      <w:r>
+        <w:rPr>
+          <w:rFonts w:ascii="Times New Roman" w:hAnsi="Times New Roman" w:cs="Times New Roman"/>
+        </w:rPr>
+        <w:t xml:space="preserve">- </w:t>
+      </w:r>
+      <w:proofErr w:type="spellStart"/>
+      <w:r>
+        <w:rPr>
+          <w:rFonts w:ascii="Times New Roman" w:hAnsi="Times New Roman" w:cs="Times New Roman"/>
+        </w:rPr>
+        <w:t>Exiba</w:t>
+      </w:r>
+      <w:proofErr w:type="spellEnd"/>
+      <w:r>
+        <w:rPr>
+          <w:rFonts w:ascii="Times New Roman" w:hAnsi="Times New Roman" w:cs="Times New Roman"/>
+        </w:rPr>
+        <w:t xml:space="preserve"> no topo 3 cards de </w:t>
+      </w:r>
+      <w:proofErr w:type="spellStart"/>
+      <w:r>
+        <w:rPr>
+          <w:rFonts w:ascii="Times New Roman" w:hAnsi="Times New Roman" w:cs="Times New Roman"/>
+        </w:rPr>
+        <w:t>estatísticas</w:t>
+      </w:r>
+      <w:proofErr w:type="spellEnd"/>
+      <w:r>
+        <w:rPr>
+          <w:rFonts w:ascii="Times New Roman" w:hAnsi="Times New Roman" w:cs="Times New Roman"/>
+        </w:rPr>
+        <w:t xml:space="preserve"> (</w:t>
+      </w:r>
+      <w:proofErr w:type="spellStart"/>
+      <w:r>
+        <w:rPr>
+          <w:rFonts w:ascii="Times New Roman" w:hAnsi="Times New Roman" w:cs="Times New Roman"/>
+        </w:rPr>
+        <w:t>StatCard</w:t>
+      </w:r>
+      <w:proofErr w:type="spellEnd"/>
+      <w:r>
+        <w:rPr>
+          <w:rFonts w:ascii="Times New Roman" w:hAnsi="Times New Roman" w:cs="Times New Roman"/>
+        </w:rPr>
+        <w:t xml:space="preserve">) para o </w:t>
+      </w:r>
+      <w:proofErr w:type="spellStart"/>
+      <w:r>
+        <w:rPr>
+          <w:rFonts w:ascii="Times New Roman" w:hAnsi="Times New Roman" w:cs="Times New Roman"/>
+        </w:rPr>
+        <w:t>dia</w:t>
+      </w:r>
+      <w:proofErr w:type="spellEnd"/>
+      <w:r>
+        <w:rPr>
+          <w:rFonts w:ascii="Times New Roman" w:hAnsi="Times New Roman" w:cs="Times New Roman"/>
+        </w:rPr>
+        <w:t xml:space="preserve"> </w:t>
+      </w:r>
+      <w:proofErr w:type="spellStart"/>
+      <w:r>
+        <w:rPr>
+          <w:rFonts w:ascii="Times New Roman" w:hAnsi="Times New Roman" w:cs="Times New Roman"/>
+        </w:rPr>
+        <w:t>selecionado</w:t>
+      </w:r>
+      <w:proofErr w:type="spellEnd"/>
+      <w:r>
+        <w:rPr>
+          <w:rFonts w:ascii="Times New Roman" w:hAnsi="Times New Roman" w:cs="Times New Roman"/>
+        </w:rPr>
+        <w:t>: "</w:t>
+      </w:r>
+      <w:proofErr w:type="spellStart"/>
+      <w:r>
+        <w:rPr>
+          <w:rFonts w:ascii="Times New Roman" w:hAnsi="Times New Roman" w:cs="Times New Roman"/>
+        </w:rPr>
+        <w:t>Custo</w:t>
+      </w:r>
+      <w:proofErr w:type="spellEnd"/>
+      <w:r>
+        <w:rPr>
+          <w:rFonts w:ascii="Times New Roman" w:hAnsi="Times New Roman" w:cs="Times New Roman"/>
+        </w:rPr>
+        <w:t xml:space="preserve"> do Dia (R$)", "</w:t>
+      </w:r>
+      <w:proofErr w:type="spellStart"/>
+      <w:r>
+        <w:rPr>
+          <w:rFonts w:ascii="Times New Roman" w:hAnsi="Times New Roman" w:cs="Times New Roman"/>
+        </w:rPr>
+        <w:t>Calorias</w:t>
+      </w:r>
+      <w:proofErr w:type="spellEnd"/>
+      <w:r>
+        <w:rPr>
+          <w:rFonts w:ascii="Times New Roman" w:hAnsi="Times New Roman" w:cs="Times New Roman"/>
+        </w:rPr>
+        <w:t xml:space="preserve"> do Dia (kcal)" e "</w:t>
+      </w:r>
+      <w:proofErr w:type="spellStart"/>
+      <w:r>
+        <w:rPr>
+          <w:rFonts w:ascii="Times New Roman" w:hAnsi="Times New Roman" w:cs="Times New Roman"/>
+        </w:rPr>
+        <w:t>Carboidratos</w:t>
+      </w:r>
+      <w:proofErr w:type="spellEnd"/>
+      <w:r>
+        <w:rPr>
+          <w:rFonts w:ascii="Times New Roman" w:hAnsi="Times New Roman" w:cs="Times New Roman"/>
+        </w:rPr>
+        <w:t xml:space="preserve"> do Dia (g)".</w:t>
+      </w:r>
+    </w:p>
+    <w:p>
+      <w:pPr>
+        <w:spacing w:after="120"/>
+        <w:ind w:left="360"/>
+        <w:jc w:val="both"/>
+        <w:rPr>
+          <w:rFonts w:ascii="Times New Roman" w:hAnsi="Times New Roman" w:cs="Times New Roman"/>
+        </w:rPr>
+      </w:pPr>
+      <w:r>
+        <w:rPr>
+          <w:rFonts w:ascii="Times New Roman" w:hAnsi="Times New Roman" w:cs="Times New Roman"/>
+        </w:rPr>
+        <w:t xml:space="preserve">- Se o </w:t>
+      </w:r>
+      <w:proofErr w:type="spellStart"/>
+      <w:r>
+        <w:rPr>
+          <w:rFonts w:ascii="Times New Roman" w:hAnsi="Times New Roman" w:cs="Times New Roman"/>
+        </w:rPr>
+        <w:t>cardápio</w:t>
+      </w:r>
+      <w:proofErr w:type="spellEnd"/>
+      <w:r>
+        <w:rPr>
+          <w:rFonts w:ascii="Times New Roman" w:hAnsi="Times New Roman" w:cs="Times New Roman"/>
+        </w:rPr>
+        <w:t xml:space="preserve"> do </w:t>
+      </w:r>
+      <w:proofErr w:type="spellStart"/>
+      <w:r>
+        <w:rPr>
+          <w:rFonts w:ascii="Times New Roman" w:hAnsi="Times New Roman" w:cs="Times New Roman"/>
+        </w:rPr>
+        <w:t>dia</w:t>
+      </w:r>
+      <w:proofErr w:type="spellEnd"/>
+      <w:r>
+        <w:rPr>
+          <w:rFonts w:ascii="Times New Roman" w:hAnsi="Times New Roman" w:cs="Times New Roman"/>
+        </w:rPr>
+        <w:t xml:space="preserve"> </w:t>
+      </w:r>
+      <w:proofErr w:type="spellStart"/>
+      <w:r>
+        <w:rPr>
+          <w:rFonts w:ascii="Times New Roman" w:hAnsi="Times New Roman" w:cs="Times New Roman"/>
+        </w:rPr>
+        <w:t>exceder</w:t>
+      </w:r>
+      <w:proofErr w:type="spellEnd"/>
+      <w:r>
+        <w:rPr>
+          <w:rFonts w:ascii="Times New Roman" w:hAnsi="Times New Roman" w:cs="Times New Roman"/>
+        </w:rPr>
+        <w:t xml:space="preserve"> o </w:t>
+      </w:r>
+      <w:proofErr w:type="spellStart"/>
+      <w:r>
+        <w:rPr>
+          <w:rFonts w:ascii="Times New Roman" w:hAnsi="Times New Roman" w:cs="Times New Roman"/>
+        </w:rPr>
+        <w:t>limite</w:t>
+      </w:r>
+      <w:proofErr w:type="spellEnd"/>
+      <w:r>
+        <w:rPr>
+          <w:rFonts w:ascii="Times New Roman" w:hAnsi="Times New Roman" w:cs="Times New Roman"/>
+        </w:rPr>
+        <w:t xml:space="preserve"> de </w:t>
+      </w:r>
+      <w:proofErr w:type="spellStart"/>
+      <w:r>
+        <w:rPr>
+          <w:rFonts w:ascii="Times New Roman" w:hAnsi="Times New Roman" w:cs="Times New Roman"/>
+        </w:rPr>
+        <w:t>carboidratos</w:t>
+      </w:r>
+      <w:proofErr w:type="spellEnd"/>
+      <w:r>
+        <w:rPr>
+          <w:rFonts w:ascii="Times New Roman" w:hAnsi="Times New Roman" w:cs="Times New Roman"/>
+        </w:rPr>
+        <w:t xml:space="preserve"> do </w:t>
+      </w:r>
+      <w:proofErr w:type="spellStart"/>
+      <w:r>
+        <w:rPr>
+          <w:rFonts w:ascii="Times New Roman" w:hAnsi="Times New Roman" w:cs="Times New Roman"/>
+        </w:rPr>
+        <w:t>usuário</w:t>
+      </w:r>
+      <w:proofErr w:type="spellEnd"/>
+      <w:r>
+        <w:rPr>
+          <w:rFonts w:ascii="Times New Roman" w:hAnsi="Times New Roman" w:cs="Times New Roman"/>
+        </w:rPr>
+        <w:t xml:space="preserve">, </w:t>
+      </w:r>
+      <w:proofErr w:type="spellStart"/>
+      <w:r>
+        <w:rPr>
+          <w:rFonts w:ascii="Times New Roman" w:hAnsi="Times New Roman" w:cs="Times New Roman"/>
+        </w:rPr>
+        <w:t>exiba</w:t>
+      </w:r>
+      <w:proofErr w:type="spellEnd"/>
+      <w:r>
+        <w:rPr>
+          <w:rFonts w:ascii="Times New Roman" w:hAnsi="Times New Roman" w:cs="Times New Roman"/>
+        </w:rPr>
+        <w:t xml:space="preserve"> um </w:t>
+      </w:r>
+      <w:proofErr w:type="spellStart"/>
+      <w:r>
+        <w:rPr>
+          <w:rFonts w:ascii="Times New Roman" w:hAnsi="Times New Roman" w:cs="Times New Roman"/>
+        </w:rPr>
+        <w:t>alerta</w:t>
+      </w:r>
+      <w:proofErr w:type="spellEnd"/>
+      <w:r>
+        <w:rPr>
+          <w:rFonts w:ascii="Times New Roman" w:hAnsi="Times New Roman" w:cs="Times New Roman"/>
+        </w:rPr>
+        <w:t xml:space="preserve"> de aviso.</w:t>
+      </w:r>
+    </w:p>
+    <w:p>
+      <w:pPr>
+        <w:spacing w:after="120"/>
+        <w:ind w:left="360"/>
+        <w:jc w:val="both"/>
+        <w:rPr>
+          <w:rFonts w:ascii="Times New Roman" w:hAnsi="Times New Roman" w:cs="Times New Roman"/>
+        </w:rPr>
+      </w:pPr>
+      <w:r>
+        <w:rPr>
+          <w:rFonts w:ascii="Times New Roman" w:hAnsi="Times New Roman" w:cs="Times New Roman"/>
+        </w:rPr>
+        <w:t xml:space="preserve">- </w:t>
+      </w:r>
+      <w:proofErr w:type="spellStart"/>
+      <w:r>
+        <w:rPr>
+          <w:rFonts w:ascii="Times New Roman" w:hAnsi="Times New Roman" w:cs="Times New Roman"/>
+        </w:rPr>
+        <w:t>Liste</w:t>
+      </w:r>
+      <w:proofErr w:type="spellEnd"/>
+      <w:r>
+        <w:rPr>
+          <w:rFonts w:ascii="Times New Roman" w:hAnsi="Times New Roman" w:cs="Times New Roman"/>
+        </w:rPr>
+        <w:t xml:space="preserve"> as </w:t>
+      </w:r>
+      <w:proofErr w:type="spellStart"/>
+      <w:r>
+        <w:rPr>
+          <w:rFonts w:ascii="Times New Roman" w:hAnsi="Times New Roman" w:cs="Times New Roman"/>
+        </w:rPr>
+        <w:t>refeições</w:t>
+      </w:r>
+      <w:proofErr w:type="spellEnd"/>
+      <w:r>
+        <w:rPr>
+          <w:rFonts w:ascii="Times New Roman" w:hAnsi="Times New Roman" w:cs="Times New Roman"/>
+        </w:rPr>
+        <w:t xml:space="preserve"> do </w:t>
+      </w:r>
+      <w:proofErr w:type="spellStart"/>
+      <w:r>
+        <w:rPr>
+          <w:rFonts w:ascii="Times New Roman" w:hAnsi="Times New Roman" w:cs="Times New Roman"/>
+        </w:rPr>
+        <w:t>dia</w:t>
+      </w:r>
+      <w:proofErr w:type="spellEnd"/>
+      <w:r>
+        <w:rPr>
+          <w:rFonts w:ascii="Times New Roman" w:hAnsi="Times New Roman" w:cs="Times New Roman"/>
+        </w:rPr>
+        <w:t xml:space="preserve"> </w:t>
+      </w:r>
+      <w:proofErr w:type="spellStart"/>
+      <w:r>
+        <w:rPr>
+          <w:rFonts w:ascii="Times New Roman" w:hAnsi="Times New Roman" w:cs="Times New Roman"/>
+        </w:rPr>
+        <w:t>selecionado</w:t>
+      </w:r>
+      <w:proofErr w:type="spellEnd"/>
+      <w:r>
+        <w:rPr>
+          <w:rFonts w:ascii="Times New Roman" w:hAnsi="Times New Roman" w:cs="Times New Roman"/>
+        </w:rPr>
+        <w:t xml:space="preserve"> </w:t>
+      </w:r>
+      <w:proofErr w:type="spellStart"/>
+      <w:r>
+        <w:rPr>
+          <w:rFonts w:ascii="Times New Roman" w:hAnsi="Times New Roman" w:cs="Times New Roman"/>
+        </w:rPr>
+        <w:t>em</w:t>
+      </w:r>
+      <w:proofErr w:type="spellEnd"/>
+      <w:r>
+        <w:rPr>
+          <w:rFonts w:ascii="Times New Roman" w:hAnsi="Times New Roman" w:cs="Times New Roman"/>
+        </w:rPr>
+        <w:t xml:space="preserve"> </w:t>
+      </w:r>
+      <w:proofErr w:type="spellStart"/>
+      <w:r>
+        <w:rPr>
+          <w:rFonts w:ascii="Times New Roman" w:hAnsi="Times New Roman" w:cs="Times New Roman"/>
+        </w:rPr>
+        <w:t>cartões</w:t>
+      </w:r>
+      <w:proofErr w:type="spellEnd"/>
+      <w:r>
+        <w:rPr>
+          <w:rFonts w:ascii="Times New Roman" w:hAnsi="Times New Roman" w:cs="Times New Roman"/>
+        </w:rPr>
+        <w:t xml:space="preserve"> </w:t>
+      </w:r>
+      <w:proofErr w:type="spellStart"/>
+      <w:r>
+        <w:rPr>
+          <w:rFonts w:ascii="Times New Roman" w:hAnsi="Times New Roman" w:cs="Times New Roman"/>
+        </w:rPr>
+        <w:t>brancos</w:t>
+      </w:r>
+      <w:proofErr w:type="spellEnd"/>
+      <w:r>
+        <w:rPr>
+          <w:rFonts w:ascii="Times New Roman" w:hAnsi="Times New Roman" w:cs="Times New Roman"/>
+        </w:rPr>
+        <w:t xml:space="preserve"> com </w:t>
+      </w:r>
+      <w:proofErr w:type="spellStart"/>
+      <w:r>
+        <w:rPr>
+          <w:rFonts w:ascii="Times New Roman" w:hAnsi="Times New Roman" w:cs="Times New Roman"/>
+        </w:rPr>
+        <w:t>divisórias</w:t>
+      </w:r>
+      <w:proofErr w:type="spellEnd"/>
+      <w:r>
+        <w:rPr>
+          <w:rFonts w:ascii="Times New Roman" w:hAnsi="Times New Roman" w:cs="Times New Roman"/>
+        </w:rPr>
+        <w:t xml:space="preserve"> </w:t>
+      </w:r>
+      <w:proofErr w:type="spellStart"/>
+      <w:r>
+        <w:rPr>
+          <w:rFonts w:ascii="Times New Roman" w:hAnsi="Times New Roman" w:cs="Times New Roman"/>
+        </w:rPr>
+        <w:t>sutis</w:t>
+      </w:r>
+      <w:proofErr w:type="spellEnd"/>
+      <w:r>
+        <w:rPr>
+          <w:rFonts w:ascii="Times New Roman" w:hAnsi="Times New Roman" w:cs="Times New Roman"/>
+        </w:rPr>
+        <w:t xml:space="preserve">. Cada item </w:t>
+      </w:r>
+      <w:proofErr w:type="spellStart"/>
+      <w:r>
+        <w:rPr>
+          <w:rFonts w:ascii="Times New Roman" w:hAnsi="Times New Roman" w:cs="Times New Roman"/>
+        </w:rPr>
+        <w:t>deve</w:t>
+      </w:r>
+      <w:proofErr w:type="spellEnd"/>
+      <w:r>
+        <w:rPr>
+          <w:rFonts w:ascii="Times New Roman" w:hAnsi="Times New Roman" w:cs="Times New Roman"/>
+        </w:rPr>
+        <w:t xml:space="preserve"> </w:t>
+      </w:r>
+      <w:proofErr w:type="spellStart"/>
+      <w:r>
+        <w:rPr>
+          <w:rFonts w:ascii="Times New Roman" w:hAnsi="Times New Roman" w:cs="Times New Roman"/>
+        </w:rPr>
+        <w:t>exibir</w:t>
+      </w:r>
+      <w:proofErr w:type="spellEnd"/>
+      <w:r>
+        <w:rPr>
+          <w:rFonts w:ascii="Times New Roman" w:hAnsi="Times New Roman" w:cs="Times New Roman"/>
+        </w:rPr>
+        <w:t xml:space="preserve"> o </w:t>
+      </w:r>
+      <w:proofErr w:type="spellStart"/>
+      <w:r>
+        <w:rPr>
+          <w:rFonts w:ascii="Times New Roman" w:hAnsi="Times New Roman" w:cs="Times New Roman"/>
+        </w:rPr>
+        <w:t>nome</w:t>
+      </w:r>
+      <w:proofErr w:type="spellEnd"/>
+      <w:r>
+        <w:rPr>
+          <w:rFonts w:ascii="Times New Roman" w:hAnsi="Times New Roman" w:cs="Times New Roman"/>
+        </w:rPr>
+        <w:t xml:space="preserve">, </w:t>
+      </w:r>
+      <w:proofErr w:type="spellStart"/>
+      <w:r>
+        <w:rPr>
+          <w:rFonts w:ascii="Times New Roman" w:hAnsi="Times New Roman" w:cs="Times New Roman"/>
+        </w:rPr>
+        <w:t>porção</w:t>
+      </w:r>
+      <w:proofErr w:type="spellEnd"/>
+      <w:r>
+        <w:rPr>
+          <w:rFonts w:ascii="Times New Roman" w:hAnsi="Times New Roman" w:cs="Times New Roman"/>
+        </w:rPr>
+        <w:t xml:space="preserve">, </w:t>
+      </w:r>
+      <w:proofErr w:type="spellStart"/>
+      <w:r>
+        <w:rPr>
+          <w:rFonts w:ascii="Times New Roman" w:hAnsi="Times New Roman" w:cs="Times New Roman"/>
+        </w:rPr>
+        <w:t>calorias</w:t>
+      </w:r>
+      <w:proofErr w:type="spellEnd"/>
+      <w:r>
+        <w:rPr>
+          <w:rFonts w:ascii="Times New Roman" w:hAnsi="Times New Roman" w:cs="Times New Roman"/>
+        </w:rPr>
+        <w:t xml:space="preserve">, </w:t>
+      </w:r>
+      <w:proofErr w:type="spellStart"/>
+      <w:r>
+        <w:rPr>
+          <w:rFonts w:ascii="Times New Roman" w:hAnsi="Times New Roman" w:cs="Times New Roman"/>
+        </w:rPr>
+        <w:t>gramas</w:t>
+      </w:r>
+      <w:proofErr w:type="spellEnd"/>
+      <w:r>
+        <w:rPr>
+          <w:rFonts w:ascii="Times New Roman" w:hAnsi="Times New Roman" w:cs="Times New Roman"/>
+        </w:rPr>
+        <w:t xml:space="preserve"> de </w:t>
+      </w:r>
+      <w:proofErr w:type="spellStart"/>
+      <w:r>
+        <w:rPr>
+          <w:rFonts w:ascii="Times New Roman" w:hAnsi="Times New Roman" w:cs="Times New Roman"/>
+        </w:rPr>
+        <w:t>carboidratos</w:t>
+      </w:r>
+      <w:proofErr w:type="spellEnd"/>
+      <w:r>
+        <w:rPr>
+          <w:rFonts w:ascii="Times New Roman" w:hAnsi="Times New Roman" w:cs="Times New Roman"/>
+        </w:rPr>
+        <w:t xml:space="preserve"> e o </w:t>
+      </w:r>
+      <w:proofErr w:type="spellStart"/>
+      <w:r>
+        <w:rPr>
+          <w:rFonts w:ascii="Times New Roman" w:hAnsi="Times New Roman" w:cs="Times New Roman"/>
+        </w:rPr>
+        <w:t>custo</w:t>
+      </w:r>
+      <w:proofErr w:type="spellEnd"/>
+      <w:r>
+        <w:rPr>
+          <w:rFonts w:ascii="Times New Roman" w:hAnsi="Times New Roman" w:cs="Times New Roman"/>
+        </w:rPr>
+        <w:t xml:space="preserve"> </w:t>
+      </w:r>
+      <w:proofErr w:type="spellStart"/>
+      <w:r>
+        <w:rPr>
+          <w:rFonts w:ascii="Times New Roman" w:hAnsi="Times New Roman" w:cs="Times New Roman"/>
+        </w:rPr>
+        <w:t>estimado</w:t>
+      </w:r>
+      <w:proofErr w:type="spellEnd"/>
+      <w:r>
+        <w:rPr>
+          <w:rFonts w:ascii="Times New Roman" w:hAnsi="Times New Roman" w:cs="Times New Roman"/>
+        </w:rPr>
+        <w:t>.</w:t>
+      </w:r>
+    </w:p>
+    <w:p>
+      <w:pPr>
+        <w:spacing w:after="120"/>
+        <w:ind w:left="360"/>
+        <w:jc w:val="both"/>
+        <w:rPr>
+          <w:rFonts w:ascii="Times New Roman" w:hAnsi="Times New Roman" w:cs="Times New Roman"/>
+        </w:rPr>
+      </w:pPr>
+    </w:p>
+    <w:p>
+      <w:pPr>
+        <w:spacing w:after="120"/>
+        <w:ind w:left="360"/>
+        <w:jc w:val="both"/>
+        <w:rPr>
+          <w:rFonts w:ascii="Times New Roman" w:hAnsi="Times New Roman" w:cs="Times New Roman"/>
+          <w:b/>
+          <w:bCs/>
+        </w:rPr>
+      </w:pPr>
+      <w:r>
+        <w:rPr>
+          <w:rFonts w:ascii="Times New Roman" w:hAnsi="Times New Roman" w:cs="Times New Roman"/>
+          <w:b/>
+          <w:bCs/>
+        </w:rPr>
+        <w:t>4. LISTA DE COMPRAS E EXPORTAÇÃO (PDF &amp; LIMPAR):</w:t>
+      </w:r>
+    </w:p>
+    <w:p>
+      <w:pPr>
+        <w:spacing w:after="120"/>
+        <w:ind w:left="360"/>
+        <w:jc w:val="both"/>
+        <w:rPr>
+          <w:rFonts w:ascii="Times New Roman" w:hAnsi="Times New Roman" w:cs="Times New Roman"/>
+        </w:rPr>
+      </w:pPr>
+      <w:r>
+        <w:rPr>
+          <w:rFonts w:ascii="Times New Roman" w:hAnsi="Times New Roman" w:cs="Times New Roman"/>
+        </w:rPr>
+        <w:t xml:space="preserve">- </w:t>
+      </w:r>
+      <w:proofErr w:type="spellStart"/>
+      <w:r>
+        <w:rPr>
+          <w:rFonts w:ascii="Times New Roman" w:hAnsi="Times New Roman" w:cs="Times New Roman"/>
+        </w:rPr>
+        <w:t>Exiba</w:t>
+      </w:r>
+      <w:proofErr w:type="spellEnd"/>
+      <w:r>
+        <w:rPr>
+          <w:rFonts w:ascii="Times New Roman" w:hAnsi="Times New Roman" w:cs="Times New Roman"/>
+        </w:rPr>
+        <w:t xml:space="preserve"> </w:t>
+      </w:r>
+      <w:proofErr w:type="spellStart"/>
+      <w:r>
+        <w:rPr>
+          <w:rFonts w:ascii="Times New Roman" w:hAnsi="Times New Roman" w:cs="Times New Roman"/>
+        </w:rPr>
+        <w:t>abaixo</w:t>
+      </w:r>
+      <w:proofErr w:type="spellEnd"/>
+      <w:r>
+        <w:rPr>
+          <w:rFonts w:ascii="Times New Roman" w:hAnsi="Times New Roman" w:cs="Times New Roman"/>
+        </w:rPr>
+        <w:t xml:space="preserve"> das </w:t>
+      </w:r>
+      <w:proofErr w:type="spellStart"/>
+      <w:r>
+        <w:rPr>
+          <w:rFonts w:ascii="Times New Roman" w:hAnsi="Times New Roman" w:cs="Times New Roman"/>
+        </w:rPr>
+        <w:t>refeições</w:t>
+      </w:r>
+      <w:proofErr w:type="spellEnd"/>
+      <w:r>
+        <w:rPr>
+          <w:rFonts w:ascii="Times New Roman" w:hAnsi="Times New Roman" w:cs="Times New Roman"/>
+        </w:rPr>
+        <w:t xml:space="preserve"> </w:t>
+      </w:r>
+      <w:proofErr w:type="spellStart"/>
+      <w:r>
+        <w:rPr>
+          <w:rFonts w:ascii="Times New Roman" w:hAnsi="Times New Roman" w:cs="Times New Roman"/>
+        </w:rPr>
+        <w:t>uma</w:t>
+      </w:r>
+      <w:proofErr w:type="spellEnd"/>
+      <w:r>
+        <w:rPr>
+          <w:rFonts w:ascii="Times New Roman" w:hAnsi="Times New Roman" w:cs="Times New Roman"/>
+        </w:rPr>
+        <w:t xml:space="preserve"> "Lista de </w:t>
+      </w:r>
+      <w:proofErr w:type="spellStart"/>
+      <w:r>
+        <w:rPr>
+          <w:rFonts w:ascii="Times New Roman" w:hAnsi="Times New Roman" w:cs="Times New Roman"/>
+        </w:rPr>
+        <w:t>compras</w:t>
+      </w:r>
+      <w:proofErr w:type="spellEnd"/>
+      <w:r>
+        <w:rPr>
+          <w:rFonts w:ascii="Times New Roman" w:hAnsi="Times New Roman" w:cs="Times New Roman"/>
+        </w:rPr>
+        <w:t xml:space="preserve">" </w:t>
+      </w:r>
+      <w:proofErr w:type="spellStart"/>
+      <w:r>
+        <w:rPr>
+          <w:rFonts w:ascii="Times New Roman" w:hAnsi="Times New Roman" w:cs="Times New Roman"/>
+        </w:rPr>
+        <w:t>contendo</w:t>
+      </w:r>
+      <w:proofErr w:type="spellEnd"/>
+      <w:r>
+        <w:rPr>
+          <w:rFonts w:ascii="Times New Roman" w:hAnsi="Times New Roman" w:cs="Times New Roman"/>
+        </w:rPr>
+        <w:t xml:space="preserve"> </w:t>
+      </w:r>
+      <w:proofErr w:type="spellStart"/>
+      <w:r>
+        <w:rPr>
+          <w:rFonts w:ascii="Times New Roman" w:hAnsi="Times New Roman" w:cs="Times New Roman"/>
+        </w:rPr>
+        <w:t>todos</w:t>
+      </w:r>
+      <w:proofErr w:type="spellEnd"/>
+      <w:r>
+        <w:rPr>
+          <w:rFonts w:ascii="Times New Roman" w:hAnsi="Times New Roman" w:cs="Times New Roman"/>
+        </w:rPr>
+        <w:t xml:space="preserve"> </w:t>
+      </w:r>
+      <w:proofErr w:type="spellStart"/>
+      <w:r>
+        <w:rPr>
+          <w:rFonts w:ascii="Times New Roman" w:hAnsi="Times New Roman" w:cs="Times New Roman"/>
+        </w:rPr>
+        <w:t>os</w:t>
+      </w:r>
+      <w:proofErr w:type="spellEnd"/>
+      <w:r>
+        <w:rPr>
+          <w:rFonts w:ascii="Times New Roman" w:hAnsi="Times New Roman" w:cs="Times New Roman"/>
+        </w:rPr>
+        <w:t xml:space="preserve"> </w:t>
+      </w:r>
+      <w:proofErr w:type="spellStart"/>
+      <w:r>
+        <w:rPr>
+          <w:rFonts w:ascii="Times New Roman" w:hAnsi="Times New Roman" w:cs="Times New Roman"/>
+        </w:rPr>
+        <w:t>ingredientes</w:t>
+      </w:r>
+      <w:proofErr w:type="spellEnd"/>
+      <w:r>
+        <w:rPr>
+          <w:rFonts w:ascii="Times New Roman" w:hAnsi="Times New Roman" w:cs="Times New Roman"/>
+        </w:rPr>
+        <w:t xml:space="preserve"> </w:t>
+      </w:r>
+      <w:proofErr w:type="spellStart"/>
+      <w:r>
+        <w:rPr>
+          <w:rFonts w:ascii="Times New Roman" w:hAnsi="Times New Roman" w:cs="Times New Roman"/>
+        </w:rPr>
+        <w:t>consumidos</w:t>
+      </w:r>
+      <w:proofErr w:type="spellEnd"/>
+      <w:r>
+        <w:rPr>
+          <w:rFonts w:ascii="Times New Roman" w:hAnsi="Times New Roman" w:cs="Times New Roman"/>
+        </w:rPr>
+        <w:t xml:space="preserve"> no </w:t>
+      </w:r>
+      <w:proofErr w:type="spellStart"/>
+      <w:r>
+        <w:rPr>
+          <w:rFonts w:ascii="Times New Roman" w:hAnsi="Times New Roman" w:cs="Times New Roman"/>
+        </w:rPr>
+        <w:t>dia</w:t>
+      </w:r>
+      <w:proofErr w:type="spellEnd"/>
+      <w:r>
+        <w:rPr>
+          <w:rFonts w:ascii="Times New Roman" w:hAnsi="Times New Roman" w:cs="Times New Roman"/>
+        </w:rPr>
+        <w:t xml:space="preserve"> </w:t>
+      </w:r>
+      <w:proofErr w:type="spellStart"/>
+      <w:r>
+        <w:rPr>
+          <w:rFonts w:ascii="Times New Roman" w:hAnsi="Times New Roman" w:cs="Times New Roman"/>
+        </w:rPr>
+        <w:t>selecionado</w:t>
+      </w:r>
+      <w:proofErr w:type="spellEnd"/>
+      <w:r>
+        <w:rPr>
+          <w:rFonts w:ascii="Times New Roman" w:hAnsi="Times New Roman" w:cs="Times New Roman"/>
+        </w:rPr>
+        <w:t xml:space="preserve"> com </w:t>
+      </w:r>
+      <w:proofErr w:type="spellStart"/>
+      <w:r>
+        <w:rPr>
+          <w:rFonts w:ascii="Times New Roman" w:hAnsi="Times New Roman" w:cs="Times New Roman"/>
+        </w:rPr>
+        <w:t>seus</w:t>
+      </w:r>
+      <w:proofErr w:type="spellEnd"/>
+      <w:r>
+        <w:rPr>
+          <w:rFonts w:ascii="Times New Roman" w:hAnsi="Times New Roman" w:cs="Times New Roman"/>
+        </w:rPr>
+        <w:t xml:space="preserve"> </w:t>
+      </w:r>
+      <w:proofErr w:type="spellStart"/>
+      <w:r>
+        <w:rPr>
+          <w:rFonts w:ascii="Times New Roman" w:hAnsi="Times New Roman" w:cs="Times New Roman"/>
+        </w:rPr>
+        <w:t>respectivos</w:t>
+      </w:r>
+      <w:proofErr w:type="spellEnd"/>
+      <w:r>
+        <w:rPr>
+          <w:rFonts w:ascii="Times New Roman" w:hAnsi="Times New Roman" w:cs="Times New Roman"/>
+        </w:rPr>
+        <w:t xml:space="preserve"> custos </w:t>
+      </w:r>
+      <w:proofErr w:type="spellStart"/>
+      <w:r>
+        <w:rPr>
+          <w:rFonts w:ascii="Times New Roman" w:hAnsi="Times New Roman" w:cs="Times New Roman"/>
+        </w:rPr>
+        <w:t>individuais</w:t>
+      </w:r>
+      <w:proofErr w:type="spellEnd"/>
+      <w:r>
+        <w:rPr>
+          <w:rFonts w:ascii="Times New Roman" w:hAnsi="Times New Roman" w:cs="Times New Roman"/>
+        </w:rPr>
+        <w:t xml:space="preserve"> e a soma total </w:t>
+      </w:r>
+      <w:proofErr w:type="spellStart"/>
+      <w:r>
+        <w:rPr>
+          <w:rFonts w:ascii="Times New Roman" w:hAnsi="Times New Roman" w:cs="Times New Roman"/>
+        </w:rPr>
+        <w:t>estimada</w:t>
+      </w:r>
+      <w:proofErr w:type="spellEnd"/>
+      <w:r>
+        <w:rPr>
+          <w:rFonts w:ascii="Times New Roman" w:hAnsi="Times New Roman" w:cs="Times New Roman"/>
+        </w:rPr>
+        <w:t>.</w:t>
+      </w:r>
+    </w:p>
+    <w:p>
+      <w:pPr>
+        <w:spacing w:after="120"/>
+        <w:ind w:left="360"/>
+        <w:jc w:val="both"/>
+        <w:rPr>
+          <w:rFonts w:ascii="Times New Roman" w:hAnsi="Times New Roman" w:cs="Times New Roman"/>
+        </w:rPr>
+      </w:pPr>
+      <w:r>
+        <w:rPr>
+          <w:rFonts w:ascii="Times New Roman" w:hAnsi="Times New Roman" w:cs="Times New Roman"/>
+        </w:rPr>
+        <w:t xml:space="preserve">- No topo da </w:t>
+      </w:r>
+      <w:proofErr w:type="spellStart"/>
+      <w:r>
+        <w:rPr>
+          <w:rFonts w:ascii="Times New Roman" w:hAnsi="Times New Roman" w:cs="Times New Roman"/>
+        </w:rPr>
+        <w:t>visualização</w:t>
+      </w:r>
+      <w:proofErr w:type="spellEnd"/>
+      <w:r>
+        <w:rPr>
+          <w:rFonts w:ascii="Times New Roman" w:hAnsi="Times New Roman" w:cs="Times New Roman"/>
+        </w:rPr>
+        <w:t xml:space="preserve"> do </w:t>
+      </w:r>
+      <w:proofErr w:type="spellStart"/>
+      <w:r>
+        <w:rPr>
+          <w:rFonts w:ascii="Times New Roman" w:hAnsi="Times New Roman" w:cs="Times New Roman"/>
+        </w:rPr>
+        <w:t>cardápio</w:t>
+      </w:r>
+      <w:proofErr w:type="spellEnd"/>
+      <w:r>
+        <w:rPr>
+          <w:rFonts w:ascii="Times New Roman" w:hAnsi="Times New Roman" w:cs="Times New Roman"/>
+        </w:rPr>
+        <w:t xml:space="preserve">, </w:t>
+      </w:r>
+      <w:proofErr w:type="spellStart"/>
+      <w:r>
+        <w:rPr>
+          <w:rFonts w:ascii="Times New Roman" w:hAnsi="Times New Roman" w:cs="Times New Roman"/>
+        </w:rPr>
+        <w:t>forneça</w:t>
+      </w:r>
+      <w:proofErr w:type="spellEnd"/>
+      <w:r>
+        <w:rPr>
+          <w:rFonts w:ascii="Times New Roman" w:hAnsi="Times New Roman" w:cs="Times New Roman"/>
+        </w:rPr>
+        <w:t xml:space="preserve"> </w:t>
+      </w:r>
+      <w:proofErr w:type="spellStart"/>
+      <w:r>
+        <w:rPr>
+          <w:rFonts w:ascii="Times New Roman" w:hAnsi="Times New Roman" w:cs="Times New Roman"/>
+        </w:rPr>
+        <w:t>dois</w:t>
+      </w:r>
+      <w:proofErr w:type="spellEnd"/>
+      <w:r>
+        <w:rPr>
+          <w:rFonts w:ascii="Times New Roman" w:hAnsi="Times New Roman" w:cs="Times New Roman"/>
+        </w:rPr>
+        <w:t xml:space="preserve"> </w:t>
+      </w:r>
+      <w:proofErr w:type="spellStart"/>
+      <w:r>
+        <w:rPr>
+          <w:rFonts w:ascii="Times New Roman" w:hAnsi="Times New Roman" w:cs="Times New Roman"/>
+        </w:rPr>
+        <w:t>botões</w:t>
+      </w:r>
+      <w:proofErr w:type="spellEnd"/>
+      <w:r>
+        <w:rPr>
+          <w:rFonts w:ascii="Times New Roman" w:hAnsi="Times New Roman" w:cs="Times New Roman"/>
+        </w:rPr>
+        <w:t xml:space="preserve"> elegantes:</w:t>
+      </w:r>
+    </w:p>
+    <w:p>
+      <w:pPr>
+        <w:spacing w:after="120"/>
+        <w:ind w:left="360"/>
+        <w:jc w:val="both"/>
+        <w:rPr>
+          <w:rFonts w:ascii="Times New Roman" w:hAnsi="Times New Roman" w:cs="Times New Roman"/>
+        </w:rPr>
+      </w:pPr>
+      <w:r>
+        <w:rPr>
+          <w:rFonts w:ascii="Times New Roman" w:hAnsi="Times New Roman" w:cs="Times New Roman"/>
+        </w:rPr>
+        <w:t xml:space="preserve">  * "PDF </w:t>
+      </w:r>
+      <w:proofErr w:type="spellStart"/>
+      <w:r>
+        <w:rPr>
+          <w:rFonts w:ascii="Times New Roman" w:hAnsi="Times New Roman" w:cs="Times New Roman"/>
+        </w:rPr>
+        <w:t>Completo</w:t>
+      </w:r>
+      <w:proofErr w:type="spellEnd"/>
+      <w:r>
+        <w:rPr>
+          <w:rFonts w:ascii="Times New Roman" w:hAnsi="Times New Roman" w:cs="Times New Roman"/>
+        </w:rPr>
+        <w:t xml:space="preserve">": Gera e </w:t>
+      </w:r>
+      <w:proofErr w:type="spellStart"/>
+      <w:r>
+        <w:rPr>
+          <w:rFonts w:ascii="Times New Roman" w:hAnsi="Times New Roman" w:cs="Times New Roman"/>
+        </w:rPr>
+        <w:t>baixa</w:t>
+      </w:r>
+      <w:proofErr w:type="spellEnd"/>
+      <w:r>
+        <w:rPr>
+          <w:rFonts w:ascii="Times New Roman" w:hAnsi="Times New Roman" w:cs="Times New Roman"/>
+        </w:rPr>
+        <w:t xml:space="preserve"> de forma </w:t>
+      </w:r>
+      <w:proofErr w:type="spellStart"/>
+      <w:r>
+        <w:rPr>
+          <w:rFonts w:ascii="Times New Roman" w:hAnsi="Times New Roman" w:cs="Times New Roman"/>
+        </w:rPr>
+        <w:t>assíncrona</w:t>
+      </w:r>
+      <w:proofErr w:type="spellEnd"/>
+      <w:r>
+        <w:rPr>
+          <w:rFonts w:ascii="Times New Roman" w:hAnsi="Times New Roman" w:cs="Times New Roman"/>
+        </w:rPr>
+        <w:t xml:space="preserve"> (</w:t>
+      </w:r>
+      <w:proofErr w:type="spellStart"/>
+      <w:r>
+        <w:rPr>
+          <w:rFonts w:ascii="Times New Roman" w:hAnsi="Times New Roman" w:cs="Times New Roman"/>
+        </w:rPr>
+        <w:t>usando</w:t>
+      </w:r>
+      <w:proofErr w:type="spellEnd"/>
+      <w:r>
+        <w:rPr>
+          <w:rFonts w:ascii="Times New Roman" w:hAnsi="Times New Roman" w:cs="Times New Roman"/>
+        </w:rPr>
+        <w:t xml:space="preserve"> dynamic import de "</w:t>
+      </w:r>
+      <w:proofErr w:type="spellStart"/>
+      <w:r>
+        <w:rPr>
+          <w:rFonts w:ascii="Times New Roman" w:hAnsi="Times New Roman" w:cs="Times New Roman"/>
+        </w:rPr>
+        <w:t>jspdf</w:t>
+      </w:r>
+      <w:proofErr w:type="spellEnd"/>
+      <w:r>
+        <w:rPr>
+          <w:rFonts w:ascii="Times New Roman" w:hAnsi="Times New Roman" w:cs="Times New Roman"/>
+        </w:rPr>
+        <w:t xml:space="preserve">") um </w:t>
+      </w:r>
+      <w:proofErr w:type="spellStart"/>
+      <w:r>
+        <w:rPr>
+          <w:rFonts w:ascii="Times New Roman" w:hAnsi="Times New Roman" w:cs="Times New Roman"/>
+        </w:rPr>
+        <w:t>relatório</w:t>
+      </w:r>
+      <w:proofErr w:type="spellEnd"/>
+      <w:r>
+        <w:rPr>
+          <w:rFonts w:ascii="Times New Roman" w:hAnsi="Times New Roman" w:cs="Times New Roman"/>
+        </w:rPr>
+        <w:t xml:space="preserve"> </w:t>
+      </w:r>
+      <w:proofErr w:type="spellStart"/>
+      <w:r>
+        <w:rPr>
+          <w:rFonts w:ascii="Times New Roman" w:hAnsi="Times New Roman" w:cs="Times New Roman"/>
+        </w:rPr>
+        <w:t>em</w:t>
+      </w:r>
+      <w:proofErr w:type="spellEnd"/>
+      <w:r>
+        <w:rPr>
+          <w:rFonts w:ascii="Times New Roman" w:hAnsi="Times New Roman" w:cs="Times New Roman"/>
+        </w:rPr>
+        <w:t xml:space="preserve"> PDF elegante. O PDF </w:t>
+      </w:r>
+      <w:proofErr w:type="spellStart"/>
+      <w:r>
+        <w:rPr>
+          <w:rFonts w:ascii="Times New Roman" w:hAnsi="Times New Roman" w:cs="Times New Roman"/>
+        </w:rPr>
+        <w:t>deve</w:t>
+      </w:r>
+      <w:proofErr w:type="spellEnd"/>
+      <w:r>
+        <w:rPr>
+          <w:rFonts w:ascii="Times New Roman" w:hAnsi="Times New Roman" w:cs="Times New Roman"/>
+        </w:rPr>
+        <w:t xml:space="preserve"> </w:t>
+      </w:r>
+      <w:proofErr w:type="spellStart"/>
+      <w:r>
+        <w:rPr>
+          <w:rFonts w:ascii="Times New Roman" w:hAnsi="Times New Roman" w:cs="Times New Roman"/>
+        </w:rPr>
+        <w:t>conter</w:t>
+      </w:r>
+      <w:proofErr w:type="spellEnd"/>
+      <w:r>
+        <w:rPr>
+          <w:rFonts w:ascii="Times New Roman" w:hAnsi="Times New Roman" w:cs="Times New Roman"/>
+        </w:rPr>
+        <w:t xml:space="preserve"> </w:t>
+      </w:r>
+      <w:proofErr w:type="spellStart"/>
+      <w:r>
+        <w:rPr>
+          <w:rFonts w:ascii="Times New Roman" w:hAnsi="Times New Roman" w:cs="Times New Roman"/>
+        </w:rPr>
+        <w:t>uma</w:t>
+      </w:r>
+      <w:proofErr w:type="spellEnd"/>
+      <w:r>
+        <w:rPr>
+          <w:rFonts w:ascii="Times New Roman" w:hAnsi="Times New Roman" w:cs="Times New Roman"/>
+        </w:rPr>
+        <w:t xml:space="preserve"> </w:t>
+      </w:r>
+      <w:proofErr w:type="spellStart"/>
+      <w:r>
+        <w:rPr>
+          <w:rFonts w:ascii="Times New Roman" w:hAnsi="Times New Roman" w:cs="Times New Roman"/>
+        </w:rPr>
+        <w:t>página</w:t>
+      </w:r>
+      <w:proofErr w:type="spellEnd"/>
+      <w:r>
+        <w:rPr>
+          <w:rFonts w:ascii="Times New Roman" w:hAnsi="Times New Roman" w:cs="Times New Roman"/>
+        </w:rPr>
+        <w:t xml:space="preserve"> </w:t>
+      </w:r>
+      <w:proofErr w:type="spellStart"/>
+      <w:r>
+        <w:rPr>
+          <w:rFonts w:ascii="Times New Roman" w:hAnsi="Times New Roman" w:cs="Times New Roman"/>
+        </w:rPr>
+        <w:t>dedicada</w:t>
+      </w:r>
+      <w:proofErr w:type="spellEnd"/>
+      <w:r>
+        <w:rPr>
+          <w:rFonts w:ascii="Times New Roman" w:hAnsi="Times New Roman" w:cs="Times New Roman"/>
+        </w:rPr>
+        <w:t xml:space="preserve"> para </w:t>
+      </w:r>
+      <w:proofErr w:type="spellStart"/>
+      <w:r>
+        <w:rPr>
+          <w:rFonts w:ascii="Times New Roman" w:hAnsi="Times New Roman" w:cs="Times New Roman"/>
+        </w:rPr>
+        <w:t>cada</w:t>
+      </w:r>
+      <w:proofErr w:type="spellEnd"/>
+      <w:r>
+        <w:rPr>
+          <w:rFonts w:ascii="Times New Roman" w:hAnsi="Times New Roman" w:cs="Times New Roman"/>
+        </w:rPr>
+        <w:t xml:space="preserve"> </w:t>
+      </w:r>
+      <w:proofErr w:type="spellStart"/>
+      <w:r>
+        <w:rPr>
+          <w:rFonts w:ascii="Times New Roman" w:hAnsi="Times New Roman" w:cs="Times New Roman"/>
+        </w:rPr>
+        <w:t>dia</w:t>
+      </w:r>
+      <w:proofErr w:type="spellEnd"/>
+      <w:r>
+        <w:rPr>
+          <w:rFonts w:ascii="Times New Roman" w:hAnsi="Times New Roman" w:cs="Times New Roman"/>
+        </w:rPr>
+        <w:t xml:space="preserve"> </w:t>
+      </w:r>
+      <w:proofErr w:type="spellStart"/>
+      <w:r>
+        <w:rPr>
+          <w:rFonts w:ascii="Times New Roman" w:hAnsi="Times New Roman" w:cs="Times New Roman"/>
+        </w:rPr>
+        <w:t>planejado</w:t>
+      </w:r>
+      <w:proofErr w:type="spellEnd"/>
+      <w:r>
+        <w:rPr>
+          <w:rFonts w:ascii="Times New Roman" w:hAnsi="Times New Roman" w:cs="Times New Roman"/>
+        </w:rPr>
+        <w:t xml:space="preserve"> com o </w:t>
+      </w:r>
+      <w:proofErr w:type="spellStart"/>
+      <w:r>
+        <w:rPr>
+          <w:rFonts w:ascii="Times New Roman" w:hAnsi="Times New Roman" w:cs="Times New Roman"/>
+        </w:rPr>
+        <w:t>resumo</w:t>
+      </w:r>
+      <w:proofErr w:type="spellEnd"/>
+      <w:r>
+        <w:rPr>
+          <w:rFonts w:ascii="Times New Roman" w:hAnsi="Times New Roman" w:cs="Times New Roman"/>
+        </w:rPr>
+        <w:t xml:space="preserve"> </w:t>
+      </w:r>
+      <w:proofErr w:type="spellStart"/>
+      <w:r>
+        <w:rPr>
+          <w:rFonts w:ascii="Times New Roman" w:hAnsi="Times New Roman" w:cs="Times New Roman"/>
+        </w:rPr>
+        <w:t>nutricional</w:t>
+      </w:r>
+      <w:proofErr w:type="spellEnd"/>
+      <w:r>
+        <w:rPr>
+          <w:rFonts w:ascii="Times New Roman" w:hAnsi="Times New Roman" w:cs="Times New Roman"/>
+        </w:rPr>
+        <w:t>/</w:t>
+      </w:r>
+      <w:proofErr w:type="spellStart"/>
+      <w:r>
+        <w:rPr>
+          <w:rFonts w:ascii="Times New Roman" w:hAnsi="Times New Roman" w:cs="Times New Roman"/>
+        </w:rPr>
+        <w:t>refeições</w:t>
+      </w:r>
+      <w:proofErr w:type="spellEnd"/>
+      <w:r>
+        <w:rPr>
+          <w:rFonts w:ascii="Times New Roman" w:hAnsi="Times New Roman" w:cs="Times New Roman"/>
+        </w:rPr>
+        <w:t xml:space="preserve"> e, </w:t>
+      </w:r>
+      <w:proofErr w:type="spellStart"/>
+      <w:r>
+        <w:rPr>
+          <w:rFonts w:ascii="Times New Roman" w:hAnsi="Times New Roman" w:cs="Times New Roman"/>
+        </w:rPr>
+        <w:t>na</w:t>
+      </w:r>
+      <w:proofErr w:type="spellEnd"/>
+      <w:r>
+        <w:rPr>
+          <w:rFonts w:ascii="Times New Roman" w:hAnsi="Times New Roman" w:cs="Times New Roman"/>
+        </w:rPr>
+        <w:t xml:space="preserve"> </w:t>
+      </w:r>
+      <w:proofErr w:type="spellStart"/>
+      <w:r>
+        <w:rPr>
+          <w:rFonts w:ascii="Times New Roman" w:hAnsi="Times New Roman" w:cs="Times New Roman"/>
+        </w:rPr>
+        <w:t>última</w:t>
+      </w:r>
+      <w:proofErr w:type="spellEnd"/>
+      <w:r>
+        <w:rPr>
+          <w:rFonts w:ascii="Times New Roman" w:hAnsi="Times New Roman" w:cs="Times New Roman"/>
+        </w:rPr>
+        <w:t xml:space="preserve"> </w:t>
+      </w:r>
+      <w:proofErr w:type="spellStart"/>
+      <w:r>
+        <w:rPr>
+          <w:rFonts w:ascii="Times New Roman" w:hAnsi="Times New Roman" w:cs="Times New Roman"/>
+        </w:rPr>
+        <w:t>página</w:t>
+      </w:r>
+      <w:proofErr w:type="spellEnd"/>
+      <w:r>
+        <w:rPr>
+          <w:rFonts w:ascii="Times New Roman" w:hAnsi="Times New Roman" w:cs="Times New Roman"/>
+        </w:rPr>
+        <w:t xml:space="preserve">, </w:t>
+      </w:r>
+      <w:proofErr w:type="spellStart"/>
+      <w:r>
+        <w:rPr>
+          <w:rFonts w:ascii="Times New Roman" w:hAnsi="Times New Roman" w:cs="Times New Roman"/>
+        </w:rPr>
+        <w:t>uma</w:t>
+      </w:r>
+      <w:proofErr w:type="spellEnd"/>
+      <w:r>
+        <w:rPr>
+          <w:rFonts w:ascii="Times New Roman" w:hAnsi="Times New Roman" w:cs="Times New Roman"/>
+        </w:rPr>
+        <w:t xml:space="preserve"> </w:t>
+      </w:r>
+      <w:proofErr w:type="spellStart"/>
+      <w:r>
+        <w:rPr>
+          <w:rFonts w:ascii="Times New Roman" w:hAnsi="Times New Roman" w:cs="Times New Roman"/>
+        </w:rPr>
+        <w:t>lista</w:t>
+      </w:r>
+      <w:proofErr w:type="spellEnd"/>
+      <w:r>
+        <w:rPr>
+          <w:rFonts w:ascii="Times New Roman" w:hAnsi="Times New Roman" w:cs="Times New Roman"/>
+        </w:rPr>
+        <w:t xml:space="preserve"> de </w:t>
+      </w:r>
+      <w:proofErr w:type="spellStart"/>
+      <w:r>
+        <w:rPr>
+          <w:rFonts w:ascii="Times New Roman" w:hAnsi="Times New Roman" w:cs="Times New Roman"/>
+        </w:rPr>
+        <w:t>compras</w:t>
+      </w:r>
+      <w:proofErr w:type="spellEnd"/>
+      <w:r>
+        <w:rPr>
+          <w:rFonts w:ascii="Times New Roman" w:hAnsi="Times New Roman" w:cs="Times New Roman"/>
+        </w:rPr>
+        <w:t xml:space="preserve"> </w:t>
+      </w:r>
+      <w:proofErr w:type="spellStart"/>
+      <w:r>
+        <w:rPr>
+          <w:rFonts w:ascii="Times New Roman" w:hAnsi="Times New Roman" w:cs="Times New Roman"/>
+        </w:rPr>
+        <w:t>consolidada</w:t>
+      </w:r>
+      <w:proofErr w:type="spellEnd"/>
+      <w:r>
+        <w:rPr>
+          <w:rFonts w:ascii="Times New Roman" w:hAnsi="Times New Roman" w:cs="Times New Roman"/>
+        </w:rPr>
+        <w:t xml:space="preserve"> </w:t>
+      </w:r>
+      <w:proofErr w:type="spellStart"/>
+      <w:r>
+        <w:rPr>
+          <w:rFonts w:ascii="Times New Roman" w:hAnsi="Times New Roman" w:cs="Times New Roman"/>
+        </w:rPr>
+        <w:t>somando</w:t>
+      </w:r>
+      <w:proofErr w:type="spellEnd"/>
+      <w:r>
+        <w:rPr>
+          <w:rFonts w:ascii="Times New Roman" w:hAnsi="Times New Roman" w:cs="Times New Roman"/>
+        </w:rPr>
+        <w:t xml:space="preserve"> as </w:t>
+      </w:r>
+      <w:proofErr w:type="spellStart"/>
+      <w:r>
+        <w:rPr>
+          <w:rFonts w:ascii="Times New Roman" w:hAnsi="Times New Roman" w:cs="Times New Roman"/>
+        </w:rPr>
+        <w:t>compras</w:t>
+      </w:r>
+      <w:proofErr w:type="spellEnd"/>
+      <w:r>
+        <w:rPr>
+          <w:rFonts w:ascii="Times New Roman" w:hAnsi="Times New Roman" w:cs="Times New Roman"/>
+        </w:rPr>
+        <w:t xml:space="preserve"> e custos de </w:t>
+      </w:r>
+      <w:proofErr w:type="spellStart"/>
+      <w:r>
+        <w:rPr>
+          <w:rFonts w:ascii="Times New Roman" w:hAnsi="Times New Roman" w:cs="Times New Roman"/>
+        </w:rPr>
+        <w:t>todos</w:t>
+      </w:r>
+      <w:proofErr w:type="spellEnd"/>
+      <w:r>
+        <w:rPr>
+          <w:rFonts w:ascii="Times New Roman" w:hAnsi="Times New Roman" w:cs="Times New Roman"/>
+        </w:rPr>
+        <w:t xml:space="preserve"> </w:t>
+      </w:r>
+      <w:proofErr w:type="spellStart"/>
+      <w:r>
+        <w:rPr>
+          <w:rFonts w:ascii="Times New Roman" w:hAnsi="Times New Roman" w:cs="Times New Roman"/>
+        </w:rPr>
+        <w:t>os</w:t>
+      </w:r>
+      <w:proofErr w:type="spellEnd"/>
+      <w:r>
+        <w:rPr>
+          <w:rFonts w:ascii="Times New Roman" w:hAnsi="Times New Roman" w:cs="Times New Roman"/>
+        </w:rPr>
+        <w:t xml:space="preserve"> </w:t>
+      </w:r>
+      <w:proofErr w:type="spellStart"/>
+      <w:r>
+        <w:rPr>
+          <w:rFonts w:ascii="Times New Roman" w:hAnsi="Times New Roman" w:cs="Times New Roman"/>
+        </w:rPr>
+        <w:t>dias</w:t>
+      </w:r>
+      <w:proofErr w:type="spellEnd"/>
+      <w:r>
+        <w:rPr>
+          <w:rFonts w:ascii="Times New Roman" w:hAnsi="Times New Roman" w:cs="Times New Roman"/>
+        </w:rPr>
+        <w:t xml:space="preserve"> </w:t>
+      </w:r>
+      <w:proofErr w:type="spellStart"/>
+      <w:r>
+        <w:rPr>
+          <w:rFonts w:ascii="Times New Roman" w:hAnsi="Times New Roman" w:cs="Times New Roman"/>
+        </w:rPr>
+        <w:t>combinados</w:t>
+      </w:r>
+      <w:proofErr w:type="spellEnd"/>
+      <w:r>
+        <w:rPr>
+          <w:rFonts w:ascii="Times New Roman" w:hAnsi="Times New Roman" w:cs="Times New Roman"/>
+        </w:rPr>
+        <w:t>.</w:t>
+      </w:r>
+    </w:p>
+    <w:p>
+      <w:pPr>
+        <w:spacing w:after="120"/>
+        <w:ind w:left="360"/>
+        <w:jc w:val="both"/>
+        <w:rPr>
+          <w:rFonts w:ascii="Times New Roman" w:hAnsi="Times New Roman" w:cs="Times New Roman"/>
+        </w:rPr>
+      </w:pPr>
+      <w:r>
+        <w:rPr>
+          <w:rFonts w:ascii="Times New Roman" w:hAnsi="Times New Roman" w:cs="Times New Roman"/>
+        </w:rPr>
+        <w:t xml:space="preserve">  * "</w:t>
+      </w:r>
+      <w:proofErr w:type="spellStart"/>
+      <w:r>
+        <w:rPr>
+          <w:rFonts w:ascii="Times New Roman" w:hAnsi="Times New Roman" w:cs="Times New Roman"/>
+        </w:rPr>
+        <w:t>Limpar</w:t>
+      </w:r>
+      <w:proofErr w:type="spellEnd"/>
+      <w:r>
+        <w:rPr>
+          <w:rFonts w:ascii="Times New Roman" w:hAnsi="Times New Roman" w:cs="Times New Roman"/>
+        </w:rPr>
+        <w:t xml:space="preserve"> </w:t>
+      </w:r>
+      <w:proofErr w:type="spellStart"/>
+      <w:r>
+        <w:rPr>
+          <w:rFonts w:ascii="Times New Roman" w:hAnsi="Times New Roman" w:cs="Times New Roman"/>
+        </w:rPr>
+        <w:t>Tudo</w:t>
+      </w:r>
+      <w:proofErr w:type="spellEnd"/>
+      <w:r>
+        <w:rPr>
+          <w:rFonts w:ascii="Times New Roman" w:hAnsi="Times New Roman" w:cs="Times New Roman"/>
+        </w:rPr>
+        <w:t xml:space="preserve">": </w:t>
+      </w:r>
+      <w:proofErr w:type="spellStart"/>
+      <w:r>
+        <w:rPr>
+          <w:rFonts w:ascii="Times New Roman" w:hAnsi="Times New Roman" w:cs="Times New Roman"/>
+        </w:rPr>
+        <w:t>Reseta</w:t>
+      </w:r>
+      <w:proofErr w:type="spellEnd"/>
+      <w:r>
+        <w:rPr>
+          <w:rFonts w:ascii="Times New Roman" w:hAnsi="Times New Roman" w:cs="Times New Roman"/>
+        </w:rPr>
+        <w:t xml:space="preserve"> o </w:t>
+      </w:r>
+      <w:proofErr w:type="spellStart"/>
+      <w:r>
+        <w:rPr>
+          <w:rFonts w:ascii="Times New Roman" w:hAnsi="Times New Roman" w:cs="Times New Roman"/>
+        </w:rPr>
+        <w:t>estado</w:t>
+      </w:r>
+      <w:proofErr w:type="spellEnd"/>
+      <w:r>
+        <w:rPr>
+          <w:rFonts w:ascii="Times New Roman" w:hAnsi="Times New Roman" w:cs="Times New Roman"/>
+        </w:rPr>
+        <w:t xml:space="preserve"> local e volta </w:t>
+      </w:r>
+      <w:proofErr w:type="gramStart"/>
+      <w:r>
+        <w:rPr>
+          <w:rFonts w:ascii="Times New Roman" w:hAnsi="Times New Roman" w:cs="Times New Roman"/>
+        </w:rPr>
+        <w:t>a</w:t>
+      </w:r>
+      <w:proofErr w:type="gramEnd"/>
+      <w:r>
+        <w:rPr>
+          <w:rFonts w:ascii="Times New Roman" w:hAnsi="Times New Roman" w:cs="Times New Roman"/>
+        </w:rPr>
+        <w:t xml:space="preserve"> </w:t>
+      </w:r>
+      <w:proofErr w:type="spellStart"/>
+      <w:r>
+        <w:rPr>
+          <w:rFonts w:ascii="Times New Roman" w:hAnsi="Times New Roman" w:cs="Times New Roman"/>
+        </w:rPr>
+        <w:t>exibir</w:t>
+      </w:r>
+      <w:proofErr w:type="spellEnd"/>
+      <w:r>
+        <w:rPr>
+          <w:rFonts w:ascii="Times New Roman" w:hAnsi="Times New Roman" w:cs="Times New Roman"/>
+        </w:rPr>
+        <w:t xml:space="preserve"> o </w:t>
+      </w:r>
+      <w:proofErr w:type="spellStart"/>
+      <w:r>
+        <w:rPr>
+          <w:rFonts w:ascii="Times New Roman" w:hAnsi="Times New Roman" w:cs="Times New Roman"/>
+        </w:rPr>
+        <w:t>formulário</w:t>
+      </w:r>
+      <w:proofErr w:type="spellEnd"/>
+      <w:r>
+        <w:rPr>
+          <w:rFonts w:ascii="Times New Roman" w:hAnsi="Times New Roman" w:cs="Times New Roman"/>
+        </w:rPr>
+        <w:t xml:space="preserve"> </w:t>
+      </w:r>
+      <w:proofErr w:type="spellStart"/>
+      <w:r>
+        <w:rPr>
+          <w:rFonts w:ascii="Times New Roman" w:hAnsi="Times New Roman" w:cs="Times New Roman"/>
+        </w:rPr>
+        <w:t>inicial</w:t>
+      </w:r>
+      <w:proofErr w:type="spellEnd"/>
+      <w:r>
+        <w:rPr>
+          <w:rFonts w:ascii="Times New Roman" w:hAnsi="Times New Roman" w:cs="Times New Roman"/>
+        </w:rPr>
+        <w:t xml:space="preserve"> de </w:t>
+      </w:r>
+      <w:proofErr w:type="spellStart"/>
+      <w:r>
+        <w:rPr>
+          <w:rFonts w:ascii="Times New Roman" w:hAnsi="Times New Roman" w:cs="Times New Roman"/>
+        </w:rPr>
+        <w:t>orçamento</w:t>
+      </w:r>
+      <w:proofErr w:type="spellEnd"/>
+      <w:r>
+        <w:rPr>
+          <w:rFonts w:ascii="Times New Roman" w:hAnsi="Times New Roman" w:cs="Times New Roman"/>
+        </w:rPr>
+        <w:t>.</w:t>
+      </w:r>
+    </w:p>
+    <w:p>
+      <w:pPr>
+        <w:spacing w:after="120"/>
+        <w:ind w:left="360"/>
+        <w:jc w:val="both"/>
+        <w:rPr>
+          <w:rFonts w:ascii="Times New Roman" w:hAnsi="Times New Roman" w:cs="Times New Roman"/>
+        </w:rPr>
+      </w:pPr>
+    </w:p>
+    <w:p>
+      <w:pPr>
+        <w:spacing w:after="120"/>
+        <w:ind w:left="360"/>
+        <w:jc w:val="both"/>
+        <w:rPr>
+          <w:rFonts w:ascii="Times New Roman" w:hAnsi="Times New Roman" w:cs="Times New Roman"/>
+        </w:rPr>
+      </w:pPr>
+    </w:p>
+    <w:p>
+      <w:pPr>
+        <w:spacing w:after="120"/>
+        <w:ind w:left="360"/>
+        <w:jc w:val="both"/>
         <w:rPr>
           <w:rFonts w:ascii="Times New Roman" w:hAnsi="Times New Roman" w:cs="Times New Roman"/>
         </w:rPr>
@@ -12358,6 +17054,41 @@
       </w:tcPr>
     </w:tblStylePr>
   </w:style>
+  <w:style w:type="character" w:styleId="Hyperlink">
+    <w:name w:val="Hyperlink"/>
+    <w:basedOn w:val="Fontepargpadro"/>
+    <w:uiPriority w:val="99"/>
+    <w:unhideWhenUsed/>
+    <w:rsid w:val="002C53D9"/>
+    <w:rPr>
+      <w:color w:val="0000FF" w:themeColor="hyperlink"/>
+      <w:u w:val="single"/>
+    </w:rPr>
+  </w:style>
+  <w:style w:type="character" w:styleId="MenoPendente">
+    <w:name w:val="Unresolved Mention"/>
+    <w:basedOn w:val="Fontepargpadro"/>
+    <w:uiPriority w:val="99"/>
+    <w:semiHidden/>
+    <w:unhideWhenUsed/>
+    <w:rsid w:val="002C53D9"/>
+    <w:rPr>
+      <w:color w:val="605E5C"/>
+      <w:shd w:val="clear" w:color="auto" w:fill="E1DFDD"/>
+    </w:rPr>
+  </w:style>
+  <w:style w:type="character" w:styleId="HiperlinkVisitado">
+    <w:name w:val="FollowedHyperlink"/>
+    <w:basedOn w:val="Fontepargpadro"/>
+    <w:uiPriority w:val="99"/>
+    <w:semiHidden/>
+    <w:unhideWhenUsed/>
+    <w:rsid w:val="003F2CEA"/>
+    <w:rPr>
+      <w:color w:val="800080" w:themeColor="followedHyperlink"/>
+      <w:u w:val="single"/>
+    </w:rPr>
+  </w:style>
 </w:styles>
 </file>
 

</xml_diff>